<commit_message>
Update mtp paths in simulation documents and code after mtp reorganisation; README note
Co-Authored-By: Claude Sonnet 5.5 <noreply@anthropic.com>
</commit_message>
<xml_diff>
--- a/SERS_Sepsis_Spectral_Library/09_Reports/DFT_vs_Experimental_Comparison_NAM_LPS_LTA.docx
+++ b/SERS_Sepsis_Spectral_Library/09_Reports/DFT_vs_Experimental_Comparison_NAM_LPS_LTA.docx
@@ -6036,7 +6036,7 @@
               <w:rPr>
                 <w:sz w:val="17"/>
               </w:rPr>
-              <w:t>mtp\NAM_Raman_Archive\02_DFT_Calculation\NAM_calculated_modes_all_111.csv</w:t>
+              <w:t>mtp\05_Experimental_Data\NAM\NAM_Raman_Archive\02_DFT_Calculation\NAM_calculated_modes_all_111.csv</w:t>
             </w:r>
           </w:p>
         </w:tc>
@@ -6066,7 +6066,7 @@
               <w:rPr>
                 <w:sz w:val="17"/>
               </w:rPr>
-              <w:t>mtp\NAM_Raman_Archive\03_Processed_Results\DFT_simulated_spectrum.csv</w:t>
+              <w:t>mtp\05_Experimental_Data\NAM\NAM_Raman_Archive\03_Processed_Results\DFT_simulated_spectrum.csv</w:t>
             </w:r>
           </w:p>
         </w:tc>
@@ -6096,7 +6096,7 @@
               <w:rPr>
                 <w:sz w:val="17"/>
               </w:rPr>
-              <w:t>mtp\NAM_Raman_Archive\02_DFT_Calculation\ALPHA_ANOMER_RESULT.md</w:t>
+              <w:t>mtp\05_Experimental_Data\NAM\NAM_Raman_Archive\02_DFT_Calculation\ALPHA_ANOMER_RESULT.md</w:t>
             </w:r>
           </w:p>
         </w:tc>
@@ -6126,7 +6126,7 @@
               <w:rPr>
                 <w:sz w:val="17"/>
               </w:rPr>
-              <w:t>mtp\lps research\reanalysis_2026-08-30\dft_candidates_all.csv; summary in LPS_DFT_Reference_Bands.docx</w:t>
+              <w:t>mtp\05_Experimental_Data\LPS\lps research\reanalysis_2026-08-30\dft_candidates_all.csv; summary in LPS_DFT_Reference_Bands.docx</w:t>
             </w:r>
           </w:p>
         </w:tc>
@@ -6156,7 +6156,7 @@
               <w:rPr>
                 <w:sz w:val="17"/>
               </w:rPr>
-              <w:t>mtp\LTA-simulation-main\LTA-simulation-main\LTA_combined_data.csv; mtp\20-04\Computational Simulation Settings Used for Lipoteichoic Acid.docx</w:t>
+              <w:t>mtp\06_Simulation_DFT\LTA-simulation-main\06_Simulation_DFT\LTA-simulation-main\LTA_combined_data.csv; mtp\10_Working_Archive\20-04\Computational Simulation Settings Used for Lipoteichoic Acid.docx</w:t>
             </w:r>
           </w:p>
         </w:tc>

</xml_diff>

<commit_message>
LPS: add whole-molecule lipid A model to the DFT comparison; rewrite DFT, simulation and LPS reports
Co-Authored-By: Claude Sonnet 5.5 <noreply@anthropic.com>
</commit_message>
<xml_diff>
--- a/SERS_Sepsis_Spectral_Library/09_Reports/DFT_vs_Experimental_Comparison_NAM_LPS_LTA.docx
+++ b/SERS_Sepsis_Spectral_Library/09_Reports/DFT_vs_Experimental_Comparison_NAM_LPS_LTA.docx
@@ -29,7 +29,7 @@
           <w:i w:val="0"/>
           <w:sz w:val="18"/>
         </w:rPr>
-        <w:t>SERS Sepsis project, bulk-powder Raman spectral library. Version 1.1, 27 October 2026. Experimental data: library v3.3 reference spectra (glass slide, 785 nm). Simulation data: DFT files held in C:\Users\sukes\Downloads\mtp (listed in Section 9).</w:t>
+        <w:t>SERS Sepsis project, bulk-powder Raman spectral library. Version 1.2, 28 October 2026. Experimental data: library v3.3 reference spectra (glass slide, 785 nm). Simulation data: DFT files held in C:\Users\sukes\Downloads\mtp (listed in Section 9); LPS whole-molecule model: SERS_Sepsis_Spectral_Library/08_Methodology/simulation/LPS_LipidA_Model_20261028 (Gaussian 16W, 27-28 Oct 2026).</w:t>
       </w:r>
     </w:p>
     <w:p>
@@ -39,7 +39,7 @@
           <w:i w:val="0"/>
           <w:sz w:val="20"/>
         </w:rPr>
-        <w:t>The simulations reproduce the position of many individual bands, and the agreement is best for NAM, the only molecule that was calculated as a whole. The agreement is, however, no better than what random chance gives, and the overall spectral shapes do not match (correlation about 0.1 for all three molecules). The DFT results can therefore support tentative assignments of individual bands, but they cannot be used to confirm identity, and several of the strongest experimental bands remain unexplained: NAM 829 and 955 cm-1, the intensity of LPS 425 cm-1, and LTA 802 cm-1.</w:t>
+        <w:t>The simulations reproduce the position of many individual bands, and the agreement is best for NAM, the only small molecule calculated as a whole. LPS now has two calculations: five separate fragments, and a whole-molecule model of Kdo2-lipid A with shortened acyl chains (201 atoms). The whole-molecule model puts all five library LPS bands within 2.4 cm-1 of a calculated mode (mean difference 1.2 cm-1, against 3.5 cm-1 for the fragments), and it has a strong calculated mode at 422 and 862 cm-1 where the fragments had very weak ones. The position agreement is, however, still no better than random chance, because the model has 354 modes between 400 and 1800 cm-1 and almost any band has a mode close to it. The overall spectral shapes do not match (correlation 0.1 or less for all three molecules; -0.01 for the lipid A model). The DFT results can support tentative assignments of individual bands, but they cannot be used to confirm identity, and several of the strongest experimental bands remain unexplained: NAM 829 and 955 cm-1, the assignment of LPS 425 cm-1, and LTA 802 cm-1.</w:t>
       </w:r>
     </w:p>
     <w:p/>
@@ -318,12 +318,8 @@
             <w:tcW w:type="dxa" w:w="737"/>
           </w:tcPr>
           <w:p>
-            <w:r/>
-            <w:r>
-              <w:rPr>
-                <w:sz w:val="16"/>
-              </w:rPr>
-              <w:t>LPS</w:t>
+            <w:r>
+              <w:t>LPS (5 fragments)</w:t>
             </w:r>
           </w:p>
         </w:tc>
@@ -332,11 +328,7 @@
             <w:tcW w:type="dxa" w:w="2211"/>
           </w:tcPr>
           <w:p>
-            <w:r/>
-            <w:r>
-              <w:rPr>
-                <w:sz w:val="16"/>
-              </w:rPr>
+            <w:r>
               <w:t>Five separate fragments, not whole LPS</w:t>
             </w:r>
           </w:p>
@@ -538,6 +530,89 @@
                 <w:sz w:val="16"/>
               </w:rPr>
               <w:t>Weak</w:t>
+            </w:r>
+          </w:p>
+        </w:tc>
+      </w:tr>
+      <w:tr>
+        <w:tc>
+          <w:tcPr>
+            <w:tcW w:type="dxa" w:w="737"/>
+          </w:tcPr>
+          <w:p>
+            <w:r>
+              <w:t>LPS (whole-molecule model)</w:t>
+            </w:r>
+          </w:p>
+        </w:tc>
+        <w:tc>
+          <w:tcPr>
+            <w:tcW w:type="dxa" w:w="2211"/>
+          </w:tcPr>
+          <w:p>
+            <w:r>
+              <w:t>Kdo2-lipid A with shortened chains, 201 atoms, charge -4, B3LYP/3-21G, gas phase</w:t>
+            </w:r>
+          </w:p>
+        </w:tc>
+        <w:tc>
+          <w:tcPr>
+            <w:tcW w:type="dxa" w:w="737"/>
+          </w:tcPr>
+          <w:p>
+            <w:r>
+              <w:t>5</w:t>
+            </w:r>
+          </w:p>
+        </w:tc>
+        <w:tc>
+          <w:tcPr>
+            <w:tcW w:type="dxa" w:w="1417"/>
+          </w:tcPr>
+          <w:p>
+            <w:r>
+              <w:t>5 / 5 / 5</w:t>
+            </w:r>
+          </w:p>
+        </w:tc>
+        <w:tc>
+          <w:tcPr>
+            <w:tcW w:type="dxa" w:w="907"/>
+          </w:tcPr>
+          <w:p>
+            <w:r>
+              <w:t>1.2</w:t>
+            </w:r>
+          </w:p>
+        </w:tc>
+        <w:tc>
+          <w:tcPr>
+            <w:tcW w:type="dxa" w:w="1587"/>
+          </w:tcPr>
+          <w:p>
+            <w:r>
+              <w:t>4.6 (p = 0.57)</w:t>
+            </w:r>
+          </w:p>
+        </w:tc>
+        <w:tc>
+          <w:tcPr>
+            <w:tcW w:type="dxa" w:w="907"/>
+          </w:tcPr>
+          <w:p>
+            <w:r>
+              <w:t>-0.01</w:t>
+            </w:r>
+          </w:p>
+        </w:tc>
+        <w:tc>
+          <w:tcPr>
+            <w:tcW w:type="dxa" w:w="1134"/>
+            <w:shd w:val="clear" w:color="auto" w:fill="FDECEA"/>
+          </w:tcPr>
+          <w:p>
+            <w:r>
+              <w:t>Positions agree; not above chance; shape no</w:t>
             </w:r>
           </w:p>
         </w:tc>
@@ -683,12 +758,8 @@
             <w:tcW w:type="dxa" w:w="2835"/>
           </w:tcPr>
           <w:p>
-            <w:r/>
-            <w:r>
-              <w:rPr>
-                <w:sz w:val="17"/>
-              </w:rPr>
-              <w:t>Five fragments: KDO, D-glucosamine, heptose, myristic acid, phosphoric acid</w:t>
+            <w:r>
+              <w:t>Five fragments: KDO, D-glucosamine, heptose, myristic acid, phosphoric acid Also: whole-molecule model of Kdo2-lipid A (PubChem CID 5771770) with the six acyl chains shortened to C3-C4: C60H98N2O39P2, 201 atoms, charge -4.</w:t>
             </w:r>
           </w:p>
         </w:tc>
@@ -741,12 +812,8 @@
             <w:tcW w:type="dxa" w:w="2835"/>
           </w:tcPr>
           <w:p>
-            <w:r/>
-            <w:r>
-              <w:rPr>
-                <w:sz w:val="17"/>
-              </w:rPr>
-              <w:t>LPS is far too large for a full calculation</w:t>
+            <w:r>
+              <w:t>LPS is far too large for a full calculation. For the whole-molecule model the chains were cut because full Kdo2-lipid A (355 atoms) was too large for this PC at a higher level; the core sugars beyond Kdo and the O-antigen are not in it.</w:t>
             </w:r>
           </w:p>
         </w:tc>
@@ -799,12 +866,8 @@
             <w:tcW w:type="dxa" w:w="2835"/>
           </w:tcPr>
           <w:p>
-            <w:r/>
-            <w:r>
-              <w:rPr>
-                <w:sz w:val="17"/>
-              </w:rPr>
-              <w:t>B3LYP/6-31G(d), opt freq=raman scf=tight integral=ultrafine (LPS documentation)</w:t>
+            <w:r>
+              <w:t>B3LYP/6-31G(d), opt freq=raman scf=tight integral=ultrafine (LPS documentation) Whole-molecule model: Gaussian 16W Rev C.01, PM6 pre-optimisation then B3LYP/3-21G opt freq=raman; 109 optimisation steps; 597 modes, no imaginary frequency.</w:t>
             </w:r>
           </w:p>
         </w:tc>
@@ -857,12 +920,8 @@
             <w:tcW w:type="dxa" w:w="2835"/>
           </w:tcPr>
           <w:p>
-            <w:r/>
-            <w:r>
-              <w:rPr>
-                <w:sz w:val="17"/>
-              </w:rPr>
-              <w:t>Gas phase (no solvent keyword in the documented route)</w:t>
+            <w:r>
+              <w:t>Gas phase (no solvent keyword in the documented route); whole-molecule model: gas phase, no counter-ions</w:t>
             </w:r>
           </w:p>
         </w:tc>
@@ -915,12 +974,8 @@
             <w:tcW w:type="dxa" w:w="2835"/>
           </w:tcPr>
           <w:p>
-            <w:r/>
-            <w:r>
-              <w:rPr>
-                <w:sz w:val="17"/>
-              </w:rPr>
-              <w:t>0.9613</w:t>
+            <w:r>
+              <w:t>0.9613; whole-molecule model 0.965 (typical B3LYP value, not fitted for 3-21G)</w:t>
             </w:r>
           </w:p>
         </w:tc>
@@ -973,12 +1028,8 @@
             <w:tcW w:type="dxa" w:w="2835"/>
           </w:tcPr>
           <w:p>
-            <w:r/>
-            <w:r>
-              <w:rPr>
-                <w:sz w:val="17"/>
-              </w:rPr>
-              <w:t>150</w:t>
+            <w:r>
+              <w:t>150; whole-molecule model 354</w:t>
             </w:r>
           </w:p>
         </w:tc>
@@ -1031,12 +1082,8 @@
             <w:tcW w:type="dxa" w:w="2835"/>
           </w:tcPr>
           <w:p>
-            <w:r/>
-            <w:r>
-              <w:rPr>
-                <w:sz w:val="17"/>
-              </w:rPr>
-              <w:t>10.7</w:t>
+            <w:r>
+              <w:t>10.7; whole-molecule model 25.3</w:t>
             </w:r>
           </w:p>
         </w:tc>
@@ -1121,7 +1168,7 @@
           <w:b w:val="0"/>
           <w:i w:val="0"/>
         </w:rPr>
-        <w:t>A calculation on a single small fragment cannot reproduce a polymer. LPS has phosphorylated, acylated and branched sugars; LTA has a charged phosphodiester backbone. Fragments contain none of the linkages between units, so bands that come from those linkages cannot appear in the simulation.</w:t>
+        <w:t>A calculation on a single small fragment cannot reproduce a polymer. LPS has phosphorylated, acylated and branched sugars; LTA has a charged phosphodiester backbone. The five LPS fragments and the three LTA fragments contain none of the linkages between units, so bands that come from those linkages cannot appear in them. The whole-molecule LPS model does contain the glycosidic bond between the two glucosamines, the Kdo links, both phosphate esters and both amide links of the lipid A backbone, but not the long acyl chains, the outer core sugars or the O-antigen, so it is still a part of LPS and not the whole.</w:t>
       </w:r>
     </w:p>
     <w:p>
@@ -2795,16 +2842,1381 @@
         <w:pStyle w:val="Heading2"/>
       </w:pPr>
       <w:r>
-        <w:t>5.1 Result</w:t>
+        <w:t>5.1 What was calculated</w:t>
       </w:r>
     </w:p>
     <w:p>
       <w:r>
         <w:rPr>
-          <w:b w:val="0"/>
           <w:i w:val="0"/>
         </w:rPr>
-        <w:t>Of 5 library bands (2 primary, 3 supporting), 4 agree within 5 cm-1 and all 5 within 18 cm-1, with a mean absolute difference of 3.5 cm-1. This looks good but is misleading: the five fragments together contribute 150 modes in 400-1800 cm-1, about 11 per 100 cm-1, so a mode lies within a few cm-1 of almost any position. Randomly shifted modes give 3.1 of 5 within 5 cm-1, against 4 for the real calculation (p = 0.32).</w:t>
+        <w:t>Two calculations are compared with the same five library bands (the primary and supporting bands of the LPS reference, 60 %, 40 s, 5 acc, n = 10).</w:t>
+      </w:r>
+    </w:p>
+    <w:tbl>
+      <w:tblPr>
+        <w:tblStyle w:val="TableGrid"/>
+        <w:tblW w:type="auto" w:w="0"/>
+        <w:tblLook w:firstColumn="1" w:firstRow="1" w:lastColumn="0" w:lastRow="0" w:noHBand="0" w:noVBand="1" w:val="04A0"/>
+      </w:tblPr>
+      <w:tblGrid>
+        <w:gridCol w:w="3439"/>
+        <w:gridCol w:w="3439"/>
+        <w:gridCol w:w="3439"/>
+      </w:tblGrid>
+      <w:tr>
+        <w:tc>
+          <w:tcPr>
+            <w:tcW w:type="dxa" w:w="1928"/>
+            <w:shd w:val="clear" w:color="auto" w:fill="D9D9D9"/>
+          </w:tcPr>
+          <w:p>
+            <w:r/>
+            <w:r>
+              <w:rPr>
+                <w:b/>
+                <w:sz w:val="16"/>
+              </w:rPr>
+            </w:r>
+          </w:p>
+        </w:tc>
+        <w:tc>
+          <w:tcPr>
+            <w:tcW w:type="dxa" w:w="3742"/>
+            <w:shd w:val="clear" w:color="auto" w:fill="D9D9D9"/>
+          </w:tcPr>
+          <w:p>
+            <w:r/>
+            <w:r>
+              <w:rPr>
+                <w:b/>
+                <w:sz w:val="16"/>
+              </w:rPr>
+              <w:t>Five fragments</w:t>
+            </w:r>
+          </w:p>
+        </w:tc>
+        <w:tc>
+          <w:tcPr>
+            <w:tcW w:type="dxa" w:w="4535"/>
+            <w:shd w:val="clear" w:color="auto" w:fill="D9D9D9"/>
+          </w:tcPr>
+          <w:p>
+            <w:r/>
+            <w:r>
+              <w:rPr>
+                <w:b/>
+                <w:sz w:val="16"/>
+              </w:rPr>
+              <w:t>Whole-molecule model</w:t>
+            </w:r>
+          </w:p>
+        </w:tc>
+      </w:tr>
+      <w:tr>
+        <w:tc>
+          <w:tcPr>
+            <w:tcW w:type="dxa" w:w="1928"/>
+          </w:tcPr>
+          <w:p>
+            <w:r/>
+            <w:r>
+              <w:rPr>
+                <w:sz w:val="16"/>
+              </w:rPr>
+              <w:t>What</w:t>
+            </w:r>
+          </w:p>
+        </w:tc>
+        <w:tc>
+          <w:tcPr>
+            <w:tcW w:type="dxa" w:w="3742"/>
+          </w:tcPr>
+          <w:p>
+            <w:r/>
+            <w:r>
+              <w:rPr>
+                <w:sz w:val="16"/>
+              </w:rPr>
+              <w:t>KDO, D-glucosamine, heptose, myristic acid, phosphoric acid, each on its own</w:t>
+            </w:r>
+          </w:p>
+        </w:tc>
+        <w:tc>
+          <w:tcPr>
+            <w:tcW w:type="dxa" w:w="4535"/>
+          </w:tcPr>
+          <w:p>
+            <w:r/>
+            <w:r>
+              <w:rPr>
+                <w:sz w:val="16"/>
+              </w:rPr>
+              <w:t>Kdo2-lipid A (E. coli, PubChem CID 5771770) with the six acyl chains shortened: 2 glucosamines, 2 Kdo, 2 phosphates, 2 amides, all in one molecule</w:t>
+            </w:r>
+          </w:p>
+        </w:tc>
+      </w:tr>
+      <w:tr>
+        <w:tc>
+          <w:tcPr>
+            <w:tcW w:type="dxa" w:w="1928"/>
+          </w:tcPr>
+          <w:p>
+            <w:r/>
+            <w:r>
+              <w:rPr>
+                <w:sz w:val="16"/>
+              </w:rPr>
+              <w:t>Atoms and charge</w:t>
+            </w:r>
+          </w:p>
+        </w:tc>
+        <w:tc>
+          <w:tcPr>
+            <w:tcW w:type="dxa" w:w="3742"/>
+          </w:tcPr>
+          <w:p>
+            <w:r/>
+            <w:r>
+              <w:rPr>
+                <w:sz w:val="16"/>
+              </w:rPr>
+              <w:t>Not recorded for the fragments</w:t>
+            </w:r>
+          </w:p>
+        </w:tc>
+        <w:tc>
+          <w:tcPr>
+            <w:tcW w:type="dxa" w:w="4535"/>
+          </w:tcPr>
+          <w:p>
+            <w:r/>
+            <w:r>
+              <w:rPr>
+                <w:sz w:val="16"/>
+              </w:rPr>
+              <w:t>201 atoms, C60H98N2O39P2, charge -4 (both Kdo carboxylates and both phosphates ionised), no counter-ions</w:t>
+            </w:r>
+          </w:p>
+        </w:tc>
+      </w:tr>
+      <w:tr>
+        <w:tc>
+          <w:tcPr>
+            <w:tcW w:type="dxa" w:w="1928"/>
+          </w:tcPr>
+          <w:p>
+            <w:r/>
+            <w:r>
+              <w:rPr>
+                <w:sz w:val="16"/>
+              </w:rPr>
+              <w:t>Level</w:t>
+            </w:r>
+          </w:p>
+        </w:tc>
+        <w:tc>
+          <w:tcPr>
+            <w:tcW w:type="dxa" w:w="3742"/>
+          </w:tcPr>
+          <w:p>
+            <w:r/>
+            <w:r>
+              <w:rPr>
+                <w:sz w:val="16"/>
+              </w:rPr>
+              <w:t>B3LYP/6-31G(d), gas phase, scale 0.9613</w:t>
+            </w:r>
+          </w:p>
+        </w:tc>
+        <w:tc>
+          <w:tcPr>
+            <w:tcW w:type="dxa" w:w="4535"/>
+          </w:tcPr>
+          <w:p>
+            <w:r/>
+            <w:r>
+              <w:rPr>
+                <w:sz w:val="16"/>
+              </w:rPr>
+              <w:t>PM6 then B3LYP/3-21G, gas phase, scale 0.965; Gaussian 16W Rev C.01</w:t>
+            </w:r>
+          </w:p>
+        </w:tc>
+      </w:tr>
+      <w:tr>
+        <w:tc>
+          <w:tcPr>
+            <w:tcW w:type="dxa" w:w="1928"/>
+          </w:tcPr>
+          <w:p>
+            <w:r/>
+            <w:r>
+              <w:rPr>
+                <w:sz w:val="16"/>
+              </w:rPr>
+              <w:t>Modes in 400-1800 cm-1</w:t>
+            </w:r>
+          </w:p>
+        </w:tc>
+        <w:tc>
+          <w:tcPr>
+            <w:tcW w:type="dxa" w:w="3742"/>
+          </w:tcPr>
+          <w:p>
+            <w:r/>
+            <w:r>
+              <w:rPr>
+                <w:sz w:val="16"/>
+              </w:rPr>
+              <w:t>150 (10.7 per 100 cm-1)</w:t>
+            </w:r>
+          </w:p>
+        </w:tc>
+        <w:tc>
+          <w:tcPr>
+            <w:tcW w:type="dxa" w:w="4535"/>
+          </w:tcPr>
+          <w:p>
+            <w:r/>
+            <w:r>
+              <w:rPr>
+                <w:sz w:val="16"/>
+              </w:rPr>
+              <w:t>354 (25.3 per 100 cm-1)</w:t>
+            </w:r>
+          </w:p>
+        </w:tc>
+      </w:tr>
+      <w:tr>
+        <w:tc>
+          <w:tcPr>
+            <w:tcW w:type="dxa" w:w="1928"/>
+          </w:tcPr>
+          <w:p>
+            <w:r/>
+            <w:r>
+              <w:rPr>
+                <w:sz w:val="16"/>
+              </w:rPr>
+              <w:t>Result file</w:t>
+            </w:r>
+          </w:p>
+        </w:tc>
+        <w:tc>
+          <w:tcPr>
+            <w:tcW w:type="dxa" w:w="3742"/>
+          </w:tcPr>
+          <w:p>
+            <w:r/>
+            <w:r>
+              <w:rPr>
+                <w:sz w:val="16"/>
+              </w:rPr>
+              <w:t>dft_candidates_all.csv (mtp)</w:t>
+            </w:r>
+          </w:p>
+        </w:tc>
+        <w:tc>
+          <w:tcPr>
+            <w:tcW w:type="dxa" w:w="4535"/>
+          </w:tcPr>
+          <w:p>
+            <w:r/>
+            <w:r>
+              <w:rPr>
+                <w:sz w:val="16"/>
+              </w:rPr>
+              <w:t>lipidA_raman_act.csv (lps output simulation)</w:t>
+            </w:r>
+          </w:p>
+        </w:tc>
+      </w:tr>
+    </w:tbl>
+    <w:p/>
+    <w:p>
+      <w:pPr>
+        <w:pStyle w:val="Heading2"/>
+      </w:pPr>
+      <w:r>
+        <w:t>5.2 Result</w:t>
+      </w:r>
+    </w:p>
+    <w:p>
+      <w:r>
+        <w:rPr>
+          <w:i w:val="0"/>
+        </w:rPr>
+        <w:t>Whole-molecule model: all five bands have a calculated mode within 2.4 cm-1 (four of them within 1.1 cm-1); mean absolute difference 1.2 cm-1. The five fragments gave 4 of 5 within 5 cm-1 and a mean difference of 3.5 cm-1; the 766 cm-1 band was 12.4 cm-1 away. Against random shifts of the calculated modes the whole-molecule model gets 5 of 5 within 5 cm-1 where chance gives 4.4 (p = 0.47), so the positions are not evidence of agreement: with 354 modes there is nearly always one close. The whole-spectrum correlation is -0.01. The strongest calculated mode is at 1516 cm-1, which is weak in the experiment (0.05 of the 425 band), and the experimental 425 cm-1 band, the strongest in the spectrum, falls on a calculated mode of moderate strength.</w:t>
+      </w:r>
+    </w:p>
+    <w:p>
+      <w:pPr>
+        <w:jc w:val="center"/>
+      </w:pPr>
+      <w:r>
+        <w:drawing>
+          <wp:inline xmlns:a="http://schemas.openxmlformats.org/drawingml/2006/main" xmlns:pic="http://schemas.openxmlformats.org/drawingml/2006/picture">
+            <wp:extent cx="6120000" cy="3672000"/>
+            <wp:docPr id="6" name="Picture 6"/>
+            <wp:cNvGraphicFramePr>
+              <a:graphicFrameLocks noChangeAspect="1"/>
+            </wp:cNvGraphicFramePr>
+            <a:graphic>
+              <a:graphicData uri="http://schemas.openxmlformats.org/drawingml/2006/picture">
+                <pic:pic>
+                  <pic:nvPicPr>
+                    <pic:cNvPr id="0" name="LPS_Exp_vs_LipidA_Model.png"/>
+                    <pic:cNvPicPr/>
+                  </pic:nvPicPr>
+                  <pic:blipFill>
+                    <a:blip r:embed="rId14"/>
+                    <a:stretch>
+                      <a:fillRect/>
+                    </a:stretch>
+                  </pic:blipFill>
+                  <pic:spPr>
+                    <a:xfrm>
+                      <a:off x="0" y="0"/>
+                      <a:ext cx="6120000" cy="3672000"/>
+                    </a:xfrm>
+                    <a:prstGeom prst="rect"/>
+                  </pic:spPr>
+                </pic:pic>
+              </a:graphicData>
+            </a:graphic>
+          </wp:inline>
+        </w:drawing>
+      </w:r>
+    </w:p>
+    <w:p>
+      <w:r>
+        <w:rPr>
+          <w:i/>
+          <w:sz w:val="17"/>
+        </w:rPr>
+        <w:t>Figure 2. LPS. Top: library experimental reference (10 spectra). Bottom: whole-molecule model (shortened Kdo2-lipid A), calculated modes (blue sticks) and broadened spectrum. Dashed lines mark the experimental bands; all five are within 10 cm-1 of a calculated mode (green).</w:t>
+      </w:r>
+    </w:p>
+    <w:p>
+      <w:pPr>
+        <w:pStyle w:val="Heading2"/>
+      </w:pPr>
+      <w:r>
+        <w:t>5.3 Band-by-band</w:t>
+      </w:r>
+    </w:p>
+    <w:tbl>
+      <w:tblPr>
+        <w:tblStyle w:val="TableGrid"/>
+        <w:tblW w:type="auto" w:w="0"/>
+        <w:tblLook w:firstColumn="1" w:firstRow="1" w:lastColumn="0" w:lastRow="0" w:noHBand="0" w:noVBand="1" w:val="04A0"/>
+      </w:tblPr>
+      <w:tblGrid>
+        <w:gridCol w:w="1032"/>
+        <w:gridCol w:w="1032"/>
+        <w:gridCol w:w="1032"/>
+        <w:gridCol w:w="1032"/>
+        <w:gridCol w:w="1032"/>
+        <w:gridCol w:w="1032"/>
+        <w:gridCol w:w="1032"/>
+        <w:gridCol w:w="1032"/>
+        <w:gridCol w:w="1032"/>
+        <w:gridCol w:w="1032"/>
+      </w:tblGrid>
+      <w:tr>
+        <w:tc>
+          <w:tcPr>
+            <w:tcW w:type="dxa" w:w="737"/>
+            <w:shd w:val="clear" w:color="auto" w:fill="D9D9D9"/>
+          </w:tcPr>
+          <w:p>
+            <w:r/>
+            <w:r>
+              <w:rPr>
+                <w:b/>
+                <w:sz w:val="14"/>
+              </w:rPr>
+              <w:t>Exp. band (cm-1)</w:t>
+            </w:r>
+          </w:p>
+        </w:tc>
+        <w:tc>
+          <w:tcPr>
+            <w:tcW w:type="dxa" w:w="794"/>
+            <w:shd w:val="clear" w:color="auto" w:fill="D9D9D9"/>
+          </w:tcPr>
+          <w:p>
+            <w:r/>
+            <w:r>
+              <w:rPr>
+                <w:b/>
+                <w:sz w:val="14"/>
+              </w:rPr>
+              <w:t>Class</w:t>
+            </w:r>
+          </w:p>
+        </w:tc>
+        <w:tc>
+          <w:tcPr>
+            <w:tcW w:type="dxa" w:w="850"/>
+            <w:shd w:val="clear" w:color="auto" w:fill="D9D9D9"/>
+          </w:tcPr>
+          <w:p>
+            <w:r/>
+            <w:r>
+              <w:rPr>
+                <w:b/>
+                <w:sz w:val="14"/>
+              </w:rPr>
+              <w:t>Lipid A model: nearest mode</w:t>
+            </w:r>
+          </w:p>
+        </w:tc>
+        <w:tc>
+          <w:tcPr>
+            <w:tcW w:type="dxa" w:w="624"/>
+            <w:shd w:val="clear" w:color="auto" w:fill="D9D9D9"/>
+          </w:tcPr>
+          <w:p>
+            <w:r/>
+            <w:r>
+              <w:rPr>
+                <w:b/>
+                <w:sz w:val="14"/>
+              </w:rPr>
+              <w:t>Exp - calc</w:t>
+            </w:r>
+          </w:p>
+        </w:tc>
+        <w:tc>
+          <w:tcPr>
+            <w:tcW w:type="dxa" w:w="624"/>
+            <w:shd w:val="clear" w:color="auto" w:fill="D9D9D9"/>
+          </w:tcPr>
+          <w:p>
+            <w:r/>
+            <w:r>
+              <w:rPr>
+                <w:b/>
+                <w:sz w:val="14"/>
+              </w:rPr>
+              <w:t>Rel. activity</w:t>
+            </w:r>
+          </w:p>
+        </w:tc>
+        <w:tc>
+          <w:tcPr>
+            <w:tcW w:type="dxa" w:w="850"/>
+            <w:shd w:val="clear" w:color="auto" w:fill="D9D9D9"/>
+          </w:tcPr>
+          <w:p>
+            <w:r/>
+            <w:r>
+              <w:rPr>
+                <w:b/>
+                <w:sz w:val="14"/>
+              </w:rPr>
+              <w:t>Fragments: nearest mode</w:t>
+            </w:r>
+          </w:p>
+        </w:tc>
+        <w:tc>
+          <w:tcPr>
+            <w:tcW w:type="dxa" w:w="624"/>
+            <w:shd w:val="clear" w:color="auto" w:fill="D9D9D9"/>
+          </w:tcPr>
+          <w:p>
+            <w:r/>
+            <w:r>
+              <w:rPr>
+                <w:b/>
+                <w:sz w:val="14"/>
+              </w:rPr>
+              <w:t>Exp - calc</w:t>
+            </w:r>
+          </w:p>
+        </w:tc>
+        <w:tc>
+          <w:tcPr>
+            <w:tcW w:type="dxa" w:w="1304"/>
+            <w:shd w:val="clear" w:color="auto" w:fill="D9D9D9"/>
+          </w:tcPr>
+          <w:p>
+            <w:r/>
+            <w:r>
+              <w:rPr>
+                <w:b/>
+                <w:sz w:val="14"/>
+              </w:rPr>
+              <w:t>Rel. activity (fragment)</w:t>
+            </w:r>
+          </w:p>
+        </w:tc>
+        <w:tc>
+          <w:tcPr>
+            <w:tcW w:type="dxa" w:w="737"/>
+            <w:shd w:val="clear" w:color="auto" w:fill="D9D9D9"/>
+          </w:tcPr>
+          <w:p>
+            <w:r/>
+            <w:r>
+              <w:rPr>
+                <w:b/>
+                <w:sz w:val="14"/>
+              </w:rPr>
+              <w:t>Verdict (model)</w:t>
+            </w:r>
+          </w:p>
+        </w:tc>
+        <w:tc>
+          <w:tcPr>
+            <w:tcW w:type="dxa" w:w="3061"/>
+            <w:shd w:val="clear" w:color="auto" w:fill="D9D9D9"/>
+          </w:tcPr>
+          <w:p>
+            <w:r/>
+            <w:r>
+              <w:rPr>
+                <w:b/>
+                <w:sz w:val="14"/>
+              </w:rPr>
+              <w:t>Why</w:t>
+            </w:r>
+          </w:p>
+        </w:tc>
+      </w:tr>
+      <w:tr>
+        <w:tc>
+          <w:tcPr>
+            <w:tcW w:type="dxa" w:w="737"/>
+          </w:tcPr>
+          <w:p>
+            <w:r/>
+            <w:r>
+              <w:rPr>
+                <w:sz w:val="14"/>
+              </w:rPr>
+              <w:t>424.8</w:t>
+            </w:r>
+          </w:p>
+        </w:tc>
+        <w:tc>
+          <w:tcPr>
+            <w:tcW w:type="dxa" w:w="794"/>
+          </w:tcPr>
+          <w:p>
+            <w:r/>
+            <w:r>
+              <w:rPr>
+                <w:sz w:val="14"/>
+              </w:rPr>
+              <w:t>Primary</w:t>
+            </w:r>
+          </w:p>
+        </w:tc>
+        <w:tc>
+          <w:tcPr>
+            <w:tcW w:type="dxa" w:w="850"/>
+          </w:tcPr>
+          <w:p>
+            <w:r/>
+            <w:r>
+              <w:rPr>
+                <w:sz w:val="14"/>
+              </w:rPr>
+              <w:t>422.4</w:t>
+            </w:r>
+          </w:p>
+        </w:tc>
+        <w:tc>
+          <w:tcPr>
+            <w:tcW w:type="dxa" w:w="624"/>
+          </w:tcPr>
+          <w:p>
+            <w:r/>
+            <w:r>
+              <w:rPr>
+                <w:sz w:val="14"/>
+              </w:rPr>
+              <w:t>+2.4</w:t>
+            </w:r>
+          </w:p>
+        </w:tc>
+        <w:tc>
+          <w:tcPr>
+            <w:tcW w:type="dxa" w:w="624"/>
+          </w:tcPr>
+          <w:p>
+            <w:r/>
+            <w:r>
+              <w:rPr>
+                <w:sz w:val="14"/>
+              </w:rPr>
+              <w:t>0.34</w:t>
+            </w:r>
+          </w:p>
+        </w:tc>
+        <w:tc>
+          <w:tcPr>
+            <w:tcW w:type="dxa" w:w="850"/>
+          </w:tcPr>
+          <w:p>
+            <w:r/>
+            <w:r>
+              <w:rPr>
+                <w:sz w:val="14"/>
+              </w:rPr>
+              <w:t>425.9</w:t>
+            </w:r>
+          </w:p>
+        </w:tc>
+        <w:tc>
+          <w:tcPr>
+            <w:tcW w:type="dxa" w:w="624"/>
+          </w:tcPr>
+          <w:p>
+            <w:r/>
+            <w:r>
+              <w:rPr>
+                <w:sz w:val="14"/>
+              </w:rPr>
+              <w:t>-1.1</w:t>
+            </w:r>
+          </w:p>
+        </w:tc>
+        <w:tc>
+          <w:tcPr>
+            <w:tcW w:type="dxa" w:w="1304"/>
+          </w:tcPr>
+          <w:p>
+            <w:r/>
+            <w:r>
+              <w:rPr>
+                <w:sz w:val="14"/>
+              </w:rPr>
+              <w:t>0.06 (phosphoric acid)</w:t>
+            </w:r>
+          </w:p>
+        </w:tc>
+        <w:tc>
+          <w:tcPr>
+            <w:tcW w:type="dxa" w:w="737"/>
+          </w:tcPr>
+          <w:p>
+            <w:r/>
+            <w:r>
+              <w:rPr>
+                <w:sz w:val="14"/>
+              </w:rPr>
+              <w:t>MATCH</w:t>
+            </w:r>
+          </w:p>
+        </w:tc>
+        <w:tc>
+          <w:tcPr>
+            <w:tcW w:type="dxa" w:w="3061"/>
+          </w:tcPr>
+          <w:p>
+            <w:r/>
+            <w:r>
+              <w:rPr>
+                <w:sz w:val="14"/>
+              </w:rPr>
+              <w:t>Calculated mode at 422.4, relative activity 0.34. The fragments gave only a weak phosphoric-acid mode (0.06). The motion of the 422 mode was not analysed, so the band stays unassigned.</w:t>
+            </w:r>
+          </w:p>
+        </w:tc>
+      </w:tr>
+      <w:tr>
+        <w:tc>
+          <w:tcPr>
+            <w:tcW w:type="dxa" w:w="737"/>
+          </w:tcPr>
+          <w:p>
+            <w:r/>
+            <w:r>
+              <w:rPr>
+                <w:sz w:val="14"/>
+              </w:rPr>
+              <w:t>765.5</w:t>
+            </w:r>
+          </w:p>
+        </w:tc>
+        <w:tc>
+          <w:tcPr>
+            <w:tcW w:type="dxa" w:w="794"/>
+          </w:tcPr>
+          <w:p>
+            <w:r/>
+            <w:r>
+              <w:rPr>
+                <w:sz w:val="14"/>
+              </w:rPr>
+              <w:t>Supporting</w:t>
+            </w:r>
+          </w:p>
+        </w:tc>
+        <w:tc>
+          <w:tcPr>
+            <w:tcW w:type="dxa" w:w="850"/>
+          </w:tcPr>
+          <w:p>
+            <w:r/>
+            <w:r>
+              <w:rPr>
+                <w:sz w:val="14"/>
+              </w:rPr>
+              <w:t>764.4</w:t>
+            </w:r>
+          </w:p>
+        </w:tc>
+        <w:tc>
+          <w:tcPr>
+            <w:tcW w:type="dxa" w:w="624"/>
+          </w:tcPr>
+          <w:p>
+            <w:r/>
+            <w:r>
+              <w:rPr>
+                <w:sz w:val="14"/>
+              </w:rPr>
+              <w:t>+1.1</w:t>
+            </w:r>
+          </w:p>
+        </w:tc>
+        <w:tc>
+          <w:tcPr>
+            <w:tcW w:type="dxa" w:w="624"/>
+          </w:tcPr>
+          <w:p>
+            <w:r/>
+            <w:r>
+              <w:rPr>
+                <w:sz w:val="14"/>
+              </w:rPr>
+              <w:t>0.08</w:t>
+            </w:r>
+          </w:p>
+        </w:tc>
+        <w:tc>
+          <w:tcPr>
+            <w:tcW w:type="dxa" w:w="850"/>
+          </w:tcPr>
+          <w:p>
+            <w:r/>
+            <w:r>
+              <w:rPr>
+                <w:sz w:val="14"/>
+              </w:rPr>
+              <w:t>777.9</w:t>
+            </w:r>
+          </w:p>
+        </w:tc>
+        <w:tc>
+          <w:tcPr>
+            <w:tcW w:type="dxa" w:w="624"/>
+          </w:tcPr>
+          <w:p>
+            <w:r/>
+            <w:r>
+              <w:rPr>
+                <w:sz w:val="14"/>
+              </w:rPr>
+              <w:t>-12.4</w:t>
+            </w:r>
+          </w:p>
+        </w:tc>
+        <w:tc>
+          <w:tcPr>
+            <w:tcW w:type="dxa" w:w="1304"/>
+          </w:tcPr>
+          <w:p>
+            <w:r/>
+            <w:r>
+              <w:rPr>
+                <w:sz w:val="14"/>
+              </w:rPr>
+              <w:t>0.24 (phosphoric acid)</w:t>
+            </w:r>
+          </w:p>
+        </w:tc>
+        <w:tc>
+          <w:tcPr>
+            <w:tcW w:type="dxa" w:w="737"/>
+          </w:tcPr>
+          <w:p>
+            <w:r/>
+            <w:r>
+              <w:rPr>
+                <w:sz w:val="14"/>
+              </w:rPr>
+              <w:t>MATCH</w:t>
+            </w:r>
+          </w:p>
+        </w:tc>
+        <w:tc>
+          <w:tcPr>
+            <w:tcW w:type="dxa" w:w="3061"/>
+          </w:tcPr>
+          <w:p>
+            <w:r/>
+            <w:r>
+              <w:rPr>
+                <w:sz w:val="14"/>
+              </w:rPr>
+              <w:t>Mode at 764.4, weak (0.08). The fragments were 12.4 cm-1 away. Position now agrees; the strength does not (the experimental band is among the stronger bands).</w:t>
+            </w:r>
+          </w:p>
+        </w:tc>
+      </w:tr>
+      <w:tr>
+        <w:tc>
+          <w:tcPr>
+            <w:tcW w:type="dxa" w:w="737"/>
+          </w:tcPr>
+          <w:p>
+            <w:r/>
+            <w:r>
+              <w:rPr>
+                <w:sz w:val="14"/>
+              </w:rPr>
+              <w:t>861.1</w:t>
+            </w:r>
+          </w:p>
+        </w:tc>
+        <w:tc>
+          <w:tcPr>
+            <w:tcW w:type="dxa" w:w="794"/>
+          </w:tcPr>
+          <w:p>
+            <w:r/>
+            <w:r>
+              <w:rPr>
+                <w:sz w:val="14"/>
+              </w:rPr>
+              <w:t>Supporting</w:t>
+            </w:r>
+          </w:p>
+        </w:tc>
+        <w:tc>
+          <w:tcPr>
+            <w:tcW w:type="dxa" w:w="850"/>
+          </w:tcPr>
+          <w:p>
+            <w:r/>
+            <w:r>
+              <w:rPr>
+                <w:sz w:val="14"/>
+              </w:rPr>
+              <w:t>862.0</w:t>
+            </w:r>
+          </w:p>
+        </w:tc>
+        <w:tc>
+          <w:tcPr>
+            <w:tcW w:type="dxa" w:w="624"/>
+          </w:tcPr>
+          <w:p>
+            <w:r/>
+            <w:r>
+              <w:rPr>
+                <w:sz w:val="14"/>
+              </w:rPr>
+              <w:t>-0.9</w:t>
+            </w:r>
+          </w:p>
+        </w:tc>
+        <w:tc>
+          <w:tcPr>
+            <w:tcW w:type="dxa" w:w="624"/>
+          </w:tcPr>
+          <w:p>
+            <w:r/>
+            <w:r>
+              <w:rPr>
+                <w:sz w:val="14"/>
+              </w:rPr>
+              <w:t>0.37</w:t>
+            </w:r>
+          </w:p>
+        </w:tc>
+        <w:tc>
+          <w:tcPr>
+            <w:tcW w:type="dxa" w:w="850"/>
+          </w:tcPr>
+          <w:p>
+            <w:r/>
+            <w:r>
+              <w:rPr>
+                <w:sz w:val="14"/>
+              </w:rPr>
+              <w:t>858.1</w:t>
+            </w:r>
+          </w:p>
+        </w:tc>
+        <w:tc>
+          <w:tcPr>
+            <w:tcW w:type="dxa" w:w="624"/>
+          </w:tcPr>
+          <w:p>
+            <w:r/>
+            <w:r>
+              <w:rPr>
+                <w:sz w:val="14"/>
+              </w:rPr>
+              <w:t>+3.0</w:t>
+            </w:r>
+          </w:p>
+        </w:tc>
+        <w:tc>
+          <w:tcPr>
+            <w:tcW w:type="dxa" w:w="1304"/>
+          </w:tcPr>
+          <w:p>
+            <w:r/>
+            <w:r>
+              <w:rPr>
+                <w:sz w:val="14"/>
+              </w:rPr>
+              <w:t>0.02 (glucosamine)</w:t>
+            </w:r>
+          </w:p>
+        </w:tc>
+        <w:tc>
+          <w:tcPr>
+            <w:tcW w:type="dxa" w:w="737"/>
+          </w:tcPr>
+          <w:p>
+            <w:r/>
+            <w:r>
+              <w:rPr>
+                <w:sz w:val="14"/>
+              </w:rPr>
+              <w:t>MATCH</w:t>
+            </w:r>
+          </w:p>
+        </w:tc>
+        <w:tc>
+          <w:tcPr>
+            <w:tcW w:type="dxa" w:w="3061"/>
+          </w:tcPr>
+          <w:p>
+            <w:r/>
+            <w:r>
+              <w:rPr>
+                <w:sz w:val="14"/>
+              </w:rPr>
+              <w:t>Mode at 862.0, relative activity 0.37 (fragments: 0.02). Consistent with the sugar-ring region of the two glucosamines and Kdo.</w:t>
+            </w:r>
+          </w:p>
+        </w:tc>
+      </w:tr>
+      <w:tr>
+        <w:tc>
+          <w:tcPr>
+            <w:tcW w:type="dxa" w:w="737"/>
+          </w:tcPr>
+          <w:p>
+            <w:r/>
+            <w:r>
+              <w:rPr>
+                <w:sz w:val="14"/>
+              </w:rPr>
+              <w:t>995.8</w:t>
+            </w:r>
+          </w:p>
+        </w:tc>
+        <w:tc>
+          <w:tcPr>
+            <w:tcW w:type="dxa" w:w="794"/>
+          </w:tcPr>
+          <w:p>
+            <w:r/>
+            <w:r>
+              <w:rPr>
+                <w:sz w:val="14"/>
+              </w:rPr>
+              <w:t>Supporting</w:t>
+            </w:r>
+          </w:p>
+        </w:tc>
+        <w:tc>
+          <w:tcPr>
+            <w:tcW w:type="dxa" w:w="850"/>
+          </w:tcPr>
+          <w:p>
+            <w:r/>
+            <w:r>
+              <w:rPr>
+                <w:sz w:val="14"/>
+              </w:rPr>
+              <w:t>996.2</w:t>
+            </w:r>
+          </w:p>
+        </w:tc>
+        <w:tc>
+          <w:tcPr>
+            <w:tcW w:type="dxa" w:w="624"/>
+          </w:tcPr>
+          <w:p>
+            <w:r/>
+            <w:r>
+              <w:rPr>
+                <w:sz w:val="14"/>
+              </w:rPr>
+              <w:t>-0.4</w:t>
+            </w:r>
+          </w:p>
+        </w:tc>
+        <w:tc>
+          <w:tcPr>
+            <w:tcW w:type="dxa" w:w="624"/>
+          </w:tcPr>
+          <w:p>
+            <w:r/>
+            <w:r>
+              <w:rPr>
+                <w:sz w:val="14"/>
+              </w:rPr>
+              <w:t>0.08</w:t>
+            </w:r>
+          </w:p>
+        </w:tc>
+        <w:tc>
+          <w:tcPr>
+            <w:tcW w:type="dxa" w:w="850"/>
+          </w:tcPr>
+          <w:p>
+            <w:r/>
+            <w:r>
+              <w:rPr>
+                <w:sz w:val="14"/>
+              </w:rPr>
+              <w:t>995.5</w:t>
+            </w:r>
+          </w:p>
+        </w:tc>
+        <w:tc>
+          <w:tcPr>
+            <w:tcW w:type="dxa" w:w="624"/>
+          </w:tcPr>
+          <w:p>
+            <w:r/>
+            <w:r>
+              <w:rPr>
+                <w:sz w:val="14"/>
+              </w:rPr>
+              <w:t>+0.3</w:t>
+            </w:r>
+          </w:p>
+        </w:tc>
+        <w:tc>
+          <w:tcPr>
+            <w:tcW w:type="dxa" w:w="1304"/>
+          </w:tcPr>
+          <w:p>
+            <w:r/>
+            <w:r>
+              <w:rPr>
+                <w:sz w:val="14"/>
+              </w:rPr>
+              <w:t>0.04 (phosphoric acid)</w:t>
+            </w:r>
+          </w:p>
+        </w:tc>
+        <w:tc>
+          <w:tcPr>
+            <w:tcW w:type="dxa" w:w="737"/>
+          </w:tcPr>
+          <w:p>
+            <w:r/>
+            <w:r>
+              <w:rPr>
+                <w:sz w:val="14"/>
+              </w:rPr>
+              <w:t>MATCH</w:t>
+            </w:r>
+          </w:p>
+        </w:tc>
+        <w:tc>
+          <w:tcPr>
+            <w:tcW w:type="dxa" w:w="3061"/>
+          </w:tcPr>
+          <w:p>
+            <w:r/>
+            <w:r>
+              <w:rPr>
+                <w:sz w:val="14"/>
+              </w:rPr>
+              <w:t>Nearest mode 996.2 is weak (0.08), but the strongest mode of the 900-1000 region lies at 994.7 (relative activity 0.72), 1 cm-1 away, so the band has a strong calculated counterpart.</w:t>
+            </w:r>
+          </w:p>
+        </w:tc>
+      </w:tr>
+      <w:tr>
+        <w:tc>
+          <w:tcPr>
+            <w:tcW w:type="dxa" w:w="737"/>
+          </w:tcPr>
+          <w:p>
+            <w:r/>
+            <w:r>
+              <w:rPr>
+                <w:sz w:val="14"/>
+              </w:rPr>
+              <w:t>1080.5</w:t>
+            </w:r>
+          </w:p>
+        </w:tc>
+        <w:tc>
+          <w:tcPr>
+            <w:tcW w:type="dxa" w:w="794"/>
+          </w:tcPr>
+          <w:p>
+            <w:r/>
+            <w:r>
+              <w:rPr>
+                <w:sz w:val="14"/>
+              </w:rPr>
+              <w:t>Primary</w:t>
+            </w:r>
+          </w:p>
+        </w:tc>
+        <w:tc>
+          <w:tcPr>
+            <w:tcW w:type="dxa" w:w="850"/>
+          </w:tcPr>
+          <w:p>
+            <w:r/>
+            <w:r>
+              <w:rPr>
+                <w:sz w:val="14"/>
+              </w:rPr>
+              <w:t>1079.5</w:t>
+            </w:r>
+          </w:p>
+        </w:tc>
+        <w:tc>
+          <w:tcPr>
+            <w:tcW w:type="dxa" w:w="624"/>
+          </w:tcPr>
+          <w:p>
+            <w:r/>
+            <w:r>
+              <w:rPr>
+                <w:sz w:val="14"/>
+              </w:rPr>
+              <w:t>+1.0</w:t>
+            </w:r>
+          </w:p>
+        </w:tc>
+        <w:tc>
+          <w:tcPr>
+            <w:tcW w:type="dxa" w:w="624"/>
+          </w:tcPr>
+          <w:p>
+            <w:r/>
+            <w:r>
+              <w:rPr>
+                <w:sz w:val="14"/>
+              </w:rPr>
+              <w:t>0.12</w:t>
+            </w:r>
+          </w:p>
+        </w:tc>
+        <w:tc>
+          <w:tcPr>
+            <w:tcW w:type="dxa" w:w="850"/>
+          </w:tcPr>
+          <w:p>
+            <w:r/>
+            <w:r>
+              <w:rPr>
+                <w:sz w:val="14"/>
+              </w:rPr>
+              <w:t>1081.1</w:t>
+            </w:r>
+          </w:p>
+        </w:tc>
+        <w:tc>
+          <w:tcPr>
+            <w:tcW w:type="dxa" w:w="624"/>
+          </w:tcPr>
+          <w:p>
+            <w:r/>
+            <w:r>
+              <w:rPr>
+                <w:sz w:val="14"/>
+              </w:rPr>
+              <w:t>-0.6</w:t>
+            </w:r>
+          </w:p>
+        </w:tc>
+        <w:tc>
+          <w:tcPr>
+            <w:tcW w:type="dxa" w:w="1304"/>
+          </w:tcPr>
+          <w:p>
+            <w:r/>
+            <w:r>
+              <w:rPr>
+                <w:sz w:val="14"/>
+              </w:rPr>
+              <w:t>0.05 (glucosamine)</w:t>
+            </w:r>
+          </w:p>
+        </w:tc>
+        <w:tc>
+          <w:tcPr>
+            <w:tcW w:type="dxa" w:w="737"/>
+          </w:tcPr>
+          <w:p>
+            <w:r/>
+            <w:r>
+              <w:rPr>
+                <w:sz w:val="14"/>
+              </w:rPr>
+              <w:t>MATCH</w:t>
+            </w:r>
+          </w:p>
+        </w:tc>
+        <w:tc>
+          <w:tcPr>
+            <w:tcW w:type="dxa" w:w="3061"/>
+          </w:tcPr>
+          <w:p>
+            <w:r/>
+            <w:r>
+              <w:rPr>
+                <w:sz w:val="14"/>
+              </w:rPr>
+              <w:t>Mode at 1079.5, activity 0.12 (fragments: 0.05). The band is broad and about 14 % glass-affected, so a 1 cm-1 agreement is not meaningful.</w:t>
+            </w:r>
+          </w:p>
+        </w:tc>
+      </w:tr>
+    </w:tbl>
+    <w:p/>
+    <w:p>
+      <w:pPr>
+        <w:pStyle w:val="Heading2"/>
+      </w:pPr>
+      <w:r>
+        <w:t>5.4 What is happening and why</w:t>
+      </w:r>
+    </w:p>
+    <w:p>
+      <w:pPr>
+        <w:pStyle w:val="ListBullet"/>
+      </w:pPr>
+      <w:r>
+        <w:t>Positions: the whole-molecule model is closer than the fragments (mean difference 1.2 against 3.5 cm-1) and explains the 766 cm-1 band that the fragments missed by 12 cm-1. Having the glycosidic, phosphate-ester and Kdo links in one molecule moves modes to where they are in the sample.</w:t>
+      </w:r>
+    </w:p>
+    <w:p>
+      <w:pPr>
+        <w:pStyle w:val="ListBullet"/>
+      </w:pPr>
+      <w:r>
+        <w:t>Strength: at 425 and 861 cm-1 the model has modes of 0.34 and 0.37 of the maximum activity, against 0.06 and 0.02 for the fragments. These two bands are therefore no longer calculated as almost invisible. The model still puts its largest intensity in places where the measured LPS spectrum is weak: 1516 cm-1 (0.05 of the 425 band), 745 cm-1 (0.18) and 699 cm-1 (0.08).</w:t>
+      </w:r>
+    </w:p>
+    <w:p>
+      <w:pPr>
+        <w:pStyle w:val="ListBullet"/>
+      </w:pPr>
+      <w:r>
+        <w:t>Not better than chance: a mode list this dense (25 per 100 cm-1) matches almost any set of five bands. Random shifts of 15 to 70 cm-1 give 4.4 to 4.7 matches of 5, so 5 of 5 is p = 0.47 to 0.66. Using only the stronger modes (activity 0.15 or more, 190 modes) gives 4 of 5 within 5 cm-1, chance 3.6 (p = 0.61). The fragments gave p = 0.32 to 0.68. Neither calculation can claim an agreement beyond chance.</w:t>
+      </w:r>
+    </w:p>
+    <w:p>
+      <w:pPr>
+        <w:pStyle w:val="ListBullet"/>
+      </w:pPr>
+      <w:r>
+        <w:t>Shape: the whole-spectrum correlation is -0.01, compared with 0.14 for the equal-weight fragment composite. The cut chains remove most of the CH2 and CH3 bands, the 1516 cm-1 mode (probably an amide mode that the small basis set overstates; not verified) dominates the model, and the three artefact peaks at 2420 to 2750 cm-1 lie outside the compared range.</w:t>
+      </w:r>
+    </w:p>
+    <w:p>
+      <w:pPr>
+        <w:pStyle w:val="ListBullet"/>
+      </w:pPr>
+      <w:r>
+        <w:t>Combining both: fitting the whole-molecule spectrum together with the five fragments (non-negative least squares) gives r = 0.37, with a weight of 7 % for the lipid A model; the five fragments alone give 0.40. The model does not improve the fit, and these fitted weights are not the composition of LPS.</w:t>
+      </w:r>
+    </w:p>
+    <w:p>
+      <w:pPr>
+        <w:pStyle w:val="ListBullet"/>
+      </w:pPr>
+      <w:r>
+        <w:t>Literature SERS bands of endotoxin (850, 989, 1131 and 1330 cm-1, from the thesis used for the model): the model has modes at 854, 989 to 995, 1137 (weak) and 1329 (and 1316), as reported in the model methods. These bands are SERS bands and are not all present as bands of the bulk spectrum, so this is a check on the model, not on the library spectrum.</w:t>
+      </w:r>
+    </w:p>
+    <w:p>
+      <w:pPr>
+        <w:pStyle w:val="Heading2"/>
+      </w:pPr>
+      <w:r>
+        <w:t>5.5 Whole-molecule model against the five fragments</w:t>
+      </w:r>
+    </w:p>
+    <w:p>
+      <w:r>
+        <w:rPr>
+          <w:i w:val="0"/>
+        </w:rPr>
+        <w:t>The whole-molecule model is the better of the two calculations for band positions and for the strength of the 425 and 861 cm-1 modes. It is not better for the overall shape, and neither is better than chance for positions. The fragments remain useful for the regions the shortened model leaves out (long acyl chains, core sugars).</w:t>
+      </w:r>
+    </w:p>
+    <w:p>
+      <w:pPr>
+        <w:jc w:val="center"/>
+      </w:pPr>
+      <w:r>
+        <w:drawing>
+          <wp:inline xmlns:a="http://schemas.openxmlformats.org/drawingml/2006/main" xmlns:pic="http://schemas.openxmlformats.org/drawingml/2006/picture">
+            <wp:extent cx="6120000" cy="2002909"/>
+            <wp:docPr id="7" name="Picture 7"/>
+            <wp:cNvGraphicFramePr>
+              <a:graphicFrameLocks noChangeAspect="1"/>
+            </wp:cNvGraphicFramePr>
+            <a:graphic>
+              <a:graphicData uri="http://schemas.openxmlformats.org/drawingml/2006/picture">
+                <pic:pic>
+                  <pic:nvPicPr>
+                    <pic:cNvPr id="0" name="LPS_Whole_Molecule_vs_Fragments.png"/>
+                    <pic:cNvPicPr/>
+                  </pic:nvPicPr>
+                  <pic:blipFill>
+                    <a:blip r:embed="rId15"/>
+                    <a:stretch>
+                      <a:fillRect/>
+                    </a:stretch>
+                  </pic:blipFill>
+                  <pic:spPr>
+                    <a:xfrm>
+                      <a:off x="0" y="0"/>
+                      <a:ext cx="6120000" cy="2002909"/>
+                    </a:xfrm>
+                    <a:prstGeom prst="rect"/>
+                  </pic:spPr>
+                </pic:pic>
+              </a:graphicData>
+            </a:graphic>
+          </wp:inline>
+        </w:drawing>
+      </w:r>
+    </w:p>
+    <w:p>
+      <w:r>
+        <w:rPr>
+          <w:i/>
+          <w:sz w:val="17"/>
+        </w:rPr>
+        <w:t>Figure 3. LPS: whole-molecule model against the five fragments. Left: difference between each library band and the nearest calculated mode. Middle: calculated relative activity of that mode. Right: whole-spectrum correlation with the library reference.</w:t>
       </w:r>
     </w:p>
     <w:p>
@@ -2853,7 +4265,7 @@
           <w:i/>
           <w:sz w:val="17"/>
         </w:rPr>
-        <w:t>Figure 2. LPS. Top: library experimental reference (10 spectra). Bottom: scaled DFT modes of five fragments (coloured by fragment) and their equal-weight composite.</w:t>
+        <w:t>Figure 4. LPS, fragment calculation. Top: library experimental reference. Bottom: scaled DFT modes of five fragments (coloured by fragment) and their equal-weight composite.</w:t>
       </w:r>
     </w:p>
     <w:p>
@@ -2861,738 +4273,7 @@
         <w:pStyle w:val="Heading2"/>
       </w:pPr>
       <w:r>
-        <w:t>5.2 Band-by-band</w:t>
-      </w:r>
-    </w:p>
-    <w:tbl>
-      <w:tblPr>
-        <w:tblStyle w:val="TableGrid"/>
-        <w:tblW w:type="auto" w:w="0"/>
-        <w:tblLook w:firstColumn="1" w:firstRow="1" w:lastColumn="0" w:lastRow="0" w:noHBand="0" w:noVBand="1" w:val="04A0"/>
-      </w:tblPr>
-      <w:tblGrid>
-        <w:gridCol w:w="1290"/>
-        <w:gridCol w:w="1290"/>
-        <w:gridCol w:w="1290"/>
-        <w:gridCol w:w="1290"/>
-        <w:gridCol w:w="1290"/>
-        <w:gridCol w:w="1290"/>
-        <w:gridCol w:w="1290"/>
-        <w:gridCol w:w="1290"/>
-      </w:tblGrid>
-      <w:tr>
-        <w:tc>
-          <w:tcPr>
-            <w:tcW w:type="dxa" w:w="737"/>
-            <w:shd w:val="clear" w:color="auto" w:fill="D9D9D9"/>
-          </w:tcPr>
-          <w:p>
-            <w:r/>
-            <w:r>
-              <w:rPr>
-                <w:b/>
-                <w:sz w:val="15"/>
-              </w:rPr>
-              <w:t>Exp. band (cm-1)</w:t>
-            </w:r>
-          </w:p>
-        </w:tc>
-        <w:tc>
-          <w:tcPr>
-            <w:tcW w:type="dxa" w:w="794"/>
-            <w:shd w:val="clear" w:color="auto" w:fill="D9D9D9"/>
-          </w:tcPr>
-          <w:p>
-            <w:r/>
-            <w:r>
-              <w:rPr>
-                <w:b/>
-                <w:sz w:val="15"/>
-              </w:rPr>
-              <w:t>Class</w:t>
-            </w:r>
-          </w:p>
-        </w:tc>
-        <w:tc>
-          <w:tcPr>
-            <w:tcW w:type="dxa" w:w="850"/>
-            <w:shd w:val="clear" w:color="auto" w:fill="D9D9D9"/>
-          </w:tcPr>
-          <w:p>
-            <w:r/>
-            <w:r>
-              <w:rPr>
-                <w:b/>
-                <w:sz w:val="15"/>
-              </w:rPr>
-              <w:t>Nearest DFT mode (cm-1)</w:t>
-            </w:r>
-          </w:p>
-        </w:tc>
-        <w:tc>
-          <w:tcPr>
-            <w:tcW w:type="dxa" w:w="737"/>
-            <w:shd w:val="clear" w:color="auto" w:fill="D9D9D9"/>
-          </w:tcPr>
-          <w:p>
-            <w:r/>
-            <w:r>
-              <w:rPr>
-                <w:b/>
-                <w:sz w:val="15"/>
-              </w:rPr>
-              <w:t>Exp - calc (cm-1)</w:t>
-            </w:r>
-          </w:p>
-        </w:tc>
-        <w:tc>
-          <w:tcPr>
-            <w:tcW w:type="dxa" w:w="737"/>
-            <w:shd w:val="clear" w:color="auto" w:fill="D9D9D9"/>
-          </w:tcPr>
-          <w:p>
-            <w:r/>
-            <w:r>
-              <w:rPr>
-                <w:b/>
-                <w:sz w:val="15"/>
-              </w:rPr>
-              <w:t>Calc. rel. activity</w:t>
-            </w:r>
-          </w:p>
-        </w:tc>
-        <w:tc>
-          <w:tcPr>
-            <w:tcW w:type="dxa" w:w="1587"/>
-            <w:shd w:val="clear" w:color="auto" w:fill="D9D9D9"/>
-          </w:tcPr>
-          <w:p>
-            <w:r/>
-            <w:r>
-              <w:rPr>
-                <w:b/>
-                <w:sz w:val="15"/>
-              </w:rPr>
-              <w:t>Mode type / fragment</w:t>
-            </w:r>
-          </w:p>
-        </w:tc>
-        <w:tc>
-          <w:tcPr>
-            <w:tcW w:type="dxa" w:w="850"/>
-            <w:shd w:val="clear" w:color="auto" w:fill="D9D9D9"/>
-          </w:tcPr>
-          <w:p>
-            <w:r/>
-            <w:r>
-              <w:rPr>
-                <w:b/>
-                <w:sz w:val="15"/>
-              </w:rPr>
-              <w:t>Verdict</w:t>
-            </w:r>
-          </w:p>
-        </w:tc>
-        <w:tc>
-          <w:tcPr>
-            <w:tcW w:type="dxa" w:w="3912"/>
-            <w:shd w:val="clear" w:color="auto" w:fill="D9D9D9"/>
-          </w:tcPr>
-          <w:p>
-            <w:r/>
-            <w:r>
-              <w:rPr>
-                <w:b/>
-                <w:sz w:val="15"/>
-              </w:rPr>
-              <w:t>Why</w:t>
-            </w:r>
-          </w:p>
-        </w:tc>
-      </w:tr>
-      <w:tr>
-        <w:tc>
-          <w:tcPr>
-            <w:tcW w:type="dxa" w:w="737"/>
-          </w:tcPr>
-          <w:p>
-            <w:r/>
-            <w:r>
-              <w:rPr>
-                <w:sz w:val="15"/>
-              </w:rPr>
-              <w:t>424.8</w:t>
-            </w:r>
-          </w:p>
-        </w:tc>
-        <w:tc>
-          <w:tcPr>
-            <w:tcW w:type="dxa" w:w="794"/>
-          </w:tcPr>
-          <w:p>
-            <w:r/>
-            <w:r>
-              <w:rPr>
-                <w:sz w:val="15"/>
-              </w:rPr>
-              <w:t>Primary</w:t>
-            </w:r>
-          </w:p>
-        </w:tc>
-        <w:tc>
-          <w:tcPr>
-            <w:tcW w:type="dxa" w:w="850"/>
-          </w:tcPr>
-          <w:p>
-            <w:r/>
-            <w:r>
-              <w:rPr>
-                <w:sz w:val="15"/>
-              </w:rPr>
-              <w:t>425.9</w:t>
-            </w:r>
-          </w:p>
-        </w:tc>
-        <w:tc>
-          <w:tcPr>
-            <w:tcW w:type="dxa" w:w="737"/>
-          </w:tcPr>
-          <w:p>
-            <w:r/>
-            <w:r>
-              <w:rPr>
-                <w:sz w:val="15"/>
-              </w:rPr>
-              <w:t>-1.1</w:t>
-            </w:r>
-          </w:p>
-        </w:tc>
-        <w:tc>
-          <w:tcPr>
-            <w:tcW w:type="dxa" w:w="737"/>
-          </w:tcPr>
-          <w:p>
-            <w:r/>
-            <w:r>
-              <w:rPr>
-                <w:sz w:val="15"/>
-              </w:rPr>
-              <w:t>0.06</w:t>
-            </w:r>
-          </w:p>
-        </w:tc>
-        <w:tc>
-          <w:tcPr>
-            <w:tcW w:type="dxa" w:w="1587"/>
-          </w:tcPr>
-          <w:p>
-            <w:r/>
-            <w:r>
-              <w:rPr>
-                <w:sz w:val="15"/>
-              </w:rPr>
-              <w:t>Phosphoric acid</w:t>
-            </w:r>
-          </w:p>
-        </w:tc>
-        <w:tc>
-          <w:tcPr>
-            <w:tcW w:type="dxa" w:w="850"/>
-          </w:tcPr>
-          <w:p>
-            <w:r/>
-            <w:r>
-              <w:rPr>
-                <w:sz w:val="15"/>
-              </w:rPr>
-              <w:t>MATCH</w:t>
-            </w:r>
-          </w:p>
-        </w:tc>
-        <w:tc>
-          <w:tcPr>
-            <w:tcW w:type="dxa" w:w="3912"/>
-            <w:shd w:val="clear" w:color="auto" w:fill="EAF6EE"/>
-          </w:tcPr>
-          <w:p>
-            <w:r/>
-            <w:r>
-              <w:rPr>
-                <w:sz w:val="15"/>
-              </w:rPr>
-              <w:t>A phosphoric-acid mode is calculated at 425.9, but its calculated activity is low (0.06 of the strongest mode) whereas 425 is the strongest experimental band. Glucosamine, heptose and KDO also have modes within 15 cm-1, so the position is not specific. Position-compatible, intensity-inconsistent.</w:t>
-            </w:r>
-          </w:p>
-        </w:tc>
-      </w:tr>
-      <w:tr>
-        <w:tc>
-          <w:tcPr>
-            <w:tcW w:type="dxa" w:w="737"/>
-          </w:tcPr>
-          <w:p>
-            <w:r/>
-            <w:r>
-              <w:rPr>
-                <w:sz w:val="15"/>
-              </w:rPr>
-              <w:t>765.5</w:t>
-            </w:r>
-          </w:p>
-        </w:tc>
-        <w:tc>
-          <w:tcPr>
-            <w:tcW w:type="dxa" w:w="794"/>
-          </w:tcPr>
-          <w:p>
-            <w:r/>
-            <w:r>
-              <w:rPr>
-                <w:sz w:val="15"/>
-              </w:rPr>
-              <w:t>Supporting</w:t>
-            </w:r>
-          </w:p>
-        </w:tc>
-        <w:tc>
-          <w:tcPr>
-            <w:tcW w:type="dxa" w:w="850"/>
-          </w:tcPr>
-          <w:p>
-            <w:r/>
-            <w:r>
-              <w:rPr>
-                <w:sz w:val="15"/>
-              </w:rPr>
-              <w:t>777.9</w:t>
-            </w:r>
-          </w:p>
-        </w:tc>
-        <w:tc>
-          <w:tcPr>
-            <w:tcW w:type="dxa" w:w="737"/>
-          </w:tcPr>
-          <w:p>
-            <w:r/>
-            <w:r>
-              <w:rPr>
-                <w:sz w:val="15"/>
-              </w:rPr>
-              <w:t>-12.4</w:t>
-            </w:r>
-          </w:p>
-        </w:tc>
-        <w:tc>
-          <w:tcPr>
-            <w:tcW w:type="dxa" w:w="737"/>
-          </w:tcPr>
-          <w:p>
-            <w:r/>
-            <w:r>
-              <w:rPr>
-                <w:sz w:val="15"/>
-              </w:rPr>
-              <w:t>0.24</w:t>
-            </w:r>
-          </w:p>
-        </w:tc>
-        <w:tc>
-          <w:tcPr>
-            <w:tcW w:type="dxa" w:w="1587"/>
-          </w:tcPr>
-          <w:p>
-            <w:r/>
-            <w:r>
-              <w:rPr>
-                <w:sz w:val="15"/>
-              </w:rPr>
-              <w:t>Phosphoric acid</w:t>
-            </w:r>
-          </w:p>
-        </w:tc>
-        <w:tc>
-          <w:tcPr>
-            <w:tcW w:type="dxa" w:w="850"/>
-          </w:tcPr>
-          <w:p>
-            <w:r/>
-            <w:r>
-              <w:rPr>
-                <w:sz w:val="15"/>
-              </w:rPr>
-              <w:t>NEAR (10-18)</w:t>
-            </w:r>
-          </w:p>
-        </w:tc>
-        <w:tc>
-          <w:tcPr>
-            <w:tcW w:type="dxa" w:w="3912"/>
-            <w:shd w:val="clear" w:color="auto" w:fill="FFF4D6"/>
-          </w:tcPr>
-          <w:p>
-            <w:r/>
-            <w:r>
-              <w:rPr>
-                <w:sz w:val="15"/>
-              </w:rPr>
-              <w:t>Phosphoric-acid mode at 777.9 (12 cm-1 away). Near, not a match; the band stays unassigned.</w:t>
-            </w:r>
-          </w:p>
-        </w:tc>
-      </w:tr>
-      <w:tr>
-        <w:tc>
-          <w:tcPr>
-            <w:tcW w:type="dxa" w:w="737"/>
-          </w:tcPr>
-          <w:p>
-            <w:r/>
-            <w:r>
-              <w:rPr>
-                <w:sz w:val="15"/>
-              </w:rPr>
-              <w:t>861.1</w:t>
-            </w:r>
-          </w:p>
-        </w:tc>
-        <w:tc>
-          <w:tcPr>
-            <w:tcW w:type="dxa" w:w="794"/>
-          </w:tcPr>
-          <w:p>
-            <w:r/>
-            <w:r>
-              <w:rPr>
-                <w:sz w:val="15"/>
-              </w:rPr>
-              <w:t>Supporting</w:t>
-            </w:r>
-          </w:p>
-        </w:tc>
-        <w:tc>
-          <w:tcPr>
-            <w:tcW w:type="dxa" w:w="850"/>
-          </w:tcPr>
-          <w:p>
-            <w:r/>
-            <w:r>
-              <w:rPr>
-                <w:sz w:val="15"/>
-              </w:rPr>
-              <w:t>858.1</w:t>
-            </w:r>
-          </w:p>
-        </w:tc>
-        <w:tc>
-          <w:tcPr>
-            <w:tcW w:type="dxa" w:w="737"/>
-          </w:tcPr>
-          <w:p>
-            <w:r/>
-            <w:r>
-              <w:rPr>
-                <w:sz w:val="15"/>
-              </w:rPr>
-              <w:t>+3.0</w:t>
-            </w:r>
-          </w:p>
-        </w:tc>
-        <w:tc>
-          <w:tcPr>
-            <w:tcW w:type="dxa" w:w="737"/>
-          </w:tcPr>
-          <w:p>
-            <w:r/>
-            <w:r>
-              <w:rPr>
-                <w:sz w:val="15"/>
-              </w:rPr>
-              <w:t>0.02</w:t>
-            </w:r>
-          </w:p>
-        </w:tc>
-        <w:tc>
-          <w:tcPr>
-            <w:tcW w:type="dxa" w:w="1587"/>
-          </w:tcPr>
-          <w:p>
-            <w:r/>
-            <w:r>
-              <w:rPr>
-                <w:sz w:val="15"/>
-              </w:rPr>
-              <w:t>D-glucosamine</w:t>
-            </w:r>
-          </w:p>
-        </w:tc>
-        <w:tc>
-          <w:tcPr>
-            <w:tcW w:type="dxa" w:w="850"/>
-          </w:tcPr>
-          <w:p>
-            <w:r/>
-            <w:r>
-              <w:rPr>
-                <w:sz w:val="15"/>
-              </w:rPr>
-              <w:t>MATCH</w:t>
-            </w:r>
-          </w:p>
-        </w:tc>
-        <w:tc>
-          <w:tcPr>
-            <w:tcW w:type="dxa" w:w="3912"/>
-            <w:shd w:val="clear" w:color="auto" w:fill="EAF6EE"/>
-          </w:tcPr>
-          <w:p>
-            <w:r/>
-            <w:r>
-              <w:rPr>
-                <w:sz w:val="15"/>
-              </w:rPr>
-              <w:t>Glucosamine mode at 858 (3 cm-1) but very weak in the calculation (0.02). Position agrees; intensity does not.</w:t>
-            </w:r>
-          </w:p>
-        </w:tc>
-      </w:tr>
-      <w:tr>
-        <w:tc>
-          <w:tcPr>
-            <w:tcW w:type="dxa" w:w="737"/>
-          </w:tcPr>
-          <w:p>
-            <w:r/>
-            <w:r>
-              <w:rPr>
-                <w:sz w:val="15"/>
-              </w:rPr>
-              <w:t>995.8</w:t>
-            </w:r>
-          </w:p>
-        </w:tc>
-        <w:tc>
-          <w:tcPr>
-            <w:tcW w:type="dxa" w:w="794"/>
-          </w:tcPr>
-          <w:p>
-            <w:r/>
-            <w:r>
-              <w:rPr>
-                <w:sz w:val="15"/>
-              </w:rPr>
-              <w:t>Supporting</w:t>
-            </w:r>
-          </w:p>
-        </w:tc>
-        <w:tc>
-          <w:tcPr>
-            <w:tcW w:type="dxa" w:w="850"/>
-          </w:tcPr>
-          <w:p>
-            <w:r/>
-            <w:r>
-              <w:rPr>
-                <w:sz w:val="15"/>
-              </w:rPr>
-              <w:t>995.5</w:t>
-            </w:r>
-          </w:p>
-        </w:tc>
-        <w:tc>
-          <w:tcPr>
-            <w:tcW w:type="dxa" w:w="737"/>
-          </w:tcPr>
-          <w:p>
-            <w:r/>
-            <w:r>
-              <w:rPr>
-                <w:sz w:val="15"/>
-              </w:rPr>
-              <w:t>+0.3</w:t>
-            </w:r>
-          </w:p>
-        </w:tc>
-        <w:tc>
-          <w:tcPr>
-            <w:tcW w:type="dxa" w:w="737"/>
-          </w:tcPr>
-          <w:p>
-            <w:r/>
-            <w:r>
-              <w:rPr>
-                <w:sz w:val="15"/>
-              </w:rPr>
-              <w:t>0.04</w:t>
-            </w:r>
-          </w:p>
-        </w:tc>
-        <w:tc>
-          <w:tcPr>
-            <w:tcW w:type="dxa" w:w="1587"/>
-          </w:tcPr>
-          <w:p>
-            <w:r/>
-            <w:r>
-              <w:rPr>
-                <w:sz w:val="15"/>
-              </w:rPr>
-              <w:t>Phosphoric acid</w:t>
-            </w:r>
-          </w:p>
-        </w:tc>
-        <w:tc>
-          <w:tcPr>
-            <w:tcW w:type="dxa" w:w="850"/>
-          </w:tcPr>
-          <w:p>
-            <w:r/>
-            <w:r>
-              <w:rPr>
-                <w:sz w:val="15"/>
-              </w:rPr>
-              <w:t>MATCH</w:t>
-            </w:r>
-          </w:p>
-        </w:tc>
-        <w:tc>
-          <w:tcPr>
-            <w:tcW w:type="dxa" w:w="3912"/>
-            <w:shd w:val="clear" w:color="auto" w:fill="EAF6EE"/>
-          </w:tcPr>
-          <w:p>
-            <w:r/>
-            <w:r>
-              <w:rPr>
-                <w:sz w:val="15"/>
-              </w:rPr>
-              <w:t>Phosphoric-acid mode at 995.5, weak (0.04). Position agrees, but the fragment is a small inorganic acid, not LPS phosphate.</w:t>
-            </w:r>
-          </w:p>
-        </w:tc>
-      </w:tr>
-      <w:tr>
-        <w:tc>
-          <w:tcPr>
-            <w:tcW w:type="dxa" w:w="737"/>
-          </w:tcPr>
-          <w:p>
-            <w:r/>
-            <w:r>
-              <w:rPr>
-                <w:sz w:val="15"/>
-              </w:rPr>
-              <w:t>1080.5</w:t>
-            </w:r>
-          </w:p>
-        </w:tc>
-        <w:tc>
-          <w:tcPr>
-            <w:tcW w:type="dxa" w:w="794"/>
-          </w:tcPr>
-          <w:p>
-            <w:r/>
-            <w:r>
-              <w:rPr>
-                <w:sz w:val="15"/>
-              </w:rPr>
-              <w:t>Primary</w:t>
-            </w:r>
-          </w:p>
-        </w:tc>
-        <w:tc>
-          <w:tcPr>
-            <w:tcW w:type="dxa" w:w="850"/>
-          </w:tcPr>
-          <w:p>
-            <w:r/>
-            <w:r>
-              <w:rPr>
-                <w:sz w:val="15"/>
-              </w:rPr>
-              <w:t>1081.1</w:t>
-            </w:r>
-          </w:p>
-        </w:tc>
-        <w:tc>
-          <w:tcPr>
-            <w:tcW w:type="dxa" w:w="737"/>
-          </w:tcPr>
-          <w:p>
-            <w:r/>
-            <w:r>
-              <w:rPr>
-                <w:sz w:val="15"/>
-              </w:rPr>
-              <w:t>-0.6</w:t>
-            </w:r>
-          </w:p>
-        </w:tc>
-        <w:tc>
-          <w:tcPr>
-            <w:tcW w:type="dxa" w:w="737"/>
-          </w:tcPr>
-          <w:p>
-            <w:r/>
-            <w:r>
-              <w:rPr>
-                <w:sz w:val="15"/>
-              </w:rPr>
-              <w:t>0.05</w:t>
-            </w:r>
-          </w:p>
-        </w:tc>
-        <w:tc>
-          <w:tcPr>
-            <w:tcW w:type="dxa" w:w="1587"/>
-          </w:tcPr>
-          <w:p>
-            <w:r/>
-            <w:r>
-              <w:rPr>
-                <w:sz w:val="15"/>
-              </w:rPr>
-              <w:t>D-glucosamine</w:t>
-            </w:r>
-          </w:p>
-        </w:tc>
-        <w:tc>
-          <w:tcPr>
-            <w:tcW w:type="dxa" w:w="850"/>
-          </w:tcPr>
-          <w:p>
-            <w:r/>
-            <w:r>
-              <w:rPr>
-                <w:sz w:val="15"/>
-              </w:rPr>
-              <w:t>MATCH</w:t>
-            </w:r>
-          </w:p>
-        </w:tc>
-        <w:tc>
-          <w:tcPr>
-            <w:tcW w:type="dxa" w:w="3912"/>
-            <w:shd w:val="clear" w:color="auto" w:fill="EAF6EE"/>
-          </w:tcPr>
-          <w:p>
-            <w:r/>
-            <w:r>
-              <w:rPr>
-                <w:sz w:val="15"/>
-              </w:rPr>
-              <w:t>Glucosamine mode at 1081, weak (0.05). Position agrees; the experimental band is broad and about 14 % glass-affected, so a 0.6 cm-1 agreement is not meaningful.</w:t>
-            </w:r>
-          </w:p>
-        </w:tc>
-      </w:tr>
-    </w:tbl>
-    <w:p/>
-    <w:p>
-      <w:pPr>
-        <w:pStyle w:val="Heading2"/>
-      </w:pPr>
-      <w:r>
-        <w:t>5.3 What is happening and why</w:t>
+        <w:t>5.6 Likely reasons for the differences</w:t>
       </w:r>
     </w:p>
     <w:p>
@@ -3600,7 +4281,7 @@
         <w:pStyle w:val="ListBullet"/>
       </w:pPr>
       <w:r>
-        <w:t>Positions can be paired but not trusted. Four of five bands fall within 5 cm-1 of a calculated mode, yet the calculated activity at those modes is low (0.02 to 0.06) while those bands are strong or primary in the experiment.</w:t>
+        <w:t>Shortened chains and missing core. The model has C3-C4 chains instead of C12-C14 and no heptose or O-antigen, so the lipid, core and outer-chain bands of real LPS are not represented. This is the largest limit of the whole-molecule model.</w:t>
       </w:r>
     </w:p>
     <w:p>
@@ -3608,7 +4289,7 @@
         <w:pStyle w:val="ListBullet"/>
       </w:pPr>
       <w:r>
-        <w:t>The key LPS fingerprint, 425 cm-1, is the strongest experimental band and is not explained: the only calculated mode at that position (phosphoric acid, 425.9) is weak, and three other fragments also have modes within 15 cm-1. DFT therefore does not tell us what produces it.</w:t>
+        <w:t>Low level of theory. B3LYP/3-21G has no polarisation or diffuse functions; positions are approximate, intensities of charged groups are distorted and gas-phase hydrogen bonds to the charged groups produce artefact peaks at 2420 to 2750 cm-1. The 0.965 scale factor was not fitted for this level.</w:t>
       </w:r>
     </w:p>
     <w:p>
@@ -3616,7 +4297,7 @@
         <w:pStyle w:val="ListBullet"/>
       </w:pPr>
       <w:r>
-        <w:t>Whole-spectrum agreement is poor. An equal-weight composite correlates at r = 0.14. Even with fitted weights (glucosamine 45 %, phosphoric acid 39 %, others small) r reaches only 0.40 and R-squared is -0.38 (negative: worse than a flat line at the mean). An earlier reanalysis on older LPS data (30 Aug 2026) gave R-squared = 0.05 with 4 confident and 22 uncertain matches out of 43 peaks, which tells the same story.</w:t>
+        <w:t>Gas phase and charge -4 without counter-ions. The sample is a salt (Na+, Ca2+, Mg2+ counter-ions) in a powder; both change band positions and intensities.</w:t>
       </w:r>
     </w:p>
     <w:p>
@@ -3624,15 +4305,7 @@
         <w:pStyle w:val="ListBullet"/>
       </w:pPr>
       <w:r>
-        <w:t>Fitted weights favour glucosamine and phosphoric acid over KDO and heptose, but because the fit itself is poor these weights should not be read as the composition of LPS.</w:t>
-      </w:r>
-    </w:p>
-    <w:p>
-      <w:pPr>
-        <w:pStyle w:val="Heading2"/>
-      </w:pPr>
-      <w:r>
-        <w:t>5.4 Likely reasons for the differences</w:t>
+        <w:t>One conformer. A single low-energy shape of a flexible molecule was calculated; the stereocentres left open by PubChem were set by the embedding.</w:t>
       </w:r>
     </w:p>
     <w:p>
@@ -3640,7 +4313,7 @@
         <w:pStyle w:val="ListBullet"/>
       </w:pPr>
       <w:r>
-        <w:t>Fragments, not LPS. No fragment contains the phosphate esters on lipid A, the acyl-chain ester linkages, or the glycosidic bonds that dominate real LPS. Phosphoric acid is a poor stand-in for a bound phosphomonoester.</w:t>
+        <w:t>Dense mode list. With 354 modes the position test cannot separate a real agreement from chance (Section 7).</w:t>
       </w:r>
     </w:p>
     <w:p>
@@ -3648,28 +4321,7 @@
         <w:pStyle w:val="ListBullet"/>
       </w:pPr>
       <w:r>
-        <w:t>Dense mode list. With about 10 modes per 100 cm-1 a position match is not informative (Section 7).</w:t>
-      </w:r>
-    </w:p>
-    <w:p>
-      <w:pPr>
-        <w:pStyle w:val="ListBullet"/>
-      </w:pPr>
-      <w:r>
-        <w:t>Different spectra compared. The previously published fragment calculations were done against an older LPS measurement (60 s, 20 %, 30 acc); this document uses the library reference (60 %, 40 s, 5 acc).</w:t>
-      </w:r>
-    </w:p>
-    <w:p>
-      <w:pPr>
-        <w:pStyle w:val="ListBullet"/>
-      </w:pPr>
-      <w:r>
-        <w:t>Solid-state effects and harmonic error apply as for NAM. The fragments were calculated at B3LYP/6-31G(d), a smaller basis set than the 6-311++G(d,p) used for NAM.</w:t>
-      </w:r>
-    </w:p>
-    <w:p>
-      <w:r>
-        <w:br w:type="page"/>
+        <w:t>Different experimental reference from the older fragment work, as described in the earlier version of this document: the fragment results were first compared with an older LPS measurement; both models here use the library reference (60 %, 40 s, 5 acc).</w:t>
       </w:r>
     </w:p>
     <w:p>
@@ -3743,7 +4395,7 @@
           <w:i/>
           <w:sz w:val="17"/>
         </w:rPr>
-        <w:t>Figure 3. LTA. Top: library preliminary reference (4 spectra). Bottom: broadened DFT curves of the three fragments (scaled by 0.96) and their equal-weight average. Sticks mark the peaks found in the curves.</w:t>
+        <w:t>Figure 5. LTA. Top: library preliminary reference (4 spectra). Bottom: broadened DFT curves of the three fragments (scaled by 0.96) and their equal-weight average. Sticks mark the peaks found in the curves.</w:t>
       </w:r>
     </w:p>
     <w:p>
@@ -4453,7 +5105,7 @@
           <w:b w:val="0"/>
           <w:i w:val="0"/>
         </w:rPr>
-        <w:t>Any list of calculated modes will land close to some experimental bands. The question is whether the real DFT list does better than the same list moved by a meaningless amount. Figure 4 shows that it does not, for any of the three molecules.</w:t>
+        <w:t>Any list of calculated modes will land close to some experimental bands. The question is whether the real DFT list does better than the same list moved by a meaningless amount. Figure 6 and the table below show that it does not, for any of the three molecules, and the same holds for the LPS whole-molecule model.</w:t>
       </w:r>
     </w:p>
     <w:p>
@@ -4502,7 +5154,7 @@
           <w:i/>
           <w:sz w:val="17"/>
         </w:rPr>
-        <w:t>Figure 4. Grey: number of experimental bands within 10 cm-1 of a calculated mode after random shifts of the modes. Coloured line: real DFT.</w:t>
+        <w:t>Figure 6. Grey: number of experimental bands within 10 cm-1 of a calculated mode after random shifts of the modes. Coloured line: real DFT. LPS is the five-fragment calculation; the whole-molecule model is in the table below.</w:t>
       </w:r>
     </w:p>
     <w:tbl>
@@ -4881,12 +5533,8 @@
             <w:tcW w:type="dxa" w:w="1020"/>
           </w:tcPr>
           <w:p>
-            <w:r/>
-            <w:r>
-              <w:rPr>
-                <w:sz w:val="17"/>
-              </w:rPr>
-              <w:t>LPS</w:t>
+            <w:r>
+              <w:t>LPS (5 fragments)</w:t>
             </w:r>
           </w:p>
         </w:tc>
@@ -4967,12 +5615,8 @@
             <w:tcW w:type="dxa" w:w="1020"/>
           </w:tcPr>
           <w:p>
-            <w:r/>
-            <w:r>
-              <w:rPr>
-                <w:sz w:val="17"/>
-              </w:rPr>
-              <w:t>LPS</w:t>
+            <w:r>
+              <w:t>LPS (5 fragments)</w:t>
             </w:r>
           </w:p>
         </w:tc>
@@ -5053,12 +5697,90 @@
             <w:tcW w:type="dxa" w:w="1020"/>
           </w:tcPr>
           <w:p>
+            <w:r>
+              <w:t>LPS (5 fragments)</w:t>
+            </w:r>
+          </w:p>
+        </w:tc>
+        <w:tc>
+          <w:tcPr>
+            <w:tcW w:type="dxa" w:w="1134"/>
+          </w:tcPr>
+          <w:p>
             <w:r/>
             <w:r>
               <w:rPr>
                 <w:sz w:val="17"/>
               </w:rPr>
-              <w:t>LPS</w:t>
+              <w:t>18</w:t>
+            </w:r>
+          </w:p>
+        </w:tc>
+        <w:tc>
+          <w:tcPr>
+            <w:tcW w:type="dxa" w:w="1417"/>
+          </w:tcPr>
+          <w:p>
+            <w:r/>
+            <w:r>
+              <w:rPr>
+                <w:sz w:val="17"/>
+              </w:rPr>
+              <w:t>5 of 5</w:t>
+            </w:r>
+          </w:p>
+        </w:tc>
+        <w:tc>
+          <w:tcPr>
+            <w:tcW w:type="dxa" w:w="2041"/>
+          </w:tcPr>
+          <w:p>
+            <w:r/>
+            <w:r>
+              <w:rPr>
+                <w:sz w:val="17"/>
+              </w:rPr>
+              <w:t>4.6 +/- 0.6</w:t>
+            </w:r>
+          </w:p>
+        </w:tc>
+        <w:tc>
+          <w:tcPr>
+            <w:tcW w:type="dxa" w:w="1701"/>
+          </w:tcPr>
+          <w:p>
+            <w:r/>
+            <w:r>
+              <w:rPr>
+                <w:sz w:val="17"/>
+              </w:rPr>
+              <w:t>0.67</w:t>
+            </w:r>
+          </w:p>
+        </w:tc>
+        <w:tc>
+          <w:tcPr>
+            <w:tcW w:type="dxa" w:w="2891"/>
+          </w:tcPr>
+          <w:p>
+            <w:r/>
+            <w:r>
+              <w:rPr>
+                <w:sz w:val="17"/>
+              </w:rPr>
+              <w:t>4 of 5 (chance 2.9, p = 0.38)</w:t>
+            </w:r>
+          </w:p>
+        </w:tc>
+      </w:tr>
+      <w:tr>
+        <w:tc>
+          <w:tcPr>
+            <w:tcW w:type="dxa" w:w="1020"/>
+          </w:tcPr>
+          <w:p>
+            <w:r>
+              <w:t>LPS (whole model)</w:t>
             </w:r>
           </w:p>
         </w:tc>
@@ -5067,11 +5789,131 @@
             <w:tcW w:type="dxa" w:w="1134"/>
           </w:tcPr>
           <w:p>
-            <w:r/>
-            <w:r>
-              <w:rPr>
-                <w:sz w:val="17"/>
-              </w:rPr>
+            <w:r>
+              <w:t>5</w:t>
+            </w:r>
+          </w:p>
+        </w:tc>
+        <w:tc>
+          <w:tcPr>
+            <w:tcW w:type="dxa" w:w="1417"/>
+          </w:tcPr>
+          <w:p>
+            <w:r>
+              <w:t>5 of 5</w:t>
+            </w:r>
+          </w:p>
+        </w:tc>
+        <w:tc>
+          <w:tcPr>
+            <w:tcW w:type="dxa" w:w="2041"/>
+          </w:tcPr>
+          <w:p>
+            <w:r>
+              <w:t>4.4 +/- 0.6</w:t>
+            </w:r>
+          </w:p>
+        </w:tc>
+        <w:tc>
+          <w:tcPr>
+            <w:tcW w:type="dxa" w:w="1701"/>
+          </w:tcPr>
+          <w:p>
+            <w:r>
+              <w:t>0.47</w:t>
+            </w:r>
+          </w:p>
+        </w:tc>
+        <w:tc>
+          <w:tcPr>
+            <w:tcW w:type="dxa" w:w="2891"/>
+          </w:tcPr>
+          <w:p>
+            <w:r>
+              <w:t>4 of 5 (chance 3.6, p = 0.61)</w:t>
+            </w:r>
+          </w:p>
+        </w:tc>
+      </w:tr>
+      <w:tr>
+        <w:tc>
+          <w:tcPr>
+            <w:tcW w:type="dxa" w:w="1020"/>
+          </w:tcPr>
+          <w:p>
+            <w:r>
+              <w:t>LPS (whole model)</w:t>
+            </w:r>
+          </w:p>
+        </w:tc>
+        <w:tc>
+          <w:tcPr>
+            <w:tcW w:type="dxa" w:w="1134"/>
+          </w:tcPr>
+          <w:p>
+            <w:r>
+              <w:t>10</w:t>
+            </w:r>
+          </w:p>
+        </w:tc>
+        <w:tc>
+          <w:tcPr>
+            <w:tcW w:type="dxa" w:w="1417"/>
+          </w:tcPr>
+          <w:p>
+            <w:r>
+              <w:t>5 of 5</w:t>
+            </w:r>
+          </w:p>
+        </w:tc>
+        <w:tc>
+          <w:tcPr>
+            <w:tcW w:type="dxa" w:w="2041"/>
+          </w:tcPr>
+          <w:p>
+            <w:r>
+              <w:t>4.6 +/- 0.5</w:t>
+            </w:r>
+          </w:p>
+        </w:tc>
+        <w:tc>
+          <w:tcPr>
+            <w:tcW w:type="dxa" w:w="1701"/>
+          </w:tcPr>
+          <w:p>
+            <w:r>
+              <w:t>0.57</w:t>
+            </w:r>
+          </w:p>
+        </w:tc>
+        <w:tc>
+          <w:tcPr>
+            <w:tcW w:type="dxa" w:w="2891"/>
+          </w:tcPr>
+          <w:p>
+            <w:r>
+              <w:t>5 of 5 (chance 4.3, p = 0.30)</w:t>
+            </w:r>
+          </w:p>
+        </w:tc>
+      </w:tr>
+      <w:tr>
+        <w:tc>
+          <w:tcPr>
+            <w:tcW w:type="dxa" w:w="1020"/>
+          </w:tcPr>
+          <w:p>
+            <w:r>
+              <w:t>LPS (whole model)</w:t>
+            </w:r>
+          </w:p>
+        </w:tc>
+        <w:tc>
+          <w:tcPr>
+            <w:tcW w:type="dxa" w:w="1134"/>
+          </w:tcPr>
+          <w:p>
+            <w:r>
               <w:t>18</w:t>
             </w:r>
           </w:p>
@@ -5081,11 +5923,7 @@
             <w:tcW w:type="dxa" w:w="1417"/>
           </w:tcPr>
           <w:p>
-            <w:r/>
-            <w:r>
-              <w:rPr>
-                <w:sz w:val="17"/>
-              </w:rPr>
+            <w:r>
               <w:t>5 of 5</w:t>
             </w:r>
           </w:p>
@@ -5095,12 +5933,8 @@
             <w:tcW w:type="dxa" w:w="2041"/>
           </w:tcPr>
           <w:p>
-            <w:r/>
-            <w:r>
-              <w:rPr>
-                <w:sz w:val="17"/>
-              </w:rPr>
-              <w:t>4.6 +/- 0.6</w:t>
+            <w:r>
+              <w:t>4.7 +/- 0.5</w:t>
             </w:r>
           </w:p>
         </w:tc>
@@ -5109,12 +5943,8 @@
             <w:tcW w:type="dxa" w:w="1701"/>
           </w:tcPr>
           <w:p>
-            <w:r/>
-            <w:r>
-              <w:rPr>
-                <w:sz w:val="17"/>
-              </w:rPr>
-              <w:t>0.67</w:t>
+            <w:r>
+              <w:t>0.66</w:t>
             </w:r>
           </w:p>
         </w:tc>
@@ -5123,12 +5953,8 @@
             <w:tcW w:type="dxa" w:w="2891"/>
           </w:tcPr>
           <w:p>
-            <w:r/>
-            <w:r>
-              <w:rPr>
-                <w:sz w:val="17"/>
-              </w:rPr>
-              <w:t>4 of 5 (chance 2.9, p = 0.38)</w:t>
+            <w:r>
+              <w:t>5 of 5 (chance 4.5, p = 0.49)</w:t>
             </w:r>
           </w:p>
         </w:tc>
@@ -5448,7 +6274,7 @@
           <w:i/>
           <w:sz w:val="17"/>
         </w:rPr>
-        <w:t>Figure 5. Difference between every library band and its nearest DFT mode. Points outside the green band (10 cm-1) are bands the calculation does not explain.</w:t>
+        <w:t>Figure 7. Difference between every library band and its nearest DFT mode. Points outside the green band (10 cm-1) are bands the calculation does not explain.</w:t>
       </w:r>
     </w:p>
     <w:p>
@@ -5571,12 +6397,8 @@
             <w:tcW w:type="dxa" w:w="2608"/>
           </w:tcPr>
           <w:p>
-            <w:r/>
-            <w:r>
-              <w:rPr>
-                <w:sz w:val="17"/>
-              </w:rPr>
-              <w:t>Yes within 5 cm-1 for 4 of 5, but with weak calculated activity</w:t>
+            <w:r>
+              <w:t>Yes: all 5 within 2.4 cm-1 (whole-molecule model); fragments: 4 of 5 within 5 cm-1, weak calculated activity</w:t>
             </w:r>
           </w:p>
         </w:tc>
@@ -5629,12 +6451,8 @@
             <w:tcW w:type="dxa" w:w="2608"/>
           </w:tcPr>
           <w:p>
-            <w:r/>
-            <w:r>
-              <w:rPr>
-                <w:sz w:val="17"/>
-              </w:rPr>
-              <w:t>No (p = 0.68)</w:t>
+            <w:r>
+              <w:t>No (p = 0.57 whole model; p = 0.68 fragments)</w:t>
             </w:r>
           </w:p>
         </w:tc>
@@ -5687,12 +6505,8 @@
             <w:tcW w:type="dxa" w:w="2608"/>
           </w:tcPr>
           <w:p>
-            <w:r/>
-            <w:r>
-              <w:rPr>
-                <w:sz w:val="17"/>
-              </w:rPr>
-              <w:t>No (r = 0.14; fitted 0.40)</w:t>
+            <w:r>
+              <w:t>No (whole model r = -0.01; fragments 0.14, fitted 0.40)</w:t>
             </w:r>
           </w:p>
         </w:tc>
@@ -5745,12 +6559,8 @@
             <w:tcW w:type="dxa" w:w="2608"/>
           </w:tcPr>
           <w:p>
-            <w:r/>
-            <w:r>
-              <w:rPr>
-                <w:sz w:val="17"/>
-              </w:rPr>
-              <w:t>No: 425 not explained</w:t>
+            <w:r>
+              <w:t>Partly: the model has modes of moderate strength at 422 and 862 for the 425 and 861 bands, but its strongest mode (1516) is weak in the experiment; 425 is not assigned to a group</w:t>
             </w:r>
           </w:p>
         </w:tc>
@@ -5803,12 +6613,8 @@
             <w:tcW w:type="dxa" w:w="2608"/>
           </w:tcPr>
           <w:p>
-            <w:r/>
-            <w:r>
-              <w:rPr>
-                <w:sz w:val="17"/>
-              </w:rPr>
-              <w:t>Position consistency only; no assignment gained</w:t>
+            <w:r>
+              <w:t>Position consistency with sugar, phosphate and amide modes of lipid A; no firm assignment gained; 425 cm-1 stays unassigned</w:t>
             </w:r>
           </w:p>
         </w:tc>
@@ -5861,12 +6667,8 @@
             <w:tcW w:type="dxa" w:w="2608"/>
           </w:tcPr>
           <w:p>
-            <w:r/>
-            <w:r>
-              <w:rPr>
-                <w:sz w:val="17"/>
-              </w:rPr>
-              <w:t>WEAK, not demonstrated</w:t>
+            <w:r>
+              <w:t>POSITIONS AGREE, not above chance; shape not matched; not demonstrated</w:t>
             </w:r>
           </w:p>
         </w:tc>
@@ -5932,7 +6734,7 @@
         <w:pStyle w:val="ListBullet"/>
       </w:pPr>
       <w:r>
-        <w:t>LPS: use larger models that contain the real linkages (lipid A disaccharide with phosphates and acyl chains, a KDO-glucosamine linked unit) and record the basis set and phosphate protonation state.</w:t>
+        <w:t>LPS: the shortened Kdo2-lipid A is a first whole-molecule result. Next steps: rerun at B3LYP/6-31G(d) or B3LYP/6-31+G(d,p) with water (planned, days of run time), starting from the optimised geometry; keep longer acyl chains and add the core sugars beyond Kdo; add Na+ or Ca2+ counter-ions; look at which atoms move in the 422 and 862 cm-1 modes; and check the 1516 cm-1 mode against a larger basis set.</w:t>
       </w:r>
     </w:p>
     <w:p>
@@ -6221,6 +7023,50 @@
           </w:p>
         </w:tc>
       </w:tr>
+      <w:tr>
+        <w:tc>
+          <w:tcPr>
+            <w:tcW w:type="dxa" w:w="3402"/>
+          </w:tcPr>
+          <w:p>
+            <w:r>
+              <w:t>LPS whole-molecule model (lipid A, 354 modes in range)</w:t>
+            </w:r>
+          </w:p>
+        </w:tc>
+        <w:tc>
+          <w:tcPr>
+            <w:tcW w:type="dxa" w:w="6803"/>
+          </w:tcPr>
+          <w:p>
+            <w:r>
+              <w:t>SERS_Sepsis_Spectral_Library\08_Methodology\simulation\LPS_LipidA_Model_20261028 (copy of C:\Users\sukes\Downloads\sukesh\lps output simulation): lipidA_raman_act.csv, lipidA_short.gjf, lipidA_short.out (Gaussian log), Lipid_A_Raman_Methods.md</w:t>
+            </w:r>
+          </w:p>
+        </w:tc>
+      </w:tr>
+      <w:tr>
+        <w:tc>
+          <w:tcPr>
+            <w:tcW w:type="dxa" w:w="3402"/>
+          </w:tcPr>
+          <w:p>
+            <w:r>
+              <w:t>Whole-molecule comparison results and code</w:t>
+            </w:r>
+          </w:p>
+        </w:tc>
+        <w:tc>
+          <w:tcPr>
+            <w:tcW w:type="dxa" w:w="6803"/>
+          </w:tcPr>
+          <w:p>
+            <w:r>
+              <w:t>05_Tables\LipidA_vs_LPS_results.json; 08_Methodology\code\lipidA_compare.py, lipidA_figures.py, update_docs_lipidA.py; figures in 04_Figures\LipidA_Model_20261028</w:t>
+            </w:r>
+          </w:p>
+        </w:tc>
+      </w:tr>
     </w:tbl>
     <w:p/>
     <w:p>
@@ -6236,7 +7082,7 @@
         <w:pStyle w:val="ListBullet"/>
       </w:pPr>
       <w:r>
-        <w:t>LPS and LTA calculated modes were taken from the exported files as supplied. The Gaussian logs for the five LPS fragments and for D-alanine and GlcNAc were not found, so their charge states and atom counts are Not recorded; the levels of theory are as documented. Full simulation details are in Simulation_Methods_and_Spectra_NAM_LPS_LTA.docx.</w:t>
+        <w:t>LPS fragment and LTA calculated modes were taken from the exported files as supplied. The Gaussian logs for the five LPS fragments and for D-alanine and GlcNAc were not found, so their charge states and atom counts are Not recorded; the levels of theory are as documented. The LPS whole-molecule model has its full Gaussian log. Full simulation details are in Simulation_Methods_and_Spectra_NAM_LPS_LTA.docx.</w:t>
       </w:r>
     </w:p>
     <w:p>
@@ -6253,6 +7099,22 @@
       </w:pPr>
       <w:r>
         <w:t>Only primary and supporting library bands were tested (NAM 11, LPS 5, LTA 4). Small numbers limit the statistics; the chance test is a baseline, not a formal proof.</w:t>
+      </w:r>
+    </w:p>
+    <w:p>
+      <w:pPr>
+        <w:pStyle w:val="ListBullet"/>
+      </w:pPr>
+      <w:r>
+        <w:t>The LPS whole-molecule model is a shortened piece of lipid A at a low level (B3LYP/3-21G, gas phase). Its strong 1516 cm-1 mode is not verified, and the motions behind the 422 and 862 cm-1 modes were not analysed.</w:t>
+      </w:r>
+    </w:p>
+    <w:p>
+      <w:pPr>
+        <w:pStyle w:val="ListBullet"/>
+      </w:pPr>
+      <w:r>
+        <w:t>The LTA comparison in Section 6 still uses the preliminary April 2026 LTA reference (4 spectra). The new LTA reference of 28 Oct 2026 (17 spots) has not been compared with the LTA fragment calculations.</w:t>
       </w:r>
     </w:p>
     <w:p>

</xml_diff>

<commit_message>
LTA: add whole-molecule LTA model; redo LTA comparison against reference v2.1; rewrite DFT comparison (v1.3) and simulation methods (v1.2)
Co-Authored-By: Claude Sonnet 5.5 <noreply@anthropic.com>
</commit_message>
<xml_diff>
--- a/SERS_Sepsis_Spectral_Library/09_Reports/DFT_vs_Experimental_Comparison_NAM_LPS_LTA.docx
+++ b/SERS_Sepsis_Spectral_Library/09_Reports/DFT_vs_Experimental_Comparison_NAM_LPS_LTA.docx
@@ -29,7 +29,7 @@
           <w:i w:val="0"/>
           <w:sz w:val="18"/>
         </w:rPr>
-        <w:t>SERS Sepsis project, bulk-powder Raman spectral library. Version 1.2, 28 October 2026. Experimental data: library v3.3 reference spectra (glass slide, 785 nm). Simulation data: DFT files held in C:\Users\sukes\Downloads\mtp (listed in Section 9); LPS whole-molecule model: SERS_Sepsis_Spectral_Library/08_Methodology/simulation/LPS_LipidA_Model_20261028 (Gaussian 16W, 27-28 Oct 2026).</w:t>
+        <w:t>SERS Sepsis project, bulk-powder Raman spectral library. Version 1.3, 28 October 2026. Experimental data: library v3.3 reference spectra (glass slide, 785 nm). Simulation data: DFT files held in C:\Users\sukes\Downloads\mtp (listed in Section 9); LPS whole-molecule model: SERS_Sepsis_Spectral_Library/08_Methodology/simulation/LPS_LipidA_Model_20261028 (Gaussian 16W, 27-28 Oct 2026); LTA whole-molecule model: SERS_Sepsis_Spectral_Library/08_Methodology/simulation/LTA_Model_20261028 (Gaussian 16W, 28 Oct 2026). LTA experimental reference: pooled v2.1 (n = 17) of 28 Oct 2026.</w:t>
       </w:r>
     </w:p>
     <w:p>
@@ -39,7 +39,7 @@
           <w:i w:val="0"/>
           <w:sz w:val="20"/>
         </w:rPr>
-        <w:t>The simulations reproduce the position of many individual bands, and the agreement is best for NAM, the only small molecule calculated as a whole. LPS now has two calculations: five separate fragments, and a whole-molecule model of Kdo2-lipid A with shortened acyl chains (201 atoms). The whole-molecule model puts all five library LPS bands within 2.4 cm-1 of a calculated mode (mean difference 1.2 cm-1, against 3.5 cm-1 for the fragments), and it has a strong calculated mode at 422 and 862 cm-1 where the fragments had very weak ones. The position agreement is, however, still no better than random chance, because the model has 354 modes between 400 and 1800 cm-1 and almost any band has a mode close to it. The overall spectral shapes do not match (correlation 0.1 or less for all three molecules; -0.01 for the lipid A model). The DFT results can support tentative assignments of individual bands, but they cannot be used to confirm identity, and several of the strongest experimental bands remain unexplained: NAM 829 and 955 cm-1, the assignment of LPS 425 cm-1, and LTA 802 cm-1.</w:t>
+        <w:t>The simulations reproduce the position of many individual bands, and the agreement is best for NAM, the only small molecule calculated as a whole. LPS and LTA each now have two calculations: separate fragments, and a whole-molecule model (shortened Kdo2-lipid A, 201 atoms; three glycerol-phosphate units with two D-alanine esters and one alpha-GlcNAc, 93 atoms). For LPS the model puts all five library bands within 2.4 cm-1 of a calculated mode, but this is no better than chance. For LTA the model puts all nine primary and supporting bands of the new pooled reference (v2.1, 17 spots) within 4.5 cm-1 of a calculated mode (mean difference 2.5 cm-1, against 15.8 cm-1 for the three fragments) and, at the strict 5 cm-1 tolerance, this is above chance (9 of 9 against 6.1 +/- 1.0 expected, p &lt; 0.001); at 10 and 18 cm-1 it is not (p = 0.07 and 0.19). The LTA modes that sit on the library bands are weak (relative activity 0.01 to 0.15), the strongest calculated modes (690, 654 and 1490-1510 cm-1) have no counterpart in the measured spectrum, and the whole-spectrum correlation is zero (-0.01). The overall spectral shapes do not match for any molecule (correlation 0.15 or less). The DFT results can support tentative assignments of individual bands, but they cannot be used to confirm identity, and several strong experimental bands remain unexplained: NAM 829 and 955 cm-1, the assignment of LPS 425 cm-1, and for LTA the strong 1092 and 1010 cm-1 bands, which match only very weak modes.</w:t>
       </w:r>
     </w:p>
     <w:p/>
@@ -425,12 +425,8 @@
             <w:tcW w:type="dxa" w:w="737"/>
           </w:tcPr>
           <w:p>
-            <w:r/>
-            <w:r>
-              <w:rPr>
-                <w:sz w:val="16"/>
-              </w:rPr>
-              <w:t>LTA</w:t>
+            <w:r>
+              <w:t>LTA (3 fragments)</w:t>
             </w:r>
           </w:p>
         </w:tc>
@@ -439,11 +435,7 @@
             <w:tcW w:type="dxa" w:w="2211"/>
           </w:tcPr>
           <w:p>
-            <w:r/>
-            <w:r>
-              <w:rPr>
-                <w:sz w:val="16"/>
-              </w:rPr>
+            <w:r>
               <w:t>Three separate fragments, not whole LTA</w:t>
             </w:r>
           </w:p>
@@ -453,12 +445,8 @@
             <w:tcW w:type="dxa" w:w="737"/>
           </w:tcPr>
           <w:p>
-            <w:r/>
-            <w:r>
-              <w:rPr>
-                <w:sz w:val="16"/>
-              </w:rPr>
-              <w:t>4</w:t>
+            <w:r>
+              <w:t>9</w:t>
             </w:r>
           </w:p>
         </w:tc>
@@ -467,12 +455,8 @@
             <w:tcW w:type="dxa" w:w="1417"/>
           </w:tcPr>
           <w:p>
-            <w:r/>
-            <w:r>
-              <w:rPr>
-                <w:sz w:val="16"/>
-              </w:rPr>
-              <w:t>1 / 2 / 3</w:t>
+            <w:r>
+              <w:t>3 / 5 / 7</w:t>
             </w:r>
           </w:p>
         </w:tc>
@@ -481,12 +465,8 @@
             <w:tcW w:type="dxa" w:w="907"/>
           </w:tcPr>
           <w:p>
-            <w:r/>
-            <w:r>
-              <w:rPr>
-                <w:sz w:val="16"/>
-              </w:rPr>
-              <w:t>14.5</w:t>
+            <w:r>
+              <w:t>15.8</w:t>
             </w:r>
           </w:p>
         </w:tc>
@@ -495,12 +475,8 @@
             <w:tcW w:type="dxa" w:w="1587"/>
           </w:tcPr>
           <w:p>
-            <w:r/>
-            <w:r>
-              <w:rPr>
-                <w:sz w:val="16"/>
-              </w:rPr>
-              <w:t>2.1 (p = 0.71)</w:t>
+            <w:r>
+              <w:t>4.3 (p = 0.40)</w:t>
             </w:r>
           </w:p>
         </w:tc>
@@ -509,12 +485,8 @@
             <w:tcW w:type="dxa" w:w="907"/>
           </w:tcPr>
           <w:p>
-            <w:r/>
-            <w:r>
-              <w:rPr>
-                <w:sz w:val="16"/>
-              </w:rPr>
-              <w:t>0.11</w:t>
+            <w:r>
+              <w:t>0.09</w:t>
             </w:r>
           </w:p>
         </w:tc>
@@ -524,11 +496,7 @@
             <w:shd w:val="clear" w:color="auto" w:fill="FDECEA"/>
           </w:tcPr>
           <w:p>
-            <w:r/>
-            <w:r>
-              <w:rPr>
-                <w:sz w:val="16"/>
-              </w:rPr>
+            <w:r>
               <w:t>Weak</w:t>
             </w:r>
           </w:p>
@@ -613,6 +581,89 @@
           <w:p>
             <w:r>
               <w:t>Positions agree; not above chance; shape no</w:t>
+            </w:r>
+          </w:p>
+        </w:tc>
+      </w:tr>
+      <w:tr>
+        <w:tc>
+          <w:tcPr>
+            <w:tcW w:type="dxa" w:w="737"/>
+          </w:tcPr>
+          <w:p>
+            <w:r>
+              <w:t>LTA (whole-molecule model)</w:t>
+            </w:r>
+          </w:p>
+        </w:tc>
+        <w:tc>
+          <w:tcPr>
+            <w:tcW w:type="dxa" w:w="2211"/>
+          </w:tcPr>
+          <w:p>
+            <w:r>
+              <w:t>3 glycerol-phosphates, 2 D-Ala esters, 1 alpha-GlcNAc; 93 atoms, net charge 0, B3LYP/3-21G, gas phase</w:t>
+            </w:r>
+          </w:p>
+        </w:tc>
+        <w:tc>
+          <w:tcPr>
+            <w:tcW w:type="dxa" w:w="737"/>
+          </w:tcPr>
+          <w:p>
+            <w:r>
+              <w:t>9</w:t>
+            </w:r>
+          </w:p>
+        </w:tc>
+        <w:tc>
+          <w:tcPr>
+            <w:tcW w:type="dxa" w:w="1417"/>
+          </w:tcPr>
+          <w:p>
+            <w:r>
+              <w:t>9 / 9 / 9</w:t>
+            </w:r>
+          </w:p>
+        </w:tc>
+        <w:tc>
+          <w:tcPr>
+            <w:tcW w:type="dxa" w:w="907"/>
+          </w:tcPr>
+          <w:p>
+            <w:r>
+              <w:t>2.5</w:t>
+            </w:r>
+          </w:p>
+        </w:tc>
+        <w:tc>
+          <w:tcPr>
+            <w:tcW w:type="dxa" w:w="1587"/>
+          </w:tcPr>
+          <w:p>
+            <w:r>
+              <w:t>7.5 (p = 0.07)</w:t>
+            </w:r>
+          </w:p>
+        </w:tc>
+        <w:tc>
+          <w:tcPr>
+            <w:tcW w:type="dxa" w:w="907"/>
+          </w:tcPr>
+          <w:p>
+            <w:r>
+              <w:t>-0.01</w:t>
+            </w:r>
+          </w:p>
+        </w:tc>
+        <w:tc>
+          <w:tcPr>
+            <w:tcW w:type="dxa" w:w="1134"/>
+            <w:shd w:val="clear" w:color="auto" w:fill="FDECEA"/>
+          </w:tcPr>
+          <w:p>
+            <w:r>
+              <w:t>Positions agree, above chance at 5 cm-1 only; matched modes weak; shape no</w:t>
             </w:r>
           </w:p>
         </w:tc>
@@ -626,7 +677,7 @@
           <w:i w:val="0"/>
           <w:sz w:val="18"/>
         </w:rPr>
-        <w:t>The bands tested are the primary and supporting bands of the library reference that lie outside the glass zone. A band counts as matched when the nearest calculated mode is within the stated distance. The chance column gives the number of matches expected if the calculated modes were shifted by a random amount; a real agreement should clearly exceed it, and for none of the three molecules does it. The whole-spectrum r compares the shape of the simulated spectrum with the experimental reference over 400-1800 cm-1, leaving out the glass zone (1308-1455 cm-1).</w:t>
+        <w:t>The bands tested are the primary and supporting bands of the library reference that lie outside the glass zone. A band counts as matched when the nearest calculated mode is within the stated distance. The chance column gives the number of matches expected if the calculated modes were shifted by a random amount; a real agreement should clearly exceed it, and only the LTA whole-molecule model does, and only at the 5 cm-1 tolerance. The whole-spectrum r compares the shape of the simulated spectrum with the experimental reference over 400-1800 cm-1, leaving out the glass zone (1308-1455 cm-1).</w:t>
       </w:r>
     </w:p>
     <w:p>
@@ -768,12 +819,8 @@
             <w:tcW w:type="dxa" w:w="3005"/>
           </w:tcPr>
           <w:p>
-            <w:r/>
-            <w:r>
-              <w:rPr>
-                <w:sz w:val="17"/>
-              </w:rPr>
-              <w:t>Three fragments: glycerol-phosphate (two units, charge -2), D-alanine, N-acetyl-D-glucosamine</w:t>
+            <w:r>
+              <w:t>Three fragments: glycerol-phosphate (two units, charge -2), D-alanine, N-acetyl-D-glucosamine Also: whole-molecule model (built, no PubChem entry): three glycerol-phosphate units joined by two phosphodiesters, D-alanine ester on each outer glycerol, alpha-GlcNAc on the central glycerol; C23H45N3O20P2, 93 atoms, net charge 0 (two phosphate anions, two ammonium groups).</w:t>
             </w:r>
           </w:p>
         </w:tc>
@@ -822,12 +869,8 @@
             <w:tcW w:type="dxa" w:w="3005"/>
           </w:tcPr>
           <w:p>
-            <w:r/>
-            <w:r>
-              <w:rPr>
-                <w:sz w:val="17"/>
-              </w:rPr>
-              <w:t>LTA is a polymer with variable substitution</w:t>
+            <w:r>
+              <w:t>LTA is a polymer with variable substitution. For the whole-molecule model the chain was kept to three units and the glycolipid anchor left out so that the molecule stays computable; about 23 repeats are present in the real polymer.</w:t>
             </w:r>
           </w:p>
         </w:tc>
@@ -876,12 +919,8 @@
             <w:tcW w:type="dxa" w:w="3005"/>
           </w:tcPr>
           <w:p>
-            <w:r/>
-            <w:r>
-              <w:rPr>
-                <w:sz w:val="17"/>
-              </w:rPr>
-              <w:t>Gaussian 16, B3LYP/6-31G(d), SMD water, opt + freq=raman</w:t>
+            <w:r>
+              <w:t>Gaussian 16, B3LYP/6-31G(d), SMD water, opt + freq=raman Whole-molecule model: Gaussian 16W Rev C.01, PM6 pre-optimisation then B3LYP/3-21G opt freq=raman; 75 optimisation steps; 273 modes, no imaginary frequency (lowest 31 cm-1).</w:t>
             </w:r>
           </w:p>
         </w:tc>
@@ -930,12 +969,8 @@
             <w:tcW w:type="dxa" w:w="3005"/>
           </w:tcPr>
           <w:p>
-            <w:r/>
-            <w:r>
-              <w:rPr>
-                <w:sz w:val="17"/>
-              </w:rPr>
-              <w:t>Implicit water (SMD)</w:t>
+            <w:r>
+              <w:t>Implicit water (SMD); whole-molecule model: gas phase, no counter-ions, no water</w:t>
             </w:r>
           </w:p>
         </w:tc>
@@ -984,12 +1019,8 @@
             <w:tcW w:type="dxa" w:w="3005"/>
           </w:tcPr>
           <w:p>
-            <w:r/>
-            <w:r>
-              <w:rPr>
-                <w:sz w:val="17"/>
-              </w:rPr>
-              <w:t>0.96 (0.96-0.97 range evaluated)</w:t>
+            <w:r>
+              <w:t>0.96 (0.96-0.97 range evaluated); whole-molecule model 0.965 (typical B3LYP value, not fitted for 3-21G)</w:t>
             </w:r>
           </w:p>
         </w:tc>
@@ -1038,12 +1069,8 @@
             <w:tcW w:type="dxa" w:w="3005"/>
           </w:tcPr>
           <w:p>
-            <w:r/>
-            <w:r>
-              <w:rPr>
-                <w:sz w:val="17"/>
-              </w:rPr>
-              <w:t>47 (peaks picked from broadened curves)</w:t>
+            <w:r>
+              <w:t>47 (peaks picked from broadened curves); whole-molecule model 165</w:t>
             </w:r>
           </w:p>
         </w:tc>
@@ -1092,12 +1119,8 @@
             <w:tcW w:type="dxa" w:w="3005"/>
           </w:tcPr>
           <w:p>
-            <w:r/>
-            <w:r>
-              <w:rPr>
-                <w:sz w:val="17"/>
-              </w:rPr>
-              <w:t>3.4</w:t>
+            <w:r>
+              <w:t>3.4; whole-molecule model 11.8</w:t>
             </w:r>
           </w:p>
         </w:tc>
@@ -1150,12 +1173,8 @@
             <w:tcW w:type="dxa" w:w="3005"/>
           </w:tcPr>
           <w:p>
-            <w:r/>
-            <w:r>
-              <w:rPr>
-                <w:sz w:val="17"/>
-              </w:rPr>
-              <w:t>LTA, 3 Apr 2026 (supplier Not recorded)</w:t>
+            <w:r>
+              <w:t>Sigma L2515-10MG, S. aureus LTA, lot 0000419622; library reference v2.1 (pooled n = 17, 28 Oct 2026). The earlier fragment comparison used the preliminary April 2026 reference (n = 4).</w:t>
             </w:r>
           </w:p>
         </w:tc>
@@ -1168,7 +1187,7 @@
           <w:b w:val="0"/>
           <w:i w:val="0"/>
         </w:rPr>
-        <w:t>A calculation on a single small fragment cannot reproduce a polymer. LPS has phosphorylated, acylated and branched sugars; LTA has a charged phosphodiester backbone. The five LPS fragments and the three LTA fragments contain none of the linkages between units, so bands that come from those linkages cannot appear in them. The whole-molecule LPS model does contain the glycosidic bond between the two glucosamines, the Kdo links, both phosphate esters and both amide links of the lipid A backbone, but not the long acyl chains, the outer core sugars or the O-antigen, so it is still a part of LPS and not the whole.</w:t>
+        <w:t>A calculation on a single small fragment cannot reproduce a polymer. LPS has phosphorylated, acylated and branched sugars; LTA has a charged phosphodiester backbone. The five LPS fragments and the three LTA fragments contain none of the linkages between units, so bands that come from those linkages cannot appear in them. The whole-molecule LPS model does contain the glycosidic bond between the two glucosamines, the Kdo links, both phosphate esters and both amide links of the lipid A backbone, but not the long acyl chains, the outer core sugars or the O-antigen. The whole-molecule LTA model contains two phosphodiester links, two D-alanine ester links and the glycosidic link to GlcNAc, but only three repeating units instead of about 23 and no glycolipid anchor. Both are therefore parts of the molecule and not the whole.</w:t>
       </w:r>
     </w:p>
     <w:p>
@@ -4343,10 +4362,25 @@
     <w:p>
       <w:r>
         <w:rPr>
-          <w:b w:val="0"/>
           <w:i w:val="0"/>
         </w:rPr>
-        <w:t>Of 4 library bands, 1 agrees within 5 cm-1, 2 within 10 cm-1 and 3 within 18 cm-1; the mean absolute difference is 14.5 cm-1. The chance test gives 2.1 matches at 10 cm-1 for random shifts, so the result is indistinguishable from chance. Note that the library LTA reference has only 4 spectra and is preliminary, so this comparison is itself provisional.</w:t>
+        <w:t>The LTA reference used here is the pooled v2.1 reference of 28 October 2026 (17 independent spots, clean dark, 80 % power; 10 spots at 45 s x 2 acc and 7 at 30 s x 3 acc). Nine primary and supporting bands outside the glass zone were tested (primary 539, 862 and 1092 cm-1). The whole-molecule model puts all nine within 5 cm-1 of a calculated mode (mean absolute difference 2.5 cm-1). The three fragments reach 3, 5 and 7 of nine within 5, 10 and 18 cm-1 (mean difference 15.8 cm-1).</w:t>
+      </w:r>
+    </w:p>
+    <w:p>
+      <w:r>
+        <w:rPr>
+          <w:i w:val="0"/>
+        </w:rPr>
+        <w:t>Chance test. If the model modes are shifted by a random 15 to 70 cm-1, 6.1 +/- 1.0 bands still fall within 5 cm-1 by chance; the real model gets 9 of 9 (none of 5000 random shifts did as well, p &lt; 0.001). At 10 cm-1 chance gives 7.5 +/- 0.7 and the model is not clearly better (p = 0.07); at 18 cm-1 it is not (p = 0.19). The fragments are indistinguishable from chance at all three tolerances (p = 0.46, 0.40, 0.32). The model has 165 modes in 400-1800 cm-1 (11.8 per 100 cm-1), the fragments only 47 peaks (3.4 per 100 cm-1), so the model has a much higher baseline.</w:t>
+      </w:r>
+    </w:p>
+    <w:p>
+      <w:r>
+        <w:rPr>
+          <w:i w:val="0"/>
+        </w:rPr>
+        <w:t>What the agreement does not show. The calculated modes that sit on the library bands are weak. Their relative activities are 0.01 to 0.15 on a scale where the strongest calculated mode is 1.0, so counting only strong modes (activity 0.15 or more) the model matches 2 of 9 bands within 5 cm-1 and is not above chance (p = 0.60). The whole-spectrum correlation with the reference is -0.01 for the model and 0.09 for the fragments. Fitting weights to the fragments and the model together (NNLS) gives r = 0.08, with the model taking 13 % of the weight; the fragments alone give r = 0.11.</w:t>
       </w:r>
     </w:p>
     <w:p>
@@ -4356,8 +4390,8 @@
       <w:r>
         <w:drawing>
           <wp:inline xmlns:a="http://schemas.openxmlformats.org/drawingml/2006/main" xmlns:pic="http://schemas.openxmlformats.org/drawingml/2006/picture">
-            <wp:extent cx="6480000" cy="3888000"/>
-            <wp:docPr id="3" name="Picture 3"/>
+            <wp:extent cx="6120000" cy="3672000"/>
+            <wp:docPr id="8" name="Picture 8"/>
             <wp:cNvGraphicFramePr>
               <a:graphicFrameLocks noChangeAspect="1"/>
             </wp:cNvGraphicFramePr>
@@ -4365,11 +4399,11 @@
               <a:graphicData uri="http://schemas.openxmlformats.org/drawingml/2006/picture">
                 <pic:pic>
                   <pic:nvPicPr>
-                    <pic:cNvPr id="0" name="LTA_Overlay_Exp_vs_DFT.png"/>
+                    <pic:cNvPr id="0" name="LTA_Exp_vs_Model.png"/>
                     <pic:cNvPicPr/>
                   </pic:nvPicPr>
                   <pic:blipFill>
-                    <a:blip r:embed="rId11"/>
+                    <a:blip r:embed="rId16"/>
                     <a:stretch>
                       <a:fillRect/>
                     </a:stretch>
@@ -4377,7 +4411,7 @@
                   <pic:spPr>
                     <a:xfrm>
                       <a:off x="0" y="0"/>
-                      <a:ext cx="6480000" cy="3888000"/>
+                      <a:ext cx="6120000" cy="3672000"/>
                     </a:xfrm>
                     <a:prstGeom prst="rect"/>
                   </pic:spPr>
@@ -4391,11 +4425,58 @@
     <w:p>
       <w:r>
         <w:rPr>
-          <w:b w:val="0"/>
           <w:i/>
           <w:sz w:val="17"/>
         </w:rPr>
-        <w:t>Figure 5. LTA. Top: library preliminary reference (4 spectra). Bottom: broadened DFT curves of the three fragments (scaled by 0.96) and their equal-weight average. Sticks mark the peaks found in the curves.</w:t>
+        <w:t>Figure 5. LTA. Top: library reference v2.1 (17 spots), dashed lines mark the nine primary and supporting bands (green: nearest calculated mode within 10 cm-1). Bottom: whole-molecule model, calculated modes (blue sticks, scaled 0.965) and broadened spectrum (black). The model's strongest mode, 690 cm-1, falls where the measured spectrum has a minimum.</w:t>
+      </w:r>
+    </w:p>
+    <w:p>
+      <w:pPr>
+        <w:jc w:val="center"/>
+      </w:pPr>
+      <w:r>
+        <w:drawing>
+          <wp:inline xmlns:a="http://schemas.openxmlformats.org/drawingml/2006/main" xmlns:pic="http://schemas.openxmlformats.org/drawingml/2006/picture">
+            <wp:extent cx="6120000" cy="3672000"/>
+            <wp:docPr id="9" name="Picture 9"/>
+            <wp:cNvGraphicFramePr>
+              <a:graphicFrameLocks noChangeAspect="1"/>
+            </wp:cNvGraphicFramePr>
+            <a:graphic>
+              <a:graphicData uri="http://schemas.openxmlformats.org/drawingml/2006/picture">
+                <pic:pic>
+                  <pic:nvPicPr>
+                    <pic:cNvPr id="0" name="LTA_Exp_vs_Fragments.png"/>
+                    <pic:cNvPicPr/>
+                  </pic:nvPicPr>
+                  <pic:blipFill>
+                    <a:blip r:embed="rId17"/>
+                    <a:stretch>
+                      <a:fillRect/>
+                    </a:stretch>
+                  </pic:blipFill>
+                  <pic:spPr>
+                    <a:xfrm>
+                      <a:off x="0" y="0"/>
+                      <a:ext cx="6120000" cy="3672000"/>
+                    </a:xfrm>
+                    <a:prstGeom prst="rect"/>
+                  </pic:spPr>
+                </pic:pic>
+              </a:graphicData>
+            </a:graphic>
+          </wp:inline>
+        </w:drawing>
+      </w:r>
+    </w:p>
+    <w:p>
+      <w:r>
+        <w:rPr>
+          <w:i/>
+          <w:sz w:val="17"/>
+        </w:rPr>
+        <w:t>Figure 6. LTA, fragment calculation against the same v2.1 reference: broadened DFT curves of the three fragments (scaled 0.96) and their equal-weight average.</w:t>
       </w:r>
     </w:p>
     <w:p>
@@ -4425,7 +4506,7 @@
       <w:tr>
         <w:tc>
           <w:tcPr>
-            <w:tcW w:type="dxa" w:w="737"/>
+            <w:tcW w:type="dxa" w:w="1077"/>
             <w:shd w:val="clear" w:color="auto" w:fill="D9D9D9"/>
           </w:tcPr>
           <w:p>
@@ -4433,7 +4514,7 @@
             <w:r>
               <w:rPr>
                 <w:b/>
-                <w:sz w:val="15"/>
+                <w:sz w:val="16"/>
               </w:rPr>
               <w:t>Exp. band (cm-1)</w:t>
             </w:r>
@@ -4441,7 +4522,7 @@
         </w:tc>
         <w:tc>
           <w:tcPr>
-            <w:tcW w:type="dxa" w:w="794"/>
+            <w:tcW w:type="dxa" w:w="1077"/>
             <w:shd w:val="clear" w:color="auto" w:fill="D9D9D9"/>
           </w:tcPr>
           <w:p>
@@ -4449,7 +4530,7 @@
             <w:r>
               <w:rPr>
                 <w:b/>
-                <w:sz w:val="15"/>
+                <w:sz w:val="16"/>
               </w:rPr>
               <w:t>Class</w:t>
             </w:r>
@@ -4457,7 +4538,7 @@
         </w:tc>
         <w:tc>
           <w:tcPr>
-            <w:tcW w:type="dxa" w:w="850"/>
+            <w:tcW w:type="dxa" w:w="1247"/>
             <w:shd w:val="clear" w:color="auto" w:fill="D9D9D9"/>
           </w:tcPr>
           <w:p>
@@ -4465,15 +4546,15 @@
             <w:r>
               <w:rPr>
                 <w:b/>
-                <w:sz w:val="15"/>
-              </w:rPr>
-              <w:t>Nearest DFT mode (cm-1)</w:t>
-            </w:r>
-          </w:p>
-        </w:tc>
-        <w:tc>
-          <w:tcPr>
-            <w:tcW w:type="dxa" w:w="737"/>
+                <w:sz w:val="16"/>
+              </w:rPr>
+              <w:t>Model: nearest mode</w:t>
+            </w:r>
+          </w:p>
+        </w:tc>
+        <w:tc>
+          <w:tcPr>
+            <w:tcW w:type="dxa" w:w="964"/>
             <w:shd w:val="clear" w:color="auto" w:fill="D9D9D9"/>
           </w:tcPr>
           <w:p>
@@ -4481,15 +4562,15 @@
             <w:r>
               <w:rPr>
                 <w:b/>
-                <w:sz w:val="15"/>
-              </w:rPr>
-              <w:t>Exp - calc (cm-1)</w:t>
-            </w:r>
-          </w:p>
-        </w:tc>
-        <w:tc>
-          <w:tcPr>
-            <w:tcW w:type="dxa" w:w="737"/>
+                <w:sz w:val="16"/>
+              </w:rPr>
+              <w:t>Exp - calc</w:t>
+            </w:r>
+          </w:p>
+        </w:tc>
+        <w:tc>
+          <w:tcPr>
+            <w:tcW w:type="dxa" w:w="964"/>
             <w:shd w:val="clear" w:color="auto" w:fill="D9D9D9"/>
           </w:tcPr>
           <w:p>
@@ -4497,15 +4578,15 @@
             <w:r>
               <w:rPr>
                 <w:b/>
-                <w:sz w:val="15"/>
-              </w:rPr>
-              <w:t>Calc. rel. activity</w:t>
-            </w:r>
-          </w:p>
-        </w:tc>
-        <w:tc>
-          <w:tcPr>
-            <w:tcW w:type="dxa" w:w="1587"/>
+                <w:sz w:val="16"/>
+              </w:rPr>
+              <w:t>Rel. activity</w:t>
+            </w:r>
+          </w:p>
+        </w:tc>
+        <w:tc>
+          <w:tcPr>
+            <w:tcW w:type="dxa" w:w="1361"/>
             <w:shd w:val="clear" w:color="auto" w:fill="D9D9D9"/>
           </w:tcPr>
           <w:p>
@@ -4513,15 +4594,15 @@
             <w:r>
               <w:rPr>
                 <w:b/>
-                <w:sz w:val="15"/>
-              </w:rPr>
-              <w:t>Mode type / fragment</w:t>
-            </w:r>
-          </w:p>
-        </w:tc>
-        <w:tc>
-          <w:tcPr>
-            <w:tcW w:type="dxa" w:w="850"/>
+                <w:sz w:val="16"/>
+              </w:rPr>
+              <w:t>Fragments: nearest mode</w:t>
+            </w:r>
+          </w:p>
+        </w:tc>
+        <w:tc>
+          <w:tcPr>
+            <w:tcW w:type="dxa" w:w="964"/>
             <w:shd w:val="clear" w:color="auto" w:fill="D9D9D9"/>
           </w:tcPr>
           <w:p>
@@ -4529,15 +4610,15 @@
             <w:r>
               <w:rPr>
                 <w:b/>
-                <w:sz w:val="15"/>
-              </w:rPr>
-              <w:t>Verdict</w:t>
-            </w:r>
-          </w:p>
-        </w:tc>
-        <w:tc>
-          <w:tcPr>
-            <w:tcW w:type="dxa" w:w="3912"/>
+                <w:sz w:val="16"/>
+              </w:rPr>
+              <w:t>Exp - calc</w:t>
+            </w:r>
+          </w:p>
+        </w:tc>
+        <w:tc>
+          <w:tcPr>
+            <w:tcW w:type="dxa" w:w="1304"/>
             <w:shd w:val="clear" w:color="auto" w:fill="D9D9D9"/>
           </w:tcPr>
           <w:p>
@@ -4545,9 +4626,9 @@
             <w:r>
               <w:rPr>
                 <w:b/>
-                <w:sz w:val="15"/>
-              </w:rPr>
-              <w:t>Why</w:t>
+                <w:sz w:val="16"/>
+              </w:rPr>
+              <w:t>Rel. activity (fragment)</w:t>
             </w:r>
           </w:p>
         </w:tc>
@@ -4555,114 +4636,113 @@
       <w:tr>
         <w:tc>
           <w:tcPr>
-            <w:tcW w:type="dxa" w:w="737"/>
-          </w:tcPr>
-          <w:p>
-            <w:r/>
-            <w:r>
-              <w:rPr>
-                <w:sz w:val="15"/>
-              </w:rPr>
-              <w:t>802.2</w:t>
-            </w:r>
-          </w:p>
-        </w:tc>
-        <w:tc>
-          <w:tcPr>
-            <w:tcW w:type="dxa" w:w="794"/>
-          </w:tcPr>
-          <w:p>
-            <w:r/>
-            <w:r>
-              <w:rPr>
-                <w:sz w:val="15"/>
-              </w:rPr>
-              <w:t>Primary</w:t>
-            </w:r>
-          </w:p>
-        </w:tc>
-        <w:tc>
-          <w:tcPr>
-            <w:tcW w:type="dxa" w:w="850"/>
-          </w:tcPr>
-          <w:p>
-            <w:r/>
-            <w:r>
-              <w:rPr>
-                <w:sz w:val="15"/>
-              </w:rPr>
-              <w:t>768.0</w:t>
-            </w:r>
-          </w:p>
-        </w:tc>
-        <w:tc>
-          <w:tcPr>
-            <w:tcW w:type="dxa" w:w="737"/>
-          </w:tcPr>
-          <w:p>
-            <w:r/>
-            <w:r>
-              <w:rPr>
-                <w:sz w:val="15"/>
-              </w:rPr>
-              <w:t>+34.2</w:t>
-            </w:r>
-          </w:p>
-        </w:tc>
-        <w:tc>
-          <w:tcPr>
-            <w:tcW w:type="dxa" w:w="737"/>
-          </w:tcPr>
-          <w:p>
-            <w:r/>
-            <w:r>
-              <w:rPr>
-                <w:sz w:val="15"/>
-              </w:rPr>
-              <w:t>0.35</w:t>
-            </w:r>
-          </w:p>
-        </w:tc>
-        <w:tc>
-          <w:tcPr>
-            <w:tcW w:type="dxa" w:w="1587"/>
-          </w:tcPr>
-          <w:p>
-            <w:r/>
-            <w:r>
-              <w:rPr>
-                <w:sz w:val="15"/>
-              </w:rPr>
-              <w:t>D-alanine</w:t>
-            </w:r>
-          </w:p>
-        </w:tc>
-        <w:tc>
-          <w:tcPr>
-            <w:tcW w:type="dxa" w:w="850"/>
-          </w:tcPr>
-          <w:p>
-            <w:r/>
-            <w:r>
-              <w:rPr>
-                <w:sz w:val="15"/>
-              </w:rPr>
-              <w:t>NO MATCH</w:t>
-            </w:r>
-          </w:p>
-        </w:tc>
-        <w:tc>
-          <w:tcPr>
-            <w:tcW w:type="dxa" w:w="3912"/>
-            <w:shd w:val="clear" w:color="auto" w:fill="FDECEA"/>
-          </w:tcPr>
-          <w:p>
-            <w:r/>
-            <w:r>
-              <w:rPr>
-                <w:sz w:val="15"/>
-              </w:rPr>
-              <w:t>Nearest calculated peak is D-alanine at 768, 34 cm-1 away. The experimental band is broad (position SD 5 cm-1). No match.</w:t>
+            <w:tcW w:type="dxa" w:w="1077"/>
+          </w:tcPr>
+          <w:p>
+            <w:r/>
+            <w:r>
+              <w:rPr>
+                <w:sz w:val="16"/>
+              </w:rPr>
+              <w:t>418.4</w:t>
+            </w:r>
+          </w:p>
+        </w:tc>
+        <w:tc>
+          <w:tcPr>
+            <w:tcW w:type="dxa" w:w="1077"/>
+          </w:tcPr>
+          <w:p>
+            <w:r/>
+            <w:r>
+              <w:rPr>
+                <w:sz w:val="16"/>
+              </w:rPr>
+              <w:t>Supporting</w:t>
+            </w:r>
+          </w:p>
+        </w:tc>
+        <w:tc>
+          <w:tcPr>
+            <w:tcW w:type="dxa" w:w="1247"/>
+          </w:tcPr>
+          <w:p>
+            <w:r/>
+            <w:r>
+              <w:rPr>
+                <w:sz w:val="16"/>
+              </w:rPr>
+              <w:t>415.5</w:t>
+            </w:r>
+          </w:p>
+        </w:tc>
+        <w:tc>
+          <w:tcPr>
+            <w:tcW w:type="dxa" w:w="964"/>
+          </w:tcPr>
+          <w:p>
+            <w:r/>
+            <w:r>
+              <w:rPr>
+                <w:sz w:val="16"/>
+              </w:rPr>
+              <w:t>+2.9</w:t>
+            </w:r>
+          </w:p>
+        </w:tc>
+        <w:tc>
+          <w:tcPr>
+            <w:tcW w:type="dxa" w:w="964"/>
+          </w:tcPr>
+          <w:p>
+            <w:r/>
+            <w:r>
+              <w:rPr>
+                <w:sz w:val="16"/>
+              </w:rPr>
+              <w:t>0.15</w:t>
+            </w:r>
+          </w:p>
+        </w:tc>
+        <w:tc>
+          <w:tcPr>
+            <w:tcW w:type="dxa" w:w="1361"/>
+          </w:tcPr>
+          <w:p>
+            <w:r/>
+            <w:r>
+              <w:rPr>
+                <w:sz w:val="16"/>
+              </w:rPr>
+              <w:t>430.1</w:t>
+            </w:r>
+          </w:p>
+        </w:tc>
+        <w:tc>
+          <w:tcPr>
+            <w:tcW w:type="dxa" w:w="964"/>
+          </w:tcPr>
+          <w:p>
+            <w:r/>
+            <w:r>
+              <w:rPr>
+                <w:sz w:val="16"/>
+              </w:rPr>
+              <w:t>-11.7</w:t>
+            </w:r>
+          </w:p>
+        </w:tc>
+        <w:tc>
+          <w:tcPr>
+            <w:tcW w:type="dxa" w:w="1304"/>
+          </w:tcPr>
+          <w:p>
+            <w:r/>
+            <w:r>
+              <w:rPr>
+                <w:sz w:val="16"/>
+              </w:rPr>
+              <w:t>0.26</w:t>
             </w:r>
           </w:p>
         </w:tc>
@@ -4670,27 +4750,27 @@
       <w:tr>
         <w:tc>
           <w:tcPr>
-            <w:tcW w:type="dxa" w:w="737"/>
-          </w:tcPr>
-          <w:p>
-            <w:r/>
-            <w:r>
-              <w:rPr>
-                <w:sz w:val="15"/>
-              </w:rPr>
-              <w:t>861.5</w:t>
-            </w:r>
-          </w:p>
-        </w:tc>
-        <w:tc>
-          <w:tcPr>
-            <w:tcW w:type="dxa" w:w="794"/>
-          </w:tcPr>
-          <w:p>
-            <w:r/>
-            <w:r>
-              <w:rPr>
-                <w:sz w:val="15"/>
+            <w:tcW w:type="dxa" w:w="1077"/>
+          </w:tcPr>
+          <w:p>
+            <w:r/>
+            <w:r>
+              <w:rPr>
+                <w:sz w:val="16"/>
+              </w:rPr>
+              <w:t>539.3</w:t>
+            </w:r>
+          </w:p>
+        </w:tc>
+        <w:tc>
+          <w:tcPr>
+            <w:tcW w:type="dxa" w:w="1077"/>
+          </w:tcPr>
+          <w:p>
+            <w:r/>
+            <w:r>
+              <w:rPr>
+                <w:sz w:val="16"/>
               </w:rPr>
               <w:t>Primary</w:t>
             </w:r>
@@ -4698,86 +4778,85 @@
         </w:tc>
         <w:tc>
           <w:tcPr>
-            <w:tcW w:type="dxa" w:w="850"/>
-          </w:tcPr>
-          <w:p>
-            <w:r/>
-            <w:r>
-              <w:rPr>
-                <w:sz w:val="15"/>
-              </w:rPr>
-              <w:t>867.8</w:t>
-            </w:r>
-          </w:p>
-        </w:tc>
-        <w:tc>
-          <w:tcPr>
-            <w:tcW w:type="dxa" w:w="737"/>
-          </w:tcPr>
-          <w:p>
-            <w:r/>
-            <w:r>
-              <w:rPr>
-                <w:sz w:val="15"/>
-              </w:rPr>
-              <w:t>-6.3</w:t>
-            </w:r>
-          </w:p>
-        </w:tc>
-        <w:tc>
-          <w:tcPr>
-            <w:tcW w:type="dxa" w:w="737"/>
-          </w:tcPr>
-          <w:p>
-            <w:r/>
-            <w:r>
-              <w:rPr>
-                <w:sz w:val="15"/>
-              </w:rPr>
-              <w:t>0.12</w:t>
-            </w:r>
-          </w:p>
-        </w:tc>
-        <w:tc>
-          <w:tcPr>
-            <w:tcW w:type="dxa" w:w="1587"/>
-          </w:tcPr>
-          <w:p>
-            <w:r/>
-            <w:r>
-              <w:rPr>
-                <w:sz w:val="15"/>
-              </w:rPr>
-              <w:t>Glycerol-phosphate</w:t>
-            </w:r>
-          </w:p>
-        </w:tc>
-        <w:tc>
-          <w:tcPr>
-            <w:tcW w:type="dxa" w:w="850"/>
-          </w:tcPr>
-          <w:p>
-            <w:r/>
-            <w:r>
-              <w:rPr>
-                <w:sz w:val="15"/>
-              </w:rPr>
-              <w:t>MATCH</w:t>
-            </w:r>
-          </w:p>
-        </w:tc>
-        <w:tc>
-          <w:tcPr>
-            <w:tcW w:type="dxa" w:w="3912"/>
-            <w:shd w:val="clear" w:color="auto" w:fill="EAF6EE"/>
-          </w:tcPr>
-          <w:p>
-            <w:r/>
-            <w:r>
-              <w:rPr>
-                <w:sz w:val="15"/>
-              </w:rPr>
-              <w:t>Glycerol-phosphate peak at 867.8 (6 cm-1). Consistent with the glycerol/phosphate region.</w:t>
+            <w:tcW w:type="dxa" w:w="1247"/>
+          </w:tcPr>
+          <w:p>
+            <w:r/>
+            <w:r>
+              <w:rPr>
+                <w:sz w:val="16"/>
+              </w:rPr>
+              <w:t>536.4</w:t>
+            </w:r>
+          </w:p>
+        </w:tc>
+        <w:tc>
+          <w:tcPr>
+            <w:tcW w:type="dxa" w:w="964"/>
+          </w:tcPr>
+          <w:p>
+            <w:r/>
+            <w:r>
+              <w:rPr>
+                <w:sz w:val="16"/>
+              </w:rPr>
+              <w:t>+2.9</w:t>
+            </w:r>
+          </w:p>
+        </w:tc>
+        <w:tc>
+          <w:tcPr>
+            <w:tcW w:type="dxa" w:w="964"/>
+          </w:tcPr>
+          <w:p>
+            <w:r/>
+            <w:r>
+              <w:rPr>
+                <w:sz w:val="16"/>
+              </w:rPr>
+              <w:t>0.07</w:t>
+            </w:r>
+          </w:p>
+        </w:tc>
+        <w:tc>
+          <w:tcPr>
+            <w:tcW w:type="dxa" w:w="1361"/>
+          </w:tcPr>
+          <w:p>
+            <w:r/>
+            <w:r>
+              <w:rPr>
+                <w:sz w:val="16"/>
+              </w:rPr>
+              <w:t>537.6</w:t>
+            </w:r>
+          </w:p>
+        </w:tc>
+        <w:tc>
+          <w:tcPr>
+            <w:tcW w:type="dxa" w:w="964"/>
+          </w:tcPr>
+          <w:p>
+            <w:r/>
+            <w:r>
+              <w:rPr>
+                <w:sz w:val="16"/>
+              </w:rPr>
+              <w:t>+1.7</w:t>
+            </w:r>
+          </w:p>
+        </w:tc>
+        <w:tc>
+          <w:tcPr>
+            <w:tcW w:type="dxa" w:w="1304"/>
+          </w:tcPr>
+          <w:p>
+            <w:r/>
+            <w:r>
+              <w:rPr>
+                <w:sz w:val="16"/>
+              </w:rPr>
+              <w:t>0.10</w:t>
             </w:r>
           </w:p>
         </w:tc>
@@ -4785,114 +4864,113 @@
       <w:tr>
         <w:tc>
           <w:tcPr>
-            <w:tcW w:type="dxa" w:w="737"/>
-          </w:tcPr>
-          <w:p>
-            <w:r/>
-            <w:r>
-              <w:rPr>
-                <w:sz w:val="15"/>
-              </w:rPr>
-              <w:t>1091.8</w:t>
-            </w:r>
-          </w:p>
-        </w:tc>
-        <w:tc>
-          <w:tcPr>
-            <w:tcW w:type="dxa" w:w="794"/>
-          </w:tcPr>
-          <w:p>
-            <w:r/>
-            <w:r>
-              <w:rPr>
-                <w:sz w:val="15"/>
-              </w:rPr>
-              <w:t>Primary</w:t>
-            </w:r>
-          </w:p>
-        </w:tc>
-        <w:tc>
-          <w:tcPr>
-            <w:tcW w:type="dxa" w:w="850"/>
-          </w:tcPr>
-          <w:p>
-            <w:r/>
-            <w:r>
-              <w:rPr>
-                <w:sz w:val="15"/>
-              </w:rPr>
-              <w:t>1105.9</w:t>
-            </w:r>
-          </w:p>
-        </w:tc>
-        <w:tc>
-          <w:tcPr>
-            <w:tcW w:type="dxa" w:w="737"/>
-          </w:tcPr>
-          <w:p>
-            <w:r/>
-            <w:r>
-              <w:rPr>
-                <w:sz w:val="15"/>
-              </w:rPr>
-              <w:t>-14.1</w:t>
-            </w:r>
-          </w:p>
-        </w:tc>
-        <w:tc>
-          <w:tcPr>
-            <w:tcW w:type="dxa" w:w="737"/>
-          </w:tcPr>
-          <w:p>
-            <w:r/>
-            <w:r>
-              <w:rPr>
-                <w:sz w:val="15"/>
-              </w:rPr>
-              <w:t>0.18</w:t>
-            </w:r>
-          </w:p>
-        </w:tc>
-        <w:tc>
-          <w:tcPr>
-            <w:tcW w:type="dxa" w:w="1587"/>
-          </w:tcPr>
-          <w:p>
-            <w:r/>
-            <w:r>
-              <w:rPr>
-                <w:sz w:val="15"/>
-              </w:rPr>
-              <w:t>N-acetyl-D-glucosamine</w:t>
-            </w:r>
-          </w:p>
-        </w:tc>
-        <w:tc>
-          <w:tcPr>
-            <w:tcW w:type="dxa" w:w="850"/>
-          </w:tcPr>
-          <w:p>
-            <w:r/>
-            <w:r>
-              <w:rPr>
-                <w:sz w:val="15"/>
-              </w:rPr>
-              <w:t>NEAR (10-18)</w:t>
-            </w:r>
-          </w:p>
-        </w:tc>
-        <w:tc>
-          <w:tcPr>
-            <w:tcW w:type="dxa" w:w="3912"/>
-            <w:shd w:val="clear" w:color="auto" w:fill="FFF4D6"/>
-          </w:tcPr>
-          <w:p>
-            <w:r/>
-            <w:r>
-              <w:rPr>
-                <w:sz w:val="15"/>
-              </w:rPr>
-              <w:t>Nearest peak is GlcNAc at 1105.9 (14 cm-1). The expected phosphate PO2- stretch is not reproduced by the glycerol-phosphate fragment; the modelled phosphates are already ionised (charge -2, implicit water), so the miss is not simply an un-ionised-phosphate artefact.</w:t>
+            <w:tcW w:type="dxa" w:w="1077"/>
+          </w:tcPr>
+          <w:p>
+            <w:r/>
+            <w:r>
+              <w:rPr>
+                <w:sz w:val="16"/>
+              </w:rPr>
+              <w:t>722.6</w:t>
+            </w:r>
+          </w:p>
+        </w:tc>
+        <w:tc>
+          <w:tcPr>
+            <w:tcW w:type="dxa" w:w="1077"/>
+          </w:tcPr>
+          <w:p>
+            <w:r/>
+            <w:r>
+              <w:rPr>
+                <w:sz w:val="16"/>
+              </w:rPr>
+              <w:t>Supporting</w:t>
+            </w:r>
+          </w:p>
+        </w:tc>
+        <w:tc>
+          <w:tcPr>
+            <w:tcW w:type="dxa" w:w="1247"/>
+          </w:tcPr>
+          <w:p>
+            <w:r/>
+            <w:r>
+              <w:rPr>
+                <w:sz w:val="16"/>
+              </w:rPr>
+              <w:t>722.5</w:t>
+            </w:r>
+          </w:p>
+        </w:tc>
+        <w:tc>
+          <w:tcPr>
+            <w:tcW w:type="dxa" w:w="964"/>
+          </w:tcPr>
+          <w:p>
+            <w:r/>
+            <w:r>
+              <w:rPr>
+                <w:sz w:val="16"/>
+              </w:rPr>
+              <w:t>+0.1</w:t>
+            </w:r>
+          </w:p>
+        </w:tc>
+        <w:tc>
+          <w:tcPr>
+            <w:tcW w:type="dxa" w:w="964"/>
+          </w:tcPr>
+          <w:p>
+            <w:r/>
+            <w:r>
+              <w:rPr>
+                <w:sz w:val="16"/>
+              </w:rPr>
+              <w:t>0.04</w:t>
+            </w:r>
+          </w:p>
+        </w:tc>
+        <w:tc>
+          <w:tcPr>
+            <w:tcW w:type="dxa" w:w="1361"/>
+          </w:tcPr>
+          <w:p>
+            <w:r/>
+            <w:r>
+              <w:rPr>
+                <w:sz w:val="16"/>
+              </w:rPr>
+              <w:t>714.2</w:t>
+            </w:r>
+          </w:p>
+        </w:tc>
+        <w:tc>
+          <w:tcPr>
+            <w:tcW w:type="dxa" w:w="964"/>
+          </w:tcPr>
+          <w:p>
+            <w:r/>
+            <w:r>
+              <w:rPr>
+                <w:sz w:val="16"/>
+              </w:rPr>
+              <w:t>+8.4</w:t>
+            </w:r>
+          </w:p>
+        </w:tc>
+        <w:tc>
+          <w:tcPr>
+            <w:tcW w:type="dxa" w:w="1304"/>
+          </w:tcPr>
+          <w:p>
+            <w:r/>
+            <w:r>
+              <w:rPr>
+                <w:sz w:val="16"/>
+              </w:rPr>
+              <w:t>0.11</w:t>
             </w:r>
           </w:p>
         </w:tc>
@@ -4900,27 +4978,27 @@
       <w:tr>
         <w:tc>
           <w:tcPr>
-            <w:tcW w:type="dxa" w:w="737"/>
-          </w:tcPr>
-          <w:p>
-            <w:r/>
-            <w:r>
-              <w:rPr>
-                <w:sz w:val="15"/>
-              </w:rPr>
-              <w:t>1458.8</w:t>
-            </w:r>
-          </w:p>
-        </w:tc>
-        <w:tc>
-          <w:tcPr>
-            <w:tcW w:type="dxa" w:w="794"/>
-          </w:tcPr>
-          <w:p>
-            <w:r/>
-            <w:r>
-              <w:rPr>
-                <w:sz w:val="15"/>
+            <w:tcW w:type="dxa" w:w="1077"/>
+          </w:tcPr>
+          <w:p>
+            <w:r/>
+            <w:r>
+              <w:rPr>
+                <w:sz w:val="16"/>
+              </w:rPr>
+              <w:t>799.1</w:t>
+            </w:r>
+          </w:p>
+        </w:tc>
+        <w:tc>
+          <w:tcPr>
+            <w:tcW w:type="dxa" w:w="1077"/>
+          </w:tcPr>
+          <w:p>
+            <w:r/>
+            <w:r>
+              <w:rPr>
+                <w:sz w:val="16"/>
               </w:rPr>
               <w:t>Supporting</w:t>
             </w:r>
@@ -4928,13 +5006,511 @@
         </w:tc>
         <w:tc>
           <w:tcPr>
-            <w:tcW w:type="dxa" w:w="850"/>
-          </w:tcPr>
-          <w:p>
-            <w:r/>
-            <w:r>
-              <w:rPr>
-                <w:sz w:val="15"/>
+            <w:tcW w:type="dxa" w:w="1247"/>
+          </w:tcPr>
+          <w:p>
+            <w:r/>
+            <w:r>
+              <w:rPr>
+                <w:sz w:val="16"/>
+              </w:rPr>
+              <w:t>802.4</w:t>
+            </w:r>
+          </w:p>
+        </w:tc>
+        <w:tc>
+          <w:tcPr>
+            <w:tcW w:type="dxa" w:w="964"/>
+          </w:tcPr>
+          <w:p>
+            <w:r/>
+            <w:r>
+              <w:rPr>
+                <w:sz w:val="16"/>
+              </w:rPr>
+              <w:t>-3.3</w:t>
+            </w:r>
+          </w:p>
+        </w:tc>
+        <w:tc>
+          <w:tcPr>
+            <w:tcW w:type="dxa" w:w="964"/>
+          </w:tcPr>
+          <w:p>
+            <w:r/>
+            <w:r>
+              <w:rPr>
+                <w:sz w:val="16"/>
+              </w:rPr>
+              <w:t>0.08</w:t>
+            </w:r>
+          </w:p>
+        </w:tc>
+        <w:tc>
+          <w:tcPr>
+            <w:tcW w:type="dxa" w:w="1361"/>
+          </w:tcPr>
+          <w:p>
+            <w:r/>
+            <w:r>
+              <w:rPr>
+                <w:sz w:val="16"/>
+              </w:rPr>
+              <w:t>768.0</w:t>
+            </w:r>
+          </w:p>
+        </w:tc>
+        <w:tc>
+          <w:tcPr>
+            <w:tcW w:type="dxa" w:w="964"/>
+          </w:tcPr>
+          <w:p>
+            <w:r/>
+            <w:r>
+              <w:rPr>
+                <w:sz w:val="16"/>
+              </w:rPr>
+              <w:t>+31.1</w:t>
+            </w:r>
+          </w:p>
+        </w:tc>
+        <w:tc>
+          <w:tcPr>
+            <w:tcW w:type="dxa" w:w="1304"/>
+          </w:tcPr>
+          <w:p>
+            <w:r/>
+            <w:r>
+              <w:rPr>
+                <w:sz w:val="16"/>
+              </w:rPr>
+              <w:t>0.35</w:t>
+            </w:r>
+          </w:p>
+        </w:tc>
+      </w:tr>
+      <w:tr>
+        <w:tc>
+          <w:tcPr>
+            <w:tcW w:type="dxa" w:w="1077"/>
+          </w:tcPr>
+          <w:p>
+            <w:r/>
+            <w:r>
+              <w:rPr>
+                <w:sz w:val="16"/>
+              </w:rPr>
+              <w:t>861.9</w:t>
+            </w:r>
+          </w:p>
+        </w:tc>
+        <w:tc>
+          <w:tcPr>
+            <w:tcW w:type="dxa" w:w="1077"/>
+          </w:tcPr>
+          <w:p>
+            <w:r/>
+            <w:r>
+              <w:rPr>
+                <w:sz w:val="16"/>
+              </w:rPr>
+              <w:t>Primary</w:t>
+            </w:r>
+          </w:p>
+        </w:tc>
+        <w:tc>
+          <w:tcPr>
+            <w:tcW w:type="dxa" w:w="1247"/>
+          </w:tcPr>
+          <w:p>
+            <w:r/>
+            <w:r>
+              <w:rPr>
+                <w:sz w:val="16"/>
+              </w:rPr>
+              <w:t>860.7</w:t>
+            </w:r>
+          </w:p>
+        </w:tc>
+        <w:tc>
+          <w:tcPr>
+            <w:tcW w:type="dxa" w:w="964"/>
+          </w:tcPr>
+          <w:p>
+            <w:r/>
+            <w:r>
+              <w:rPr>
+                <w:sz w:val="16"/>
+              </w:rPr>
+              <w:t>+1.2</w:t>
+            </w:r>
+          </w:p>
+        </w:tc>
+        <w:tc>
+          <w:tcPr>
+            <w:tcW w:type="dxa" w:w="964"/>
+          </w:tcPr>
+          <w:p>
+            <w:r/>
+            <w:r>
+              <w:rPr>
+                <w:sz w:val="16"/>
+              </w:rPr>
+              <w:t>0.15</w:t>
+            </w:r>
+          </w:p>
+        </w:tc>
+        <w:tc>
+          <w:tcPr>
+            <w:tcW w:type="dxa" w:w="1361"/>
+          </w:tcPr>
+          <w:p>
+            <w:r/>
+            <w:r>
+              <w:rPr>
+                <w:sz w:val="16"/>
+              </w:rPr>
+              <w:t>867.8</w:t>
+            </w:r>
+          </w:p>
+        </w:tc>
+        <w:tc>
+          <w:tcPr>
+            <w:tcW w:type="dxa" w:w="964"/>
+          </w:tcPr>
+          <w:p>
+            <w:r/>
+            <w:r>
+              <w:rPr>
+                <w:sz w:val="16"/>
+              </w:rPr>
+              <w:t>-5.9</w:t>
+            </w:r>
+          </w:p>
+        </w:tc>
+        <w:tc>
+          <w:tcPr>
+            <w:tcW w:type="dxa" w:w="1304"/>
+          </w:tcPr>
+          <w:p>
+            <w:r/>
+            <w:r>
+              <w:rPr>
+                <w:sz w:val="16"/>
+              </w:rPr>
+              <w:t>0.12</w:t>
+            </w:r>
+          </w:p>
+        </w:tc>
+      </w:tr>
+      <w:tr>
+        <w:tc>
+          <w:tcPr>
+            <w:tcW w:type="dxa" w:w="1077"/>
+          </w:tcPr>
+          <w:p>
+            <w:r/>
+            <w:r>
+              <w:rPr>
+                <w:sz w:val="16"/>
+              </w:rPr>
+              <w:t>1010.6</w:t>
+            </w:r>
+          </w:p>
+        </w:tc>
+        <w:tc>
+          <w:tcPr>
+            <w:tcW w:type="dxa" w:w="1077"/>
+          </w:tcPr>
+          <w:p>
+            <w:r/>
+            <w:r>
+              <w:rPr>
+                <w:sz w:val="16"/>
+              </w:rPr>
+              <w:t>Supporting</w:t>
+            </w:r>
+          </w:p>
+        </w:tc>
+        <w:tc>
+          <w:tcPr>
+            <w:tcW w:type="dxa" w:w="1247"/>
+          </w:tcPr>
+          <w:p>
+            <w:r/>
+            <w:r>
+              <w:rPr>
+                <w:sz w:val="16"/>
+              </w:rPr>
+              <w:t>1009.6</w:t>
+            </w:r>
+          </w:p>
+        </w:tc>
+        <w:tc>
+          <w:tcPr>
+            <w:tcW w:type="dxa" w:w="964"/>
+          </w:tcPr>
+          <w:p>
+            <w:r/>
+            <w:r>
+              <w:rPr>
+                <w:sz w:val="16"/>
+              </w:rPr>
+              <w:t>+1.0</w:t>
+            </w:r>
+          </w:p>
+        </w:tc>
+        <w:tc>
+          <w:tcPr>
+            <w:tcW w:type="dxa" w:w="964"/>
+          </w:tcPr>
+          <w:p>
+            <w:r/>
+            <w:r>
+              <w:rPr>
+                <w:sz w:val="16"/>
+              </w:rPr>
+              <w:t>0.01</w:t>
+            </w:r>
+          </w:p>
+        </w:tc>
+        <w:tc>
+          <w:tcPr>
+            <w:tcW w:type="dxa" w:w="1361"/>
+          </w:tcPr>
+          <w:p>
+            <w:r/>
+            <w:r>
+              <w:rPr>
+                <w:sz w:val="16"/>
+              </w:rPr>
+              <w:t>1013.8</w:t>
+            </w:r>
+          </w:p>
+        </w:tc>
+        <w:tc>
+          <w:tcPr>
+            <w:tcW w:type="dxa" w:w="964"/>
+          </w:tcPr>
+          <w:p>
+            <w:r/>
+            <w:r>
+              <w:rPr>
+                <w:sz w:val="16"/>
+              </w:rPr>
+              <w:t>-3.2</w:t>
+            </w:r>
+          </w:p>
+        </w:tc>
+        <w:tc>
+          <w:tcPr>
+            <w:tcW w:type="dxa" w:w="1304"/>
+          </w:tcPr>
+          <w:p>
+            <w:r/>
+            <w:r>
+              <w:rPr>
+                <w:sz w:val="16"/>
+              </w:rPr>
+              <w:t>0.13</w:t>
+            </w:r>
+          </w:p>
+        </w:tc>
+      </w:tr>
+      <w:tr>
+        <w:tc>
+          <w:tcPr>
+            <w:tcW w:type="dxa" w:w="1077"/>
+          </w:tcPr>
+          <w:p>
+            <w:r/>
+            <w:r>
+              <w:rPr>
+                <w:sz w:val="16"/>
+              </w:rPr>
+              <w:t>1092.0</w:t>
+            </w:r>
+          </w:p>
+        </w:tc>
+        <w:tc>
+          <w:tcPr>
+            <w:tcW w:type="dxa" w:w="1077"/>
+          </w:tcPr>
+          <w:p>
+            <w:r/>
+            <w:r>
+              <w:rPr>
+                <w:sz w:val="16"/>
+              </w:rPr>
+              <w:t>Primary</w:t>
+            </w:r>
+          </w:p>
+        </w:tc>
+        <w:tc>
+          <w:tcPr>
+            <w:tcW w:type="dxa" w:w="1247"/>
+          </w:tcPr>
+          <w:p>
+            <w:r/>
+            <w:r>
+              <w:rPr>
+                <w:sz w:val="16"/>
+              </w:rPr>
+              <w:t>1089.5</w:t>
+            </w:r>
+          </w:p>
+        </w:tc>
+        <w:tc>
+          <w:tcPr>
+            <w:tcW w:type="dxa" w:w="964"/>
+          </w:tcPr>
+          <w:p>
+            <w:r/>
+            <w:r>
+              <w:rPr>
+                <w:sz w:val="16"/>
+              </w:rPr>
+              <w:t>+2.5</w:t>
+            </w:r>
+          </w:p>
+        </w:tc>
+        <w:tc>
+          <w:tcPr>
+            <w:tcW w:type="dxa" w:w="964"/>
+          </w:tcPr>
+          <w:p>
+            <w:r/>
+            <w:r>
+              <w:rPr>
+                <w:sz w:val="16"/>
+              </w:rPr>
+              <w:t>0.03</w:t>
+            </w:r>
+          </w:p>
+        </w:tc>
+        <w:tc>
+          <w:tcPr>
+            <w:tcW w:type="dxa" w:w="1361"/>
+          </w:tcPr>
+          <w:p>
+            <w:r/>
+            <w:r>
+              <w:rPr>
+                <w:sz w:val="16"/>
+              </w:rPr>
+              <w:t>1105.9</w:t>
+            </w:r>
+          </w:p>
+        </w:tc>
+        <w:tc>
+          <w:tcPr>
+            <w:tcW w:type="dxa" w:w="964"/>
+          </w:tcPr>
+          <w:p>
+            <w:r/>
+            <w:r>
+              <w:rPr>
+                <w:sz w:val="16"/>
+              </w:rPr>
+              <w:t>-13.9</w:t>
+            </w:r>
+          </w:p>
+        </w:tc>
+        <w:tc>
+          <w:tcPr>
+            <w:tcW w:type="dxa" w:w="1304"/>
+          </w:tcPr>
+          <w:p>
+            <w:r/>
+            <w:r>
+              <w:rPr>
+                <w:sz w:val="16"/>
+              </w:rPr>
+              <w:t>0.18</w:t>
+            </w:r>
+          </w:p>
+        </w:tc>
+      </w:tr>
+      <w:tr>
+        <w:tc>
+          <w:tcPr>
+            <w:tcW w:type="dxa" w:w="1077"/>
+          </w:tcPr>
+          <w:p>
+            <w:r/>
+            <w:r>
+              <w:rPr>
+                <w:sz w:val="16"/>
+              </w:rPr>
+              <w:t>1460.1</w:t>
+            </w:r>
+          </w:p>
+        </w:tc>
+        <w:tc>
+          <w:tcPr>
+            <w:tcW w:type="dxa" w:w="1077"/>
+          </w:tcPr>
+          <w:p>
+            <w:r/>
+            <w:r>
+              <w:rPr>
+                <w:sz w:val="16"/>
+              </w:rPr>
+              <w:t>Supporting</w:t>
+            </w:r>
+          </w:p>
+        </w:tc>
+        <w:tc>
+          <w:tcPr>
+            <w:tcW w:type="dxa" w:w="1247"/>
+          </w:tcPr>
+          <w:p>
+            <w:r/>
+            <w:r>
+              <w:rPr>
+                <w:sz w:val="16"/>
+              </w:rPr>
+              <w:t>1464.4</w:t>
+            </w:r>
+          </w:p>
+        </w:tc>
+        <w:tc>
+          <w:tcPr>
+            <w:tcW w:type="dxa" w:w="964"/>
+          </w:tcPr>
+          <w:p>
+            <w:r/>
+            <w:r>
+              <w:rPr>
+                <w:sz w:val="16"/>
+              </w:rPr>
+              <w:t>-4.3</w:t>
+            </w:r>
+          </w:p>
+        </w:tc>
+        <w:tc>
+          <w:tcPr>
+            <w:tcW w:type="dxa" w:w="964"/>
+          </w:tcPr>
+          <w:p>
+            <w:r/>
+            <w:r>
+              <w:rPr>
+                <w:sz w:val="16"/>
+              </w:rPr>
+              <w:t>0.04</w:t>
+            </w:r>
+          </w:p>
+        </w:tc>
+        <w:tc>
+          <w:tcPr>
+            <w:tcW w:type="dxa" w:w="1361"/>
+          </w:tcPr>
+          <w:p>
+            <w:r/>
+            <w:r>
+              <w:rPr>
+                <w:sz w:val="16"/>
               </w:rPr>
               <w:t>1455.4</w:t>
             </w:r>
@@ -4942,78 +5518,197 @@
         </w:tc>
         <w:tc>
           <w:tcPr>
-            <w:tcW w:type="dxa" w:w="737"/>
-          </w:tcPr>
-          <w:p>
-            <w:r/>
-            <w:r>
-              <w:rPr>
-                <w:sz w:val="15"/>
-              </w:rPr>
-              <w:t>+3.4</w:t>
-            </w:r>
-          </w:p>
-        </w:tc>
-        <w:tc>
-          <w:tcPr>
-            <w:tcW w:type="dxa" w:w="737"/>
-          </w:tcPr>
-          <w:p>
-            <w:r/>
-            <w:r>
-              <w:rPr>
-                <w:sz w:val="15"/>
+            <w:tcW w:type="dxa" w:w="964"/>
+          </w:tcPr>
+          <w:p>
+            <w:r/>
+            <w:r>
+              <w:rPr>
+                <w:sz w:val="16"/>
+              </w:rPr>
+              <w:t>+4.7</w:t>
+            </w:r>
+          </w:p>
+        </w:tc>
+        <w:tc>
+          <w:tcPr>
+            <w:tcW w:type="dxa" w:w="1304"/>
+          </w:tcPr>
+          <w:p>
+            <w:r/>
+            <w:r>
+              <w:rPr>
+                <w:sz w:val="16"/>
               </w:rPr>
               <w:t>0.23</w:t>
             </w:r>
           </w:p>
         </w:tc>
-        <w:tc>
-          <w:tcPr>
-            <w:tcW w:type="dxa" w:w="1587"/>
-          </w:tcPr>
-          <w:p>
-            <w:r/>
-            <w:r>
-              <w:rPr>
-                <w:sz w:val="15"/>
-              </w:rPr>
-              <w:t>Glycerol-phosphate</w:t>
-            </w:r>
-          </w:p>
-        </w:tc>
-        <w:tc>
-          <w:tcPr>
-            <w:tcW w:type="dxa" w:w="850"/>
-          </w:tcPr>
-          <w:p>
-            <w:r/>
-            <w:r>
-              <w:rPr>
-                <w:sz w:val="15"/>
-              </w:rPr>
-              <w:t>MATCH</w:t>
-            </w:r>
-          </w:p>
-        </w:tc>
-        <w:tc>
-          <w:tcPr>
-            <w:tcW w:type="dxa" w:w="3912"/>
-            <w:shd w:val="clear" w:color="auto" w:fill="EAF6EE"/>
-          </w:tcPr>
-          <w:p>
-            <w:r/>
-            <w:r>
-              <w:rPr>
-                <w:sz w:val="15"/>
-              </w:rPr>
-              <w:t>Glycerol-phosphate CH2 bending peak at 1455 (3 cm-1). Consistent, but CH2 bending is non-specific.</w:t>
+      </w:tr>
+      <w:tr>
+        <w:tc>
+          <w:tcPr>
+            <w:tcW w:type="dxa" w:w="1077"/>
+          </w:tcPr>
+          <w:p>
+            <w:r/>
+            <w:r>
+              <w:rPr>
+                <w:sz w:val="16"/>
+              </w:rPr>
+              <w:t>1750.8</w:t>
+            </w:r>
+          </w:p>
+        </w:tc>
+        <w:tc>
+          <w:tcPr>
+            <w:tcW w:type="dxa" w:w="1077"/>
+          </w:tcPr>
+          <w:p>
+            <w:r/>
+            <w:r>
+              <w:rPr>
+                <w:sz w:val="16"/>
+              </w:rPr>
+              <w:t>Supporting</w:t>
+            </w:r>
+          </w:p>
+        </w:tc>
+        <w:tc>
+          <w:tcPr>
+            <w:tcW w:type="dxa" w:w="1247"/>
+          </w:tcPr>
+          <w:p>
+            <w:r/>
+            <w:r>
+              <w:rPr>
+                <w:sz w:val="16"/>
+              </w:rPr>
+              <w:t>1746.3</w:t>
+            </w:r>
+          </w:p>
+        </w:tc>
+        <w:tc>
+          <w:tcPr>
+            <w:tcW w:type="dxa" w:w="964"/>
+          </w:tcPr>
+          <w:p>
+            <w:r/>
+            <w:r>
+              <w:rPr>
+                <w:sz w:val="16"/>
+              </w:rPr>
+              <w:t>+4.5</w:t>
+            </w:r>
+          </w:p>
+        </w:tc>
+        <w:tc>
+          <w:tcPr>
+            <w:tcW w:type="dxa" w:w="964"/>
+          </w:tcPr>
+          <w:p>
+            <w:r/>
+            <w:r>
+              <w:rPr>
+                <w:sz w:val="16"/>
+              </w:rPr>
+              <w:t>0.03</w:t>
+            </w:r>
+          </w:p>
+        </w:tc>
+        <w:tc>
+          <w:tcPr>
+            <w:tcW w:type="dxa" w:w="1361"/>
+          </w:tcPr>
+          <w:p>
+            <w:r/>
+            <w:r>
+              <w:rPr>
+                <w:sz w:val="16"/>
+              </w:rPr>
+              <w:t>1689.6</w:t>
+            </w:r>
+          </w:p>
+        </w:tc>
+        <w:tc>
+          <w:tcPr>
+            <w:tcW w:type="dxa" w:w="964"/>
+          </w:tcPr>
+          <w:p>
+            <w:r/>
+            <w:r>
+              <w:rPr>
+                <w:sz w:val="16"/>
+              </w:rPr>
+              <w:t>+61.2</w:t>
+            </w:r>
+          </w:p>
+        </w:tc>
+        <w:tc>
+          <w:tcPr>
+            <w:tcW w:type="dxa" w:w="1304"/>
+          </w:tcPr>
+          <w:p>
+            <w:r/>
+            <w:r>
+              <w:rPr>
+                <w:sz w:val="16"/>
+              </w:rPr>
+              <w:t>0.09</w:t>
             </w:r>
           </w:p>
         </w:tc>
       </w:tr>
     </w:tbl>
     <w:p/>
+    <w:p>
+      <w:pPr>
+        <w:jc w:val="center"/>
+      </w:pPr>
+      <w:r>
+        <w:drawing>
+          <wp:inline xmlns:a="http://schemas.openxmlformats.org/drawingml/2006/main" xmlns:pic="http://schemas.openxmlformats.org/drawingml/2006/picture">
+            <wp:extent cx="6120000" cy="1915826"/>
+            <wp:docPr id="10" name="Picture 10"/>
+            <wp:cNvGraphicFramePr>
+              <a:graphicFrameLocks noChangeAspect="1"/>
+            </wp:cNvGraphicFramePr>
+            <a:graphic>
+              <a:graphicData uri="http://schemas.openxmlformats.org/drawingml/2006/picture">
+                <pic:pic>
+                  <pic:nvPicPr>
+                    <pic:cNvPr id="0" name="LTA_Model_vs_Fragments.png"/>
+                    <pic:cNvPicPr/>
+                  </pic:nvPicPr>
+                  <pic:blipFill>
+                    <a:blip r:embed="rId18"/>
+                    <a:stretch>
+                      <a:fillRect/>
+                    </a:stretch>
+                  </pic:blipFill>
+                  <pic:spPr>
+                    <a:xfrm>
+                      <a:off x="0" y="0"/>
+                      <a:ext cx="6120000" cy="1915826"/>
+                    </a:xfrm>
+                    <a:prstGeom prst="rect"/>
+                  </pic:spPr>
+                </pic:pic>
+              </a:graphicData>
+            </a:graphic>
+          </wp:inline>
+        </w:drawing>
+      </w:r>
+    </w:p>
+    <w:p>
+      <w:r>
+        <w:rPr>
+          <w:i/>
+          <w:sz w:val="17"/>
+        </w:rPr>
+        <w:t>Figure 7. LTA: whole-molecule model against the three fragments. Left: difference between each library band and the nearest calculated mode. Middle: relative activity of that mode. Right: whole-spectrum correlation with the reference.</w:t>
+      </w:r>
+    </w:p>
     <w:p>
       <w:pPr>
         <w:pStyle w:val="Heading2"/>
@@ -5027,7 +5722,7 @@
         <w:pStyle w:val="ListBullet"/>
       </w:pPr>
       <w:r>
-        <w:t>The most important LTA marker, 1092 cm-1 (consistent with a phosphodiester PO2- stretch), is not reproduced by the glycerol-phosphate fragment; the nearest peak belongs to GlcNAc, 14 cm-1 away. The 802 cm-1 band has no calculated peak within 34 cm-1.</w:t>
+        <w:t>Positions. Every library band has a model mode within 4.5 cm-1, including the two that the fragments missed by more than 30 cm-1 (799 cm-1 against 768; 1751 cm-1 against 1690) and the 1092 cm-1 primary band (model 1089.5; nearest fragment peak 14 cm-1 away). Part of the reason is that the model contains the phosphodiester and ester links. Part is density: the model has 165 modes in the window, so a mode is rarely more than a few cm-1 from any band.</w:t>
       </w:r>
     </w:p>
     <w:p>
@@ -5035,7 +5730,7 @@
         <w:pStyle w:val="ListBullet"/>
       </w:pPr>
       <w:r>
-        <w:t>Whole-spectrum agreement is poor: equal-weight average r = 0.11; with fitted weights (GlcNAc 50 %, D-alanine 25 %, glycerol-phosphate 25 %) r = 0.11 and R-squared = -0.69. The earlier fit on April data gave R-squared = -0.29 with a NaN branch unresolved, so the problem is not new.</w:t>
+        <w:t>Intensities. The 1092 cm-1 band is the strongest measured band (SNR 30), but the model mode near it has a relative activity of only 0.03; the strong measured 799 and 1010 cm-1 bands match activities of 0.08 and 0.01. The model's strongest modes are 690 cm-1 (1.00), 654, 594, 446 and a group at 1490-1510 cm-1 (0.2 to 0.3). The measured spectrum has no band at 690 (a minimum) and only weak features at 1583 and 1459 cm-1. The 1490-1510 group is probably NH3+ and amide motion exaggerated by the small basis set and the lack of water; this was not checked against the displacement vectors.</w:t>
       </w:r>
     </w:p>
     <w:p>
@@ -5043,7 +5738,15 @@
         <w:pStyle w:val="ListBullet"/>
       </w:pPr>
       <w:r>
-        <w:t>Only 47 peaks are available in 400-1800 cm-1 (about 3 per 100 cm-1) because they are read from broadened curves, so the chance baseline is lower than for NAM and LPS, yet the real result is still not better than chance.</w:t>
+        <w:t>Shape. The correlation is zero (-0.01) for the model and 0.09 for the fragments, so neither reproduces the measured pattern. Adding the model to the fragments in the NNLS fit does not improve the fit (r 0.08).</w:t>
+      </w:r>
+    </w:p>
+    <w:p>
+      <w:pPr>
+        <w:pStyle w:val="ListBullet"/>
+      </w:pPr>
+      <w:r>
+        <w:t>The 5 cm-1 result is therefore a modest finding: positions are consistent with a phosphate-ester, glycerol and D-alanine/GlcNAc model, which supports tentative assignments, but the modes are not the ones that dominate the measured spectrum and the 10 and 18 cm-1 tests are within chance.</w:t>
       </w:r>
     </w:p>
     <w:p>
@@ -5059,7 +5762,7 @@
         <w:pStyle w:val="ListBullet"/>
       </w:pPr>
       <w:r>
-        <w:t>Fragments, not the polymer. The glycerol-phosphate fragment is a two-unit dianion (charge -2) in implicit water, which is closer to LTA than a single neutral unit, but it still lacks the long chain, the D-alanine ester links and the counter-ions.</w:t>
+        <w:t>Model, not polymer. Three repeating units instead of about 23, no glycolipid anchor; chain-end effects are exaggerated and repeat-unit bands are under-represented. Glycerol stereochemistry of the two outer arms was set equal and not checked against the S. aureus form.</w:t>
       </w:r>
     </w:p>
     <w:p>
@@ -5067,7 +5770,7 @@
         <w:pStyle w:val="ListBullet"/>
       </w:pPr>
       <w:r>
-        <w:t>Low-level theory. B3LYP/6-31G(d) is a small basis set and is known to be less reliable for phosphate and hydrogen-bonded groups than the 6-311++G(d,p) used for NAM.</w:t>
+        <w:t>Low-level theory. B3LYP/3-21G has no polarisation or diffuse functions and is poor for charged phosphate and ammonium groups; the 0.965 scale factor was not fitted for it. Peaks near 2410, 2510 and 2700-2800 cm-1 are probably artefacts of intramolecular NH3+...phosphate hydrogen bonds (outside the window used here).</w:t>
       </w:r>
     </w:p>
     <w:p>
@@ -5075,7 +5778,7 @@
         <w:pStyle w:val="ListBullet"/>
       </w:pPr>
       <w:r>
-        <w:t>Implicit water. The calculation used water solvation (SMD) but the measurement is on dry powder.</w:t>
+        <w:t>Gas phase, one conformer, no counter-ions. The powder contains Na+, Mg2+ or Ca2+ and probably water; the experimental bands are broad and sit on a fluorescence background.</w:t>
       </w:r>
     </w:p>
     <w:p>
@@ -5083,12 +5786,7 @@
         <w:pStyle w:val="ListBullet"/>
       </w:pPr>
       <w:r>
-        <w:t>Reference quality. The experimental reference is 4 spectra with broad, variable bands (802: position SD 5 cm-1), so part of the disagreement may be measurement uncertainty. This is why the re-acquisition is needed before drawing conclusions.</w:t>
-      </w:r>
-    </w:p>
-    <w:p>
-      <w:r>
-        <w:br w:type="page"/>
+        <w:t>Experiment. The reference is better than the April one (17 spots, clean darks), but the primary-band heights vary by about 26-35 % between spots, and normalisation to the maximum compresses the weaker bands.</w:t>
       </w:r>
     </w:p>
     <w:p>
@@ -5105,7 +5803,7 @@
           <w:b w:val="0"/>
           <w:i w:val="0"/>
         </w:rPr>
-        <w:t>Any list of calculated modes will land close to some experimental bands. The question is whether the real DFT list does better than the same list moved by a meaningless amount. Figure 6 and the table below show that it does not, for any of the three molecules, and the same holds for the LPS whole-molecule model.</w:t>
+        <w:t>Any list of calculated modes will land close to some experimental bands. The question is whether the real DFT list does better than the same list moved by a meaningless amount. Figure 8 and the table below show that it does not for NAM, the LPS fragments, the LPS whole-molecule model or the LTA fragments. The LTA whole-molecule model is the exception at the strict 5 cm-1 tolerance only.</w:t>
       </w:r>
     </w:p>
     <w:p>
@@ -5154,7 +5852,7 @@
           <w:i/>
           <w:sz w:val="17"/>
         </w:rPr>
-        <w:t>Figure 6. Grey: number of experimental bands within 10 cm-1 of a calculated mode after random shifts of the modes. Coloured line: real DFT. LPS is the five-fragment calculation; the whole-molecule model is in the table below.</w:t>
+        <w:t>Figure 8. Grey: number of experimental bands within 10 cm-1 of a calculated mode after random shifts of the modes. Coloured line: real calculation. All five calculations are shown (LTA tested against reference v2.1).</w:t>
       </w:r>
     </w:p>
     <w:tbl>
@@ -5965,12 +6663,8 @@
             <w:tcW w:type="dxa" w:w="1020"/>
           </w:tcPr>
           <w:p>
-            <w:r/>
-            <w:r>
-              <w:rPr>
-                <w:sz w:val="17"/>
-              </w:rPr>
-              <w:t>LTA</w:t>
+            <w:r>
+              <w:t>LTA (3 fragments)</w:t>
             </w:r>
           </w:p>
         </w:tc>
@@ -5979,11 +6673,7 @@
             <w:tcW w:type="dxa" w:w="1134"/>
           </w:tcPr>
           <w:p>
-            <w:r/>
-            <w:r>
-              <w:rPr>
-                <w:sz w:val="17"/>
-              </w:rPr>
+            <w:r>
               <w:t>5</w:t>
             </w:r>
           </w:p>
@@ -5993,12 +6683,8 @@
             <w:tcW w:type="dxa" w:w="1417"/>
           </w:tcPr>
           <w:p>
-            <w:r/>
-            <w:r>
-              <w:rPr>
-                <w:sz w:val="17"/>
-              </w:rPr>
-              <w:t>1 of 4</w:t>
+            <w:r>
+              <w:t>3 of 9</w:t>
             </w:r>
           </w:p>
         </w:tc>
@@ -6007,12 +6693,8 @@
             <w:tcW w:type="dxa" w:w="2041"/>
           </w:tcPr>
           <w:p>
-            <w:r/>
-            <w:r>
-              <w:rPr>
-                <w:sz w:val="17"/>
-              </w:rPr>
-              <w:t>1.2 +/- 0.9</w:t>
+            <w:r>
+              <w:t>2.5 +/- 1.1</w:t>
             </w:r>
           </w:p>
         </w:tc>
@@ -6021,12 +6703,8 @@
             <w:tcW w:type="dxa" w:w="1701"/>
           </w:tcPr>
           <w:p>
-            <w:r/>
-            <w:r>
-              <w:rPr>
-                <w:sz w:val="17"/>
-              </w:rPr>
-              <w:t>0.79</w:t>
+            <w:r>
+              <w:t>0.46</w:t>
             </w:r>
           </w:p>
         </w:tc>
@@ -6035,12 +6713,8 @@
             <w:tcW w:type="dxa" w:w="2891"/>
           </w:tcPr>
           <w:p>
-            <w:r/>
-            <w:r>
-              <w:rPr>
-                <w:sz w:val="17"/>
-              </w:rPr>
-              <w:t>1 of 4 (chance 0.4, p = 0.29)</w:t>
+            <w:r>
+              <w:t>1 of 9 (p = 0.45)</w:t>
             </w:r>
           </w:p>
         </w:tc>
@@ -6051,12 +6725,8 @@
             <w:tcW w:type="dxa" w:w="1020"/>
           </w:tcPr>
           <w:p>
-            <w:r/>
-            <w:r>
-              <w:rPr>
-                <w:sz w:val="17"/>
-              </w:rPr>
-              <w:t>LTA</w:t>
+            <w:r>
+              <w:t>LTA (3 fragments)</w:t>
             </w:r>
           </w:p>
         </w:tc>
@@ -6065,11 +6735,7 @@
             <w:tcW w:type="dxa" w:w="1134"/>
           </w:tcPr>
           <w:p>
-            <w:r/>
-            <w:r>
-              <w:rPr>
-                <w:sz w:val="17"/>
-              </w:rPr>
+            <w:r>
               <w:t>10</w:t>
             </w:r>
           </w:p>
@@ -6079,12 +6745,8 @@
             <w:tcW w:type="dxa" w:w="1417"/>
           </w:tcPr>
           <w:p>
-            <w:r/>
-            <w:r>
-              <w:rPr>
-                <w:sz w:val="17"/>
-              </w:rPr>
-              <w:t>2 of 4</w:t>
+            <w:r>
+              <w:t>5 of 9</w:t>
             </w:r>
           </w:p>
         </w:tc>
@@ -6093,12 +6755,8 @@
             <w:tcW w:type="dxa" w:w="2041"/>
           </w:tcPr>
           <w:p>
-            <w:r/>
-            <w:r>
-              <w:rPr>
-                <w:sz w:val="17"/>
-              </w:rPr>
-              <w:t>2.1 +/- 0.8</w:t>
+            <w:r>
+              <w:t>4.3 +/- 1.1</w:t>
             </w:r>
           </w:p>
         </w:tc>
@@ -6107,12 +6765,8 @@
             <w:tcW w:type="dxa" w:w="1701"/>
           </w:tcPr>
           <w:p>
-            <w:r/>
-            <w:r>
-              <w:rPr>
-                <w:sz w:val="17"/>
-              </w:rPr>
-              <w:t>0.71</w:t>
+            <w:r>
+              <w:t>0.40</w:t>
             </w:r>
           </w:p>
         </w:tc>
@@ -6121,12 +6775,8 @@
             <w:tcW w:type="dxa" w:w="2891"/>
           </w:tcPr>
           <w:p>
-            <w:r/>
-            <w:r>
-              <w:rPr>
-                <w:sz w:val="17"/>
-              </w:rPr>
-              <w:t>1 of 4 (chance 0.7, p = 0.53)</w:t>
+            <w:r>
+              <w:t>1 of 9 (p = 0.77)</w:t>
             </w:r>
           </w:p>
         </w:tc>
@@ -6137,12 +6787,8 @@
             <w:tcW w:type="dxa" w:w="1020"/>
           </w:tcPr>
           <w:p>
-            <w:r/>
-            <w:r>
-              <w:rPr>
-                <w:sz w:val="17"/>
-              </w:rPr>
-              <w:t>LTA</w:t>
+            <w:r>
+              <w:t>LTA (3 fragments)</w:t>
             </w:r>
           </w:p>
         </w:tc>
@@ -6151,11 +6797,7 @@
             <w:tcW w:type="dxa" w:w="1134"/>
           </w:tcPr>
           <w:p>
-            <w:r/>
-            <w:r>
-              <w:rPr>
-                <w:sz w:val="17"/>
-              </w:rPr>
+            <w:r>
               <w:t>18</w:t>
             </w:r>
           </w:p>
@@ -6165,12 +6807,8 @@
             <w:tcW w:type="dxa" w:w="1417"/>
           </w:tcPr>
           <w:p>
-            <w:r/>
-            <w:r>
-              <w:rPr>
-                <w:sz w:val="17"/>
-              </w:rPr>
-              <w:t>3 of 4</w:t>
+            <w:r>
+              <w:t>7 of 9</w:t>
             </w:r>
           </w:p>
         </w:tc>
@@ -6179,12 +6817,8 @@
             <w:tcW w:type="dxa" w:w="2041"/>
           </w:tcPr>
           <w:p>
-            <w:r/>
-            <w:r>
-              <w:rPr>
-                <w:sz w:val="17"/>
-              </w:rPr>
-              <w:t>2.8 +/- 0.6</w:t>
+            <w:r>
+              <w:t>5.9 +/- 0.9</w:t>
             </w:r>
           </w:p>
         </w:tc>
@@ -6193,12 +6827,8 @@
             <w:tcW w:type="dxa" w:w="1701"/>
           </w:tcPr>
           <w:p>
-            <w:r/>
-            <w:r>
-              <w:rPr>
-                <w:sz w:val="17"/>
-              </w:rPr>
-              <w:t>0.73</w:t>
+            <w:r>
+              <w:t>0.32</w:t>
             </w:r>
           </w:p>
         </w:tc>
@@ -6207,12 +6837,194 @@
             <w:tcW w:type="dxa" w:w="2891"/>
           </w:tcPr>
           <w:p>
-            <w:r/>
-            <w:r>
-              <w:rPr>
-                <w:sz w:val="17"/>
-              </w:rPr>
-              <w:t>2 of 4 (chance 1.3, p = 0.48)</w:t>
+            <w:r>
+              <w:t>3 of 9 (p = 0.40)</w:t>
+            </w:r>
+          </w:p>
+        </w:tc>
+      </w:tr>
+      <w:tr>
+        <w:tc>
+          <w:tcPr>
+            <w:tcW w:type="dxa" w:w="1020"/>
+          </w:tcPr>
+          <w:p>
+            <w:r>
+              <w:t>LTA (whole model)</w:t>
+            </w:r>
+          </w:p>
+        </w:tc>
+        <w:tc>
+          <w:tcPr>
+            <w:tcW w:type="dxa" w:w="1134"/>
+          </w:tcPr>
+          <w:p>
+            <w:r>
+              <w:t>5</w:t>
+            </w:r>
+          </w:p>
+        </w:tc>
+        <w:tc>
+          <w:tcPr>
+            <w:tcW w:type="dxa" w:w="1417"/>
+          </w:tcPr>
+          <w:p>
+            <w:r>
+              <w:t>9 of 9</w:t>
+            </w:r>
+          </w:p>
+        </w:tc>
+        <w:tc>
+          <w:tcPr>
+            <w:tcW w:type="dxa" w:w="2041"/>
+          </w:tcPr>
+          <w:p>
+            <w:r>
+              <w:t>6.1 +/- 1.0</w:t>
+            </w:r>
+          </w:p>
+        </w:tc>
+        <w:tc>
+          <w:tcPr>
+            <w:tcW w:type="dxa" w:w="1701"/>
+          </w:tcPr>
+          <w:p>
+            <w:r>
+              <w:t>&lt; 0.001</w:t>
+            </w:r>
+          </w:p>
+        </w:tc>
+        <w:tc>
+          <w:tcPr>
+            <w:tcW w:type="dxa" w:w="2891"/>
+          </w:tcPr>
+          <w:p>
+            <w:r>
+              <w:t>2 of 9 (p = 0.60)</w:t>
+            </w:r>
+          </w:p>
+        </w:tc>
+      </w:tr>
+      <w:tr>
+        <w:tc>
+          <w:tcPr>
+            <w:tcW w:type="dxa" w:w="1020"/>
+          </w:tcPr>
+          <w:p>
+            <w:r>
+              <w:t>LTA (whole model)</w:t>
+            </w:r>
+          </w:p>
+        </w:tc>
+        <w:tc>
+          <w:tcPr>
+            <w:tcW w:type="dxa" w:w="1134"/>
+          </w:tcPr>
+          <w:p>
+            <w:r>
+              <w:t>10</w:t>
+            </w:r>
+          </w:p>
+        </w:tc>
+        <w:tc>
+          <w:tcPr>
+            <w:tcW w:type="dxa" w:w="1417"/>
+          </w:tcPr>
+          <w:p>
+            <w:r>
+              <w:t>9 of 9</w:t>
+            </w:r>
+          </w:p>
+        </w:tc>
+        <w:tc>
+          <w:tcPr>
+            <w:tcW w:type="dxa" w:w="2041"/>
+          </w:tcPr>
+          <w:p>
+            <w:r>
+              <w:t>7.5 +/- 0.7</w:t>
+            </w:r>
+          </w:p>
+        </w:tc>
+        <w:tc>
+          <w:tcPr>
+            <w:tcW w:type="dxa" w:w="1701"/>
+          </w:tcPr>
+          <w:p>
+            <w:r>
+              <w:t>0.07</w:t>
+            </w:r>
+          </w:p>
+        </w:tc>
+        <w:tc>
+          <w:tcPr>
+            <w:tcW w:type="dxa" w:w="2891"/>
+          </w:tcPr>
+          <w:p>
+            <w:r>
+              <w:t>2 of 9 (p = 0.82)</w:t>
+            </w:r>
+          </w:p>
+        </w:tc>
+      </w:tr>
+      <w:tr>
+        <w:tc>
+          <w:tcPr>
+            <w:tcW w:type="dxa" w:w="1020"/>
+          </w:tcPr>
+          <w:p>
+            <w:r>
+              <w:t>LTA (whole model)</w:t>
+            </w:r>
+          </w:p>
+        </w:tc>
+        <w:tc>
+          <w:tcPr>
+            <w:tcW w:type="dxa" w:w="1134"/>
+          </w:tcPr>
+          <w:p>
+            <w:r>
+              <w:t>18</w:t>
+            </w:r>
+          </w:p>
+        </w:tc>
+        <w:tc>
+          <w:tcPr>
+            <w:tcW w:type="dxa" w:w="1417"/>
+          </w:tcPr>
+          <w:p>
+            <w:r>
+              <w:t>9 of 9</w:t>
+            </w:r>
+          </w:p>
+        </w:tc>
+        <w:tc>
+          <w:tcPr>
+            <w:tcW w:type="dxa" w:w="2041"/>
+          </w:tcPr>
+          <w:p>
+            <w:r>
+              <w:t>8.1 +/- 0.5</w:t>
+            </w:r>
+          </w:p>
+        </w:tc>
+        <w:tc>
+          <w:tcPr>
+            <w:tcW w:type="dxa" w:w="1701"/>
+          </w:tcPr>
+          <w:p>
+            <w:r>
+              <w:t>0.19</w:t>
+            </w:r>
+          </w:p>
+        </w:tc>
+        <w:tc>
+          <w:tcPr>
+            <w:tcW w:type="dxa" w:w="2891"/>
+          </w:tcPr>
+          <w:p>
+            <w:r>
+              <w:t>3 of 9 (p = 0.96)</w:t>
             </w:r>
           </w:p>
         </w:tc>
@@ -6225,7 +7037,7 @@
           <w:b w:val="0"/>
           <w:i w:val="0"/>
         </w:rPr>
-        <w:t>Here p is the fraction of random shifts that did as well as or better than the real calculation. All p values are 0.19 or higher, far from 0.05, and using only the strong modes does not change this. This is the main reason the agreement is described as not demonstrated rather than good.</w:t>
+        <w:t>Here p is the fraction of random shifts that did as well as or better than the real calculation. All p values are 0.19 or higher except the LTA whole-molecule model at 5 cm-1 (p &lt; 0.001) and at 10 cm-1 (p = 0.07); using only the strong modes, no calculation is above chance. This is the main reason the agreement is described as not demonstrated rather than good, with the LTA model at 5 cm-1 as a limited exception.</w:t>
       </w:r>
     </w:p>
     <w:p>
@@ -6274,7 +7086,7 @@
           <w:i/>
           <w:sz w:val="17"/>
         </w:rPr>
-        <w:t>Figure 7. Difference between every library band and its nearest DFT mode. Points outside the green band (10 cm-1) are bands the calculation does not explain.</w:t>
+        <w:t>Figure 9. Difference between every library band and its nearest calculated mode, all five calculations. Points outside the green band (10 cm-1) are bands the calculation does not explain.</w:t>
       </w:r>
     </w:p>
     <w:p>
@@ -6407,12 +7219,8 @@
             <w:tcW w:type="dxa" w:w="2608"/>
           </w:tcPr>
           <w:p>
-            <w:r/>
-            <w:r>
-              <w:rPr>
-                <w:sz w:val="17"/>
-              </w:rPr>
-              <w:t>Partly: 861.5 and 1459 within 10 cm-1; 802 and 1092 not</w:t>
+            <w:r>
+              <w:t>Yes: all 9 bands within 4.5 cm-1 (whole-molecule model); fragments: 5 of 9 within 10 cm-1, 1092 and 1751 off by 14 and 61 cm-1</w:t>
             </w:r>
           </w:p>
         </w:tc>
@@ -6461,12 +7269,8 @@
             <w:tcW w:type="dxa" w:w="2608"/>
           </w:tcPr>
           <w:p>
-            <w:r/>
-            <w:r>
-              <w:rPr>
-                <w:sz w:val="17"/>
-              </w:rPr>
-              <w:t>No (p = 0.71)</w:t>
+            <w:r>
+              <w:t>Whole model: yes at 5 cm-1 (p &lt; 0.001), no at 10 and 18 cm-1 (p = 0.07, 0.19); fragments: no (p = 0.40)</w:t>
             </w:r>
           </w:p>
         </w:tc>
@@ -6515,12 +7319,8 @@
             <w:tcW w:type="dxa" w:w="2608"/>
           </w:tcPr>
           <w:p>
-            <w:r/>
-            <w:r>
-              <w:rPr>
-                <w:sz w:val="17"/>
-              </w:rPr>
-              <w:t>No (r = 0.11)</w:t>
+            <w:r>
+              <w:t>No (whole model r = -0.01; fragments 0.09, fitted 0.11)</w:t>
             </w:r>
           </w:p>
         </w:tc>
@@ -6569,12 +7369,8 @@
             <w:tcW w:type="dxa" w:w="2608"/>
           </w:tcPr>
           <w:p>
-            <w:r/>
-            <w:r>
-              <w:rPr>
-                <w:sz w:val="17"/>
-              </w:rPr>
-              <w:t>Partly: 1092 and 802 not explained</w:t>
+            <w:r>
+              <w:t>Positions of 1092, 799, 862 and 539 are matched, but by weak modes (activity 0.01 to 0.15); the strongest model modes (690, 1490-1510) are not seen in the measurement</w:t>
             </w:r>
           </w:p>
         </w:tc>
@@ -6623,12 +7419,8 @@
             <w:tcW w:type="dxa" w:w="2608"/>
           </w:tcPr>
           <w:p>
-            <w:r/>
-            <w:r>
-              <w:rPr>
-                <w:sz w:val="17"/>
-              </w:rPr>
-              <w:t>Nothing beyond the existing tentative assignments</w:t>
+            <w:r>
+              <w:t>Position consistency with a phosphodiester / glycerol / D-alanine / GlcNAc model supports the existing tentative assignments (1092 phosphate PO2-, 862 and 799 glycerol-phosphate and sugar, 1459 CH2, 1751 ester C=O); no new assignment gained</w:t>
             </w:r>
           </w:p>
         </w:tc>
@@ -6677,12 +7469,8 @@
             <w:tcW w:type="dxa" w:w="2608"/>
           </w:tcPr>
           <w:p>
-            <w:r/>
-            <w:r>
-              <w:rPr>
-                <w:sz w:val="17"/>
-              </w:rPr>
-              <w:t>WEAK, not demonstrated; provisional</w:t>
+            <w:r>
+              <w:t>POSITIONS AGREE (above chance at 5 cm-1 only); intensities and shape not matched; not demonstrated</w:t>
             </w:r>
           </w:p>
         </w:tc>
@@ -6742,7 +7530,7 @@
         <w:pStyle w:val="ListBullet"/>
       </w:pPr>
       <w:r>
-        <w:t>LTA: model a repeating glycerol-phosphate dimer or trimer with its counter-ion, with D-alanine attached as an ester; use the same larger basis set as NAM.</w:t>
+        <w:t>LTA: the three-unit model is a first whole-molecule result at a quick level. Next steps: finish the B3LYP/6-31+G(d,p) water (PCM) run that was started on 28 Oct; add counter-ions, a longer chain (4-5 units) and the Glc2-diacylglycerol anchor; check the glycerol stereochemistry; look at the atoms that move in the 1089, 862 and 802 cm-1 modes and in the strong 690 cm-1 mode, which the measurement does not show.</w:t>
       </w:r>
     </w:p>
     <w:p>
@@ -6750,7 +7538,7 @@
         <w:pStyle w:val="ListBullet"/>
       </w:pPr>
       <w:r>
-        <w:t>All: report the same chance test with any new calculation, and compare against the new LTA reference once 12 to 15 spots are acquired.</w:t>
+        <w:t>All: report the same chance test with any new calculation, and the LTA comparison now uses the v2.1 reference (17 spots).</w:t>
       </w:r>
     </w:p>
     <w:p>
@@ -6953,11 +7741,7 @@
             <w:tcW w:type="dxa" w:w="6803"/>
           </w:tcPr>
           <w:p>
-            <w:r/>
-            <w:r>
-              <w:rPr>
-                <w:sz w:val="17"/>
-              </w:rPr>
+            <w:r>
               <w:t>mtp\06_Simulation_DFT\LTA-simulation-main\06_Simulation_DFT\LTA-simulation-main\LTA_combined_data.csv; mtp\10_Working_Archive\20-04\Computational Simulation Settings Used for Lipoteichoic Acid.docx</w:t>
             </w:r>
           </w:p>
@@ -7063,6 +7847,72 @@
           <w:p>
             <w:r>
               <w:t>05_Tables\LipidA_vs_LPS_results.json; 08_Methodology\code\lipidA_compare.py, lipidA_figures.py, update_docs_lipidA.py; figures in 04_Figures\LipidA_Model_20261028</w:t>
+            </w:r>
+          </w:p>
+        </w:tc>
+      </w:tr>
+      <w:tr>
+        <w:tc>
+          <w:tcPr>
+            <w:tcW w:type="dxa" w:w="3402"/>
+          </w:tcPr>
+          <w:p>
+            <w:r>
+              <w:t>LTA whole-molecule model (165 modes in range)</w:t>
+            </w:r>
+          </w:p>
+        </w:tc>
+        <w:tc>
+          <w:tcPr>
+            <w:tcW w:type="dxa" w:w="6803"/>
+          </w:tcPr>
+          <w:p>
+            <w:r>
+              <w:t>SERS_Sepsis_Spectral_Library\08_Methodology\simulation\LTA_Model_20261028 (copy of C:\Users\sukes\Downloads\sukesh\simulation\lta output simulation): lta_model_raman_act.csv, lta_model.gjf, lta_model.out (Gaussian log), LTA_Raman_Methods.md, LTA_Raman_Full_Report.docx</w:t>
+            </w:r>
+          </w:p>
+        </w:tc>
+      </w:tr>
+      <w:tr>
+        <w:tc>
+          <w:tcPr>
+            <w:tcW w:type="dxa" w:w="3402"/>
+          </w:tcPr>
+          <w:p>
+            <w:r>
+              <w:t>LTA reference used</w:t>
+            </w:r>
+          </w:p>
+        </w:tc>
+        <w:tc>
+          <w:tcPr>
+            <w:tcW w:type="dxa" w:w="6803"/>
+          </w:tcPr>
+          <w:p>
+            <w:r>
+              <w:t>03_Reference_Spectra\LTA\LTA_Bulk_Reference_20261028_Pooled_Mean_SD.csv and LTA_Reference_20261028_Pooled_Marker_Peaks.csv (v2.1, n = 17)</w:t>
+            </w:r>
+          </w:p>
+        </w:tc>
+      </w:tr>
+      <w:tr>
+        <w:tc>
+          <w:tcPr>
+            <w:tcW w:type="dxa" w:w="3402"/>
+          </w:tcPr>
+          <w:p>
+            <w:r>
+              <w:t>LTA comparison results and code</w:t>
+            </w:r>
+          </w:p>
+        </w:tc>
+        <w:tc>
+          <w:tcPr>
+            <w:tcW w:type="dxa" w:w="6803"/>
+          </w:tcPr>
+          <w:p>
+            <w:r>
+              <w:t>05_Tables\LTAmodel_vs_LTA_results.json; 08_Methodology\code\lta_model_compare.py, lta_figures.py, update_docs_lta.py; figures in 04_Figures\LTA_Model_20261028</w:t>
             </w:r>
           </w:p>
         </w:tc>
@@ -7090,7 +7940,7 @@
         <w:pStyle w:val="ListBullet"/>
       </w:pPr>
       <w:r>
-        <w:t>LTA peaks were picked from broadened curves (prominence 0.04), so weak modes may be missed.</w:t>
+        <w:t>LTA fragment peaks were picked from broadened curves (prominence 0.04), so weak modes may be missed; the whole-molecule model has a full mode list.</w:t>
       </w:r>
     </w:p>
     <w:p>
@@ -7098,7 +7948,7 @@
         <w:pStyle w:val="ListBullet"/>
       </w:pPr>
       <w:r>
-        <w:t>Only primary and supporting library bands were tested (NAM 11, LPS 5, LTA 4). Small numbers limit the statistics; the chance test is a baseline, not a formal proof.</w:t>
+        <w:t>Only primary and supporting library bands were tested (NAM 11, LPS 5, LTA 9). Small numbers limit the statistics; the chance test is a baseline, not a formal proof.</w:t>
       </w:r>
     </w:p>
     <w:p>
@@ -7114,7 +7964,7 @@
         <w:pStyle w:val="ListBullet"/>
       </w:pPr>
       <w:r>
-        <w:t>The LTA comparison in Section 6 still uses the preliminary April 2026 LTA reference (4 spectra). The new LTA reference of 28 Oct 2026 (17 spots) has not been compared with the LTA fragment calculations.</w:t>
+        <w:t>The LTA comparison in Section 6 uses the pooled v2.1 reference of 28 Oct 2026 (17 spots, pending operator confirmation). The LTA whole-molecule model is a three-unit, gas-phase B3LYP/3-21G calculation; its band assignments were not checked against displacement vectors, the glycerol stereochemistry was not verified, and the scale factor 0.965 was not fitted for this basis set. The 5 cm-1 chance test depends on random shifts of 15 to 70 cm-1 and on the high mode density.</w:t>
       </w:r>
     </w:p>
     <w:p>

</xml_diff>

<commit_message>
Correct LTA model comparison: match by vibration type (1751 cm-1 is a 25 cm-1 shifted C=O stretch, not the N-H mode at 1746)
Co-Authored-By: Claude Sonnet 5.5 <noreply@anthropic.com>
</commit_message>
<xml_diff>
--- a/SERS_Sepsis_Spectral_Library/09_Reports/DFT_vs_Experimental_Comparison_NAM_LPS_LTA.docx
+++ b/SERS_Sepsis_Spectral_Library/09_Reports/DFT_vs_Experimental_Comparison_NAM_LPS_LTA.docx
@@ -39,7 +39,7 @@
           <w:i w:val="0"/>
           <w:sz w:val="20"/>
         </w:rPr>
-        <w:t>The simulations reproduce the position of many individual bands, and the agreement is best for NAM, the only small molecule calculated as a whole. LPS and LTA each now have two calculations: separate fragments, and a whole-molecule model (shortened Kdo2-lipid A, 201 atoms; three glycerol-phosphate units with two D-alanine esters and one alpha-GlcNAc, 93 atoms). For LPS the model puts all five library bands within 2.4 cm-1 of a calculated mode, but this is no better than chance. For LTA the model puts all nine primary and supporting bands of the new pooled reference (v2.1, 17 spots) within 4.5 cm-1 of a calculated mode (mean difference 2.5 cm-1, against 15.8 cm-1 for the three fragments) and, at the strict 5 cm-1 tolerance, this is above chance (9 of 9 against 6.1 +/- 1.0 expected, p &lt; 0.001); at 10 and 18 cm-1 it is not (p = 0.07 and 0.19). The LTA modes that sit on the library bands are weak (relative activity 0.01 to 0.15), the strongest calculated modes (690, 654 and 1490-1510 cm-1) have no counterpart in the measured spectrum, and the whole-spectrum correlation is zero (-0.01). The overall spectral shapes do not match for any molecule (correlation 0.15 or less). The DFT results can support tentative assignments of individual bands, but they cannot be used to confirm identity, and several strong experimental bands remain unexplained: NAM 829 and 955 cm-1, the assignment of LPS 425 cm-1, and for LTA the strong 1092 and 1010 cm-1 bands, which match only very weak modes.</w:t>
+        <w:t>The simulations reproduce the position of many individual bands, and the agreement is best for NAM, the only small molecule calculated as a whole. LPS and LTA each now have two calculations: separate fragments, and a whole-molecule model (shortened Kdo2-lipid A, 201 atoms; three glycerol-phosphate units with two D-alanine esters and one alpha-GlcNAc, 93 atoms). For LPS the model puts all five library bands within 2.4 cm-1 of a calculated mode, but this is no better than chance. For LTA each of the nine primary and supporting bands of the new pooled reference (v2.1, 17 spots) was matched to the nearest calculated vibration of the expected type: eight lie within 7.1 cm-1 and the 1751 cm-1 band corresponds to a calculated ester C=O stretch 25 cm-1 lower (mean difference over the nine 5.8 cm-1, against 15.8 cm-1 for the three fragments). A position-only test that takes the nearest calculated mode whatever its type finds all nine within 5 cm-1 and is above chance at 5 cm-1 (p &lt; 0.001) but not at 10 and 18 cm-1 (p = 0.07 and 0.19); it overstates the agreement for 1751 cm-1, because the nearest mode (1746 cm-1) is an N-H motion and not a C=O vibration. The LTA modes that sit on the library bands are weak (relative activity 0.01 to 0.15), the strongest calculated modes (690, 654 and 1490-1510 cm-1) have no counterpart in the measured spectrum, and the whole-spectrum correlation is zero (-0.01). The overall spectral shapes do not match for any molecule (correlation 0.15 or less). The DFT results can support tentative assignments of individual bands, but they cannot be used to confirm identity, and several strong experimental bands remain unexplained: NAM 829 and 955 cm-1, the assignment of LPS 425 cm-1, and for LTA the strong 1092 and 1010 cm-1 bands, which match only very weak modes.</w:t>
       </w:r>
     </w:p>
     <w:p/>
@@ -622,7 +622,7 @@
           </w:tcPr>
           <w:p>
             <w:r>
-              <w:t>9 / 9 / 9</w:t>
+              <w:t>7 / 8 / 8 (by vibration type)</w:t>
             </w:r>
           </w:p>
         </w:tc>
@@ -632,7 +632,7 @@
           </w:tcPr>
           <w:p>
             <w:r>
-              <w:t>2.5</w:t>
+              <w:t>5.8</w:t>
             </w:r>
           </w:p>
         </w:tc>
@@ -642,7 +642,7 @@
           </w:tcPr>
           <w:p>
             <w:r>
-              <w:t>7.5 (p = 0.07)</w:t>
+              <w:t>7.5 (p = 0.07, position only)</w:t>
             </w:r>
           </w:p>
         </w:tc>
@@ -663,7 +663,7 @@
           </w:tcPr>
           <w:p>
             <w:r>
-              <w:t>Positions agree, above chance at 5 cm-1 only; matched modes weak; shape no</w:t>
+              <w:t>Positions agree by vibration type (1751 shifted 25 cm-1); matched modes weak; shape no</w:t>
             </w:r>
           </w:p>
         </w:tc>
@@ -4364,7 +4364,7 @@
         <w:rPr>
           <w:i w:val="0"/>
         </w:rPr>
-        <w:t>The LTA reference used here is the pooled v2.1 reference of 28 October 2026 (17 independent spots, clean dark, 80 % power; 10 spots at 45 s x 2 acc and 7 at 30 s x 3 acc). Nine primary and supporting bands outside the glass zone were tested (primary 539, 862 and 1092 cm-1). The whole-molecule model puts all nine within 5 cm-1 of a calculated mode (mean absolute difference 2.5 cm-1). The three fragments reach 3, 5 and 7 of nine within 5, 10 and 18 cm-1 (mean difference 15.8 cm-1).</w:t>
+        <w:t>The LTA reference used here is the pooled v2.1 reference of 28 October 2026 (17 independent spots, clean dark, 80 % power; 10 spots at 45 s x 2 acc and 7 at 30 s x 3 acc). Nine primary and supporting bands outside the glass zone were tested (primary 539, 862 and 1092 cm-1). Each band was matched to the nearest calculated vibration of the expected type (phosphate, backbone C-O / C-C stretching, skeletal deformation, CH / NH bending, C=O stretch, from which atoms move in each mode). For the whole-molecule model 7 of nine lie within 5 cm-1 and 8 within 10 cm-1 (mean absolute difference 5.8 cm-1); the 1751 cm-1 band is matched to a C=O stretch 25 cm-1 lower. The three fragments reach 3, 5 and 7 of nine within 5, 10 and 18 cm-1 (mean difference 15.8 cm-1).</w:t>
       </w:r>
     </w:p>
     <w:p>
@@ -4372,7 +4372,7 @@
         <w:rPr>
           <w:i w:val="0"/>
         </w:rPr>
-        <w:t>Chance test. If the model modes are shifted by a random 15 to 70 cm-1, 6.1 +/- 1.0 bands still fall within 5 cm-1 by chance; the real model gets 9 of 9 (none of 5000 random shifts did as well, p &lt; 0.001). At 10 cm-1 chance gives 7.5 +/- 0.7 and the model is not clearly better (p = 0.07); at 18 cm-1 it is not (p = 0.19). The fragments are indistinguishable from chance at all three tolerances (p = 0.46, 0.40, 0.32). The model has 165 modes in 400-1800 cm-1 (11.8 per 100 cm-1), the fragments only 47 peaks (3.4 per 100 cm-1), so the model has a much higher baseline.</w:t>
+        <w:t>Chance test. If the model modes are shifted by a random 15 to 70 cm-1, 6.1 +/- 1.0 bands still fall within 5 cm-1 by chance; the real model gets 9 of 9 by position alone (none of 5000 random shifts did as well, p &lt; 0.001). This count takes the nearest calculated mode whatever its type; for 1751 cm-1 that mode (1746 cm-1) is an N-H motion, and by vibration type the band is matched 25 cm-1 away. At 10 cm-1 chance gives 7.5 +/- 0.7 and the model is not clearly better (p = 0.07); at 18 cm-1 it is not (p = 0.19). The fragments are indistinguishable from chance at all three tolerances (p = 0.46, 0.40, 0.32). The model has 165 modes in 400-1800 cm-1 (11.8 per 100 cm-1), the fragments only 47 peaks (3.4 per 100 cm-1), so the model has a much higher baseline.</w:t>
       </w:r>
     </w:p>
     <w:p>
@@ -4900,7 +4900,7 @@
               <w:rPr>
                 <w:sz w:val="16"/>
               </w:rPr>
-              <w:t>722.5</w:t>
+              <w:t>720.7</w:t>
             </w:r>
           </w:p>
         </w:tc>
@@ -4914,7 +4914,7 @@
               <w:rPr>
                 <w:sz w:val="16"/>
               </w:rPr>
-              <w:t>+0.1</w:t>
+              <w:t>+2.0</w:t>
             </w:r>
           </w:p>
         </w:tc>
@@ -4928,7 +4928,7 @@
               <w:rPr>
                 <w:sz w:val="16"/>
               </w:rPr>
-              <w:t>0.04</w:t>
+              <w:t>0.05</w:t>
             </w:r>
           </w:p>
         </w:tc>
@@ -5242,7 +5242,7 @@
               <w:rPr>
                 <w:sz w:val="16"/>
               </w:rPr>
-              <w:t>1009.6</w:t>
+              <w:t>1007.3</w:t>
             </w:r>
           </w:p>
         </w:tc>
@@ -5256,7 +5256,7 @@
               <w:rPr>
                 <w:sz w:val="16"/>
               </w:rPr>
-              <w:t>+1.0</w:t>
+              <w:t>+3.3</w:t>
             </w:r>
           </w:p>
         </w:tc>
@@ -5270,7 +5270,7 @@
               <w:rPr>
                 <w:sz w:val="16"/>
               </w:rPr>
-              <w:t>0.01</w:t>
+              <w:t>0.17</w:t>
             </w:r>
           </w:p>
         </w:tc>
@@ -5356,7 +5356,7 @@
               <w:rPr>
                 <w:sz w:val="16"/>
               </w:rPr>
-              <w:t>1089.5</w:t>
+              <w:t>1084.9</w:t>
             </w:r>
           </w:p>
         </w:tc>
@@ -5370,7 +5370,7 @@
               <w:rPr>
                 <w:sz w:val="16"/>
               </w:rPr>
-              <w:t>+2.5</w:t>
+              <w:t>+7.1</w:t>
             </w:r>
           </w:p>
         </w:tc>
@@ -5384,7 +5384,7 @@
               <w:rPr>
                 <w:sz w:val="16"/>
               </w:rPr>
-              <w:t>0.03</w:t>
+              <w:t>0.12</w:t>
             </w:r>
           </w:p>
         </w:tc>
@@ -5484,7 +5484,7 @@
               <w:rPr>
                 <w:sz w:val="16"/>
               </w:rPr>
-              <w:t>-4.3</w:t>
+              <w:t>-4.2</w:t>
             </w:r>
           </w:p>
         </w:tc>
@@ -5584,7 +5584,7 @@
               <w:rPr>
                 <w:sz w:val="16"/>
               </w:rPr>
-              <w:t>1746.3</w:t>
+              <w:t>1725.8</w:t>
             </w:r>
           </w:p>
         </w:tc>
@@ -5598,7 +5598,7 @@
               <w:rPr>
                 <w:sz w:val="16"/>
               </w:rPr>
-              <w:t>+4.5</w:t>
+              <w:t>+25.0</w:t>
             </w:r>
           </w:p>
         </w:tc>
@@ -5612,7 +5612,7 @@
               <w:rPr>
                 <w:sz w:val="16"/>
               </w:rPr>
-              <w:t>0.03</w:t>
+              <w:t>0.11</w:t>
             </w:r>
           </w:p>
         </w:tc>
@@ -5722,7 +5722,7 @@
         <w:pStyle w:val="ListBullet"/>
       </w:pPr>
       <w:r>
-        <w:t>Positions. Every library band has a model mode within 4.5 cm-1, including the two that the fragments missed by more than 30 cm-1 (799 cm-1 against 768; 1751 cm-1 against 1690) and the 1092 cm-1 primary band (model 1089.5; nearest fragment peak 14 cm-1 away). Part of the reason is that the model contains the phosphodiester and ester links. Part is density: the model has 165 modes in the window, so a mode is rarely more than a few cm-1 from any band.</w:t>
+        <w:t>Positions. Matched by vibration type, eight of the nine library bands have a model mode within 7.2 cm-1, including the 799 cm-1 band that the fragments missed by 31 cm-1 and the 1092 cm-1 primary band (model phosphate P-O stretch at 1085; the nearest fragment peak is 14 cm-1 away). The 1751 cm-1 band corresponds to a calculated ester C=O stretch at 1726 cm-1 (25 cm-1 lower); the nearest mode in position, 1746 cm-1, is an N-H motion and is not counted. Part of the reason is that the model contains the phosphodiester and ester links. Part is density: the model has 165 modes in the window, so a mode is rarely more than a few cm-1 from any band.</w:t>
       </w:r>
     </w:p>
     <w:p>
@@ -7220,7 +7220,7 @@
           </w:tcPr>
           <w:p>
             <w:r>
-              <w:t>Yes: all 9 bands within 4.5 cm-1 (whole-molecule model); fragments: 5 of 9 within 10 cm-1, 1092 and 1751 off by 14 and 61 cm-1</w:t>
+              <w:t>Yes by vibration type: 8 of 9 bands within 7.2 cm-1 and 1751 shifted by 25 cm-1 (whole-molecule model); fragments: 5 of 9 within 10 cm-1, 1092 and 1751 off by 14 and 61 cm-1</w:t>
             </w:r>
           </w:p>
         </w:tc>
@@ -7270,7 +7270,7 @@
           </w:tcPr>
           <w:p>
             <w:r>
-              <w:t>Whole model: yes at 5 cm-1 (p &lt; 0.001), no at 10 and 18 cm-1 (p = 0.07, 0.19); fragments: no (p = 0.40)</w:t>
+              <w:t>Position-only test. Whole model: yes at 5 cm-1 (p &lt; 0.001), no at 10 and 18 cm-1 (p = 0.07, 0.19); fragments: no (p = 0.40)</w:t>
             </w:r>
           </w:p>
         </w:tc>
@@ -7420,7 +7420,7 @@
           </w:tcPr>
           <w:p>
             <w:r>
-              <w:t>Position consistency with a phosphodiester / glycerol / D-alanine / GlcNAc model supports the existing tentative assignments (1092 phosphate PO2-, 862 and 799 glycerol-phosphate and sugar, 1459 CH2, 1751 ester C=O); no new assignment gained</w:t>
+              <w:t>Position consistency with a phosphodiester / glycerol / D-alanine / GlcNAc model supports the existing tentative assignments (1092 phosphate PO2-, 862 and 799 glycerol-phosphate and sugar, 1459 CH2, 1751 ester C=O with a 25 cm-1 shift); no new assignment gained</w:t>
             </w:r>
           </w:p>
         </w:tc>

</xml_diff>